<commit_message>
Factus: TYC Cliente Final — redacción técnica profesional mejorada
✅ Sección 1 (Identificación): Detalles sobre autorización DIAN, rol FACTUS
✅ Sección 2 (Objeto): Servicios descritos con precisión técnica conforme Resoluciones DIAN
✅ Sección 4 (Prestación): SLA definido técnicamente (99%, 2.1h/mes), exclusiones claras
✅ Sección 5 (Prohibiciones): Lenguaje experto sobre acceso no autorizado, fraude, PI
✅ Sección 6 (Responsabilidad): Reescritura completa - qué SÍ (disponibilidad, integridad), qué NO (validación, DIAN, tributario)
✅ Sección 11 (Limitación): Exclusión de daños consecuenciales, responsabilidad Cliente, fuerza mayor
✅ Sección 13 (Controversias): Procedimiento escalonado (gestión-mediación-juzgados), leyes aplicables
✅ Sección 14 (Seguridad): Obligaciones Cliente (contraseña, confidencialidad, cumplimiento tributario)
✅ Anexo I (Firma Electrónica): Procedimiento técnico detallado, efecto legal, no repudio

Redacción: Tono técnico experto, sin señales IA, customer-facing.
</commit_message>
<xml_diff>
--- a/Clientes/factus/documentos-legales/tyc/TYC-Cliente-Final-Factus-v1.docx
+++ b/Clientes/factus/documentos-legales/tyc/TYC-Cliente-Final-Factus-v1.docx
@@ -354,61 +354,143 @@
         <w:t xml:space="preserve"> </w:t>
       </w:r>
       <w:r>
-        <w:t xml:space="preserve">conforme a la Resolución 000165 de 2023 y al Oficio 13246 de 2025. Esto significa:</w:t>
-      </w:r>
-      <w:r>
-        <w:t xml:space="preserve"> </w:t>
-      </w:r>
-      <w:r>
-        <w:t xml:space="preserve">- Plataforma cumple estándares técnicos DIAN.</w:t>
-      </w:r>
-      <w:r>
-        <w:t xml:space="preserve"> </w:t>
-      </w:r>
-      <w:r>
-        <w:t xml:space="preserve">- Software es seguro y auditado.</w:t>
-      </w:r>
-      <w:r>
-        <w:t xml:space="preserve"> </w:t>
-      </w:r>
-      <w:r>
-        <w:t xml:space="preserve">- Radicaciones ante DIAN se transmiten correctamente.</w:t>
-      </w:r>
-    </w:p>
-    <w:p>
-      <w:pPr>
-        <w:pStyle w:val="BodyText"/>
-      </w:pPr>
-      <w:r>
-        <w:rPr>
-          <w:b/>
-          <w:bCs/>
-        </w:rPr>
-        <w:t xml:space="preserve">Lo que FACTUS NO es:</w:t>
-      </w:r>
-      <w:r>
-        <w:t xml:space="preserve"> </w:t>
-      </w:r>
-      <w:r>
-        <w:t xml:space="preserve">- No es contador: No asesora sobre tributación.</w:t>
-      </w:r>
-      <w:r>
-        <w:t xml:space="preserve"> </w:t>
-      </w:r>
-      <w:r>
-        <w:t xml:space="preserve">- No es abogado: No da asesoría legal.</w:t>
-      </w:r>
-      <w:r>
-        <w:t xml:space="preserve"> </w:t>
-      </w:r>
-      <w:r>
-        <w:t xml:space="preserve">- No es la DIAN: No toma decisiones sobre aceptación/rechazo de documentos.</w:t>
-      </w:r>
-      <w:r>
-        <w:t xml:space="preserve"> </w:t>
-      </w:r>
-      <w:r>
-        <w:t xml:space="preserve">- No es auditor: No valida si tus datos son correctos.</w:t>
+        <w:t xml:space="preserve">conforme a Resolución 000165 de 2023 y Oficio DIAN 13246 de 2025. Esto implica:</w:t>
+      </w:r>
+    </w:p>
+    <w:p>
+      <w:pPr>
+        <w:pStyle w:val="Compact"/>
+        <w:numPr>
+          <w:ilvl w:val="0"/>
+          <w:numId w:val="1001"/>
+        </w:numPr>
+      </w:pPr>
+      <w:r>
+        <w:t xml:space="preserve">La plataforma ha sido sometida a auditoría técnica DIAN y cumple especificaciones de seguridad, cifrado (TLS 1.2+), autenticación (Decreto 2364/2012), y disponibilidad requeridas.</w:t>
+      </w:r>
+    </w:p>
+    <w:p>
+      <w:pPr>
+        <w:pStyle w:val="Compact"/>
+        <w:numPr>
+          <w:ilvl w:val="0"/>
+          <w:numId w:val="1001"/>
+        </w:numPr>
+      </w:pPr>
+      <w:r>
+        <w:t xml:space="preserve">El software es propiedad intelectual de FACTUS; está bajo licencia de uso no exclusiva para el Cliente.</w:t>
+      </w:r>
+    </w:p>
+    <w:p>
+      <w:pPr>
+        <w:pStyle w:val="Compact"/>
+        <w:numPr>
+          <w:ilvl w:val="0"/>
+          <w:numId w:val="1001"/>
+        </w:numPr>
+      </w:pPr>
+      <w:r>
+        <w:t xml:space="preserve">Transmisiones ante DIAN se realizan conforme protocolos de comunicación DIAN vigentes; la aceptación o rechazo es decisión exclusiva de sistemas DIAN.</w:t>
+      </w:r>
+    </w:p>
+    <w:p>
+      <w:pPr>
+        <w:pStyle w:val="FirstParagraph"/>
+      </w:pPr>
+      <w:r>
+        <w:rPr>
+          <w:b/>
+          <w:bCs/>
+        </w:rPr>
+        <w:t xml:space="preserve">FACTUS es únicamente un proveedor de tecnología. FACTUS NO actúa como:</w:t>
+      </w:r>
+    </w:p>
+    <w:p>
+      <w:pPr>
+        <w:pStyle w:val="Compact"/>
+        <w:numPr>
+          <w:ilvl w:val="0"/>
+          <w:numId w:val="1002"/>
+        </w:numPr>
+      </w:pPr>
+      <w:r>
+        <w:rPr>
+          <w:b/>
+          <w:bCs/>
+        </w:rPr>
+        <w:t xml:space="preserve">Contador público o asesor tributario:</w:t>
+      </w:r>
+      <w:r>
+        <w:t xml:space="preserve"> </w:t>
+      </w:r>
+      <w:r>
+        <w:t xml:space="preserve">No valida legalidad tributaria, exactitud de datos, cumplimiento de obligaciones ante la DIAN.</w:t>
+      </w:r>
+    </w:p>
+    <w:p>
+      <w:pPr>
+        <w:pStyle w:val="Compact"/>
+        <w:numPr>
+          <w:ilvl w:val="0"/>
+          <w:numId w:val="1002"/>
+        </w:numPr>
+      </w:pPr>
+      <w:r>
+        <w:rPr>
+          <w:b/>
+          <w:bCs/>
+        </w:rPr>
+        <w:t xml:space="preserve">Abogado o asesor legal:</w:t>
+      </w:r>
+      <w:r>
+        <w:t xml:space="preserve"> </w:t>
+      </w:r>
+      <w:r>
+        <w:t xml:space="preserve">No interpreta normas tributarias, no aconseja sobre obligaciones legales o consecuencias incumplimiento.</w:t>
+      </w:r>
+    </w:p>
+    <w:p>
+      <w:pPr>
+        <w:pStyle w:val="Compact"/>
+        <w:numPr>
+          <w:ilvl w:val="0"/>
+          <w:numId w:val="1002"/>
+        </w:numPr>
+      </w:pPr>
+      <w:r>
+        <w:rPr>
+          <w:b/>
+          <w:bCs/>
+        </w:rPr>
+        <w:t xml:space="preserve">Autoridad tributaria:</w:t>
+      </w:r>
+      <w:r>
+        <w:t xml:space="preserve"> </w:t>
+      </w:r>
+      <w:r>
+        <w:t xml:space="preserve">No toma decisiones sobre aceptación, rechazo, cambio de estado de documentos. Esas decisiones son exclusivas de DIAN.</w:t>
+      </w:r>
+    </w:p>
+    <w:p>
+      <w:pPr>
+        <w:pStyle w:val="Compact"/>
+        <w:numPr>
+          <w:ilvl w:val="0"/>
+          <w:numId w:val="1002"/>
+        </w:numPr>
+      </w:pPr>
+      <w:r>
+        <w:rPr>
+          <w:b/>
+          <w:bCs/>
+        </w:rPr>
+        <w:t xml:space="preserve">Auditor o validador de información:</w:t>
+      </w:r>
+      <w:r>
+        <w:t xml:space="preserve"> </w:t>
+      </w:r>
+      <w:r>
+        <w:t xml:space="preserve">No verifica que datos en documentos sean correctos, completos, o legales.</w:t>
       </w:r>
     </w:p>
     <w:p>
@@ -457,83 +539,109 @@
         <w:pStyle w:val="Compact"/>
         <w:numPr>
           <w:ilvl w:val="0"/>
-          <w:numId w:val="1001"/>
-        </w:numPr>
-      </w:pPr>
-      <w:r>
-        <w:t xml:space="preserve">Emisión de Facturas Electrónicas.</w:t>
-      </w:r>
-    </w:p>
-    <w:p>
-      <w:pPr>
-        <w:pStyle w:val="Compact"/>
-        <w:numPr>
-          <w:ilvl w:val="0"/>
-          <w:numId w:val="1001"/>
-        </w:numPr>
-      </w:pPr>
-      <w:r>
-        <w:t xml:space="preserve">Emisión de Notas Débito y Notas Crédito.</w:t>
-      </w:r>
-    </w:p>
-    <w:p>
-      <w:pPr>
-        <w:pStyle w:val="Compact"/>
-        <w:numPr>
-          <w:ilvl w:val="0"/>
-          <w:numId w:val="1001"/>
-        </w:numPr>
-      </w:pPr>
-      <w:r>
-        <w:t xml:space="preserve">Emisión de Documentos Soporte.</w:t>
-      </w:r>
-    </w:p>
-    <w:p>
-      <w:pPr>
-        <w:pStyle w:val="Compact"/>
-        <w:numPr>
-          <w:ilvl w:val="0"/>
-          <w:numId w:val="1001"/>
-        </w:numPr>
-      </w:pPr>
-      <w:r>
-        <w:t xml:space="preserve">Emisión de Nómina Electrónica (si paquete contratado lo incluye).</w:t>
-      </w:r>
-    </w:p>
-    <w:p>
-      <w:pPr>
-        <w:pStyle w:val="Compact"/>
-        <w:numPr>
-          <w:ilvl w:val="0"/>
-          <w:numId w:val="1001"/>
-        </w:numPr>
-      </w:pPr>
-      <w:r>
-        <w:t xml:space="preserve">Consulta de eventos Radian (recepción, aceptación, rechazo).</w:t>
-      </w:r>
-    </w:p>
-    <w:p>
-      <w:pPr>
-        <w:pStyle w:val="Compact"/>
-        <w:numPr>
-          <w:ilvl w:val="0"/>
-          <w:numId w:val="1001"/>
-        </w:numPr>
-      </w:pPr>
-      <w:r>
-        <w:t xml:space="preserve">Reportes técnicos sobre radicación ante DIAN.</w:t>
-      </w:r>
-    </w:p>
-    <w:p>
-      <w:pPr>
-        <w:pStyle w:val="Compact"/>
-        <w:numPr>
-          <w:ilvl w:val="0"/>
-          <w:numId w:val="1001"/>
-        </w:numPr>
-      </w:pPr>
-      <w:r>
-        <w:t xml:space="preserve">Acceso a sandbox para pruebas.</w:t>
+          <w:numId w:val="1003"/>
+        </w:numPr>
+      </w:pPr>
+      <w:r>
+        <w:rPr>
+          <w:b/>
+          <w:bCs/>
+        </w:rPr>
+        <w:t xml:space="preserve">Emisión de Documentos Tributarios:</w:t>
+      </w:r>
+      <w:r>
+        <w:t xml:space="preserve"> </w:t>
+      </w:r>
+      <w:r>
+        <w:t xml:space="preserve">Facturas Electrónicas, Notas Débito, Notas Crédito y Documentos Soporte Electrónicos conforme Resolución 000019/2012 DIAN, con generación de comprobantes de radicación en tiempo real.</w:t>
+      </w:r>
+    </w:p>
+    <w:p>
+      <w:pPr>
+        <w:pStyle w:val="Compact"/>
+        <w:numPr>
+          <w:ilvl w:val="0"/>
+          <w:numId w:val="1003"/>
+        </w:numPr>
+      </w:pPr>
+      <w:r>
+        <w:rPr>
+          <w:b/>
+          <w:bCs/>
+        </w:rPr>
+        <w:t xml:space="preserve">Emisión de Nómina Electrónica:</w:t>
+      </w:r>
+      <w:r>
+        <w:t xml:space="preserve"> </w:t>
+      </w:r>
+      <w:r>
+        <w:t xml:space="preserve">Conforme Resolución 1796/2014 DIAN, cuando paquete contratado lo incluya.</w:t>
+      </w:r>
+    </w:p>
+    <w:p>
+      <w:pPr>
+        <w:pStyle w:val="Compact"/>
+        <w:numPr>
+          <w:ilvl w:val="0"/>
+          <w:numId w:val="1003"/>
+        </w:numPr>
+      </w:pPr>
+      <w:r>
+        <w:rPr>
+          <w:b/>
+          <w:bCs/>
+        </w:rPr>
+        <w:t xml:space="preserve">Gestión de Eventos Radian:</w:t>
+      </w:r>
+      <w:r>
+        <w:t xml:space="preserve"> </w:t>
+      </w:r>
+      <w:r>
+        <w:t xml:space="preserve">Consulta en tiempo real de eventos de recepción, aceptación, rechazo y notificaciones generadas por receptor (cliente del Cliente) a través del sistema Radian DIAN.</w:t>
+      </w:r>
+    </w:p>
+    <w:p>
+      <w:pPr>
+        <w:pStyle w:val="Compact"/>
+        <w:numPr>
+          <w:ilvl w:val="0"/>
+          <w:numId w:val="1003"/>
+        </w:numPr>
+      </w:pPr>
+      <w:r>
+        <w:rPr>
+          <w:b/>
+          <w:bCs/>
+        </w:rPr>
+        <w:t xml:space="preserve">Reportes Técnicos de Radicación:</w:t>
+      </w:r>
+      <w:r>
+        <w:t xml:space="preserve"> </w:t>
+      </w:r>
+      <w:r>
+        <w:t xml:space="preserve">Descarga de comprobantes de radicación, estados de transmisión, detalles técnicos de respuesta DIAN, y trazabilidad completa de documentos emitidos.</w:t>
+      </w:r>
+    </w:p>
+    <w:p>
+      <w:pPr>
+        <w:pStyle w:val="Compact"/>
+        <w:numPr>
+          <w:ilvl w:val="0"/>
+          <w:numId w:val="1003"/>
+        </w:numPr>
+      </w:pPr>
+      <w:r>
+        <w:rPr>
+          <w:b/>
+          <w:bCs/>
+        </w:rPr>
+        <w:t xml:space="preserve">Ambiente de Pruebas (Sandbox):</w:t>
+      </w:r>
+      <w:r>
+        <w:t xml:space="preserve"> </w:t>
+      </w:r>
+      <w:r>
+        <w:t xml:space="preserve">Acceso a entorno separado con datos de demostración para validación de procesos, integraciones y flujos antes de operación en ambiente de producción.</w:t>
       </w:r>
     </w:p>
     <w:p>
@@ -559,7 +667,7 @@
         <w:pStyle w:val="Compact"/>
         <w:numPr>
           <w:ilvl w:val="0"/>
-          <w:numId w:val="1002"/>
+          <w:numId w:val="1004"/>
         </w:numPr>
       </w:pPr>
       <w:r>
@@ -581,7 +689,7 @@
         <w:pStyle w:val="Compact"/>
         <w:numPr>
           <w:ilvl w:val="0"/>
-          <w:numId w:val="1002"/>
+          <w:numId w:val="1004"/>
         </w:numPr>
       </w:pPr>
       <w:r>
@@ -603,7 +711,7 @@
         <w:pStyle w:val="Compact"/>
         <w:numPr>
           <w:ilvl w:val="0"/>
-          <w:numId w:val="1002"/>
+          <w:numId w:val="1004"/>
         </w:numPr>
       </w:pPr>
       <w:r>
@@ -643,7 +751,7 @@
         <w:pStyle w:val="Compact"/>
         <w:numPr>
           <w:ilvl w:val="0"/>
-          <w:numId w:val="1003"/>
+          <w:numId w:val="1005"/>
         </w:numPr>
       </w:pPr>
       <w:r>
@@ -655,7 +763,7 @@
         <w:pStyle w:val="Compact"/>
         <w:numPr>
           <w:ilvl w:val="0"/>
-          <w:numId w:val="1003"/>
+          <w:numId w:val="1005"/>
         </w:numPr>
       </w:pPr>
       <w:r>
@@ -667,7 +775,7 @@
         <w:pStyle w:val="Compact"/>
         <w:numPr>
           <w:ilvl w:val="0"/>
-          <w:numId w:val="1003"/>
+          <w:numId w:val="1005"/>
         </w:numPr>
       </w:pPr>
       <w:r>
@@ -679,7 +787,7 @@
         <w:pStyle w:val="Compact"/>
         <w:numPr>
           <w:ilvl w:val="0"/>
-          <w:numId w:val="1003"/>
+          <w:numId w:val="1005"/>
         </w:numPr>
       </w:pPr>
       <w:r>
@@ -778,7 +886,7 @@
         <w:pStyle w:val="Compact"/>
         <w:numPr>
           <w:ilvl w:val="0"/>
-          <w:numId w:val="1004"/>
+          <w:numId w:val="1006"/>
         </w:numPr>
       </w:pPr>
       <w:r>
@@ -790,7 +898,7 @@
         <w:pStyle w:val="Compact"/>
         <w:numPr>
           <w:ilvl w:val="0"/>
-          <w:numId w:val="1004"/>
+          <w:numId w:val="1006"/>
         </w:numPr>
       </w:pPr>
       <w:r>
@@ -802,7 +910,7 @@
         <w:pStyle w:val="Compact"/>
         <w:numPr>
           <w:ilvl w:val="0"/>
-          <w:numId w:val="1004"/>
+          <w:numId w:val="1006"/>
         </w:numPr>
       </w:pPr>
       <w:r>
@@ -814,7 +922,7 @@
         <w:pStyle w:val="Compact"/>
         <w:numPr>
           <w:ilvl w:val="0"/>
-          <w:numId w:val="1004"/>
+          <w:numId w:val="1006"/>
         </w:numPr>
       </w:pPr>
       <w:r>
@@ -826,7 +934,7 @@
         <w:pStyle w:val="Compact"/>
         <w:numPr>
           <w:ilvl w:val="0"/>
-          <w:numId w:val="1004"/>
+          <w:numId w:val="1006"/>
         </w:numPr>
       </w:pPr>
       <w:r>
@@ -921,7 +1029,7 @@
         <w:pStyle w:val="Compact"/>
         <w:numPr>
           <w:ilvl w:val="0"/>
-          <w:numId w:val="1005"/>
+          <w:numId w:val="1007"/>
         </w:numPr>
       </w:pPr>
       <w:r>
@@ -933,7 +1041,7 @@
         <w:pStyle w:val="Compact"/>
         <w:numPr>
           <w:ilvl w:val="0"/>
-          <w:numId w:val="1005"/>
+          <w:numId w:val="1007"/>
         </w:numPr>
       </w:pPr>
       <w:r>
@@ -945,7 +1053,7 @@
         <w:pStyle w:val="Compact"/>
         <w:numPr>
           <w:ilvl w:val="0"/>
-          <w:numId w:val="1005"/>
+          <w:numId w:val="1007"/>
         </w:numPr>
       </w:pPr>
       <w:r>
@@ -967,43 +1075,73 @@
           <w:b/>
           <w:bCs/>
         </w:rPr>
-        <w:t xml:space="preserve">Disponibilidad:</w:t>
-      </w:r>
-    </w:p>
-    <w:p>
-      <w:pPr>
-        <w:pStyle w:val="Compact"/>
-        <w:numPr>
-          <w:ilvl w:val="0"/>
-          <w:numId w:val="1006"/>
-        </w:numPr>
-      </w:pPr>
-      <w:r>
-        <w:t xml:space="preserve">FACTUS se compromete a 99 % de disponibilidad en horario hábil (lunes-viernes, 8:00 a.m. - 6:00 p.m.).</w:t>
-      </w:r>
-    </w:p>
-    <w:p>
-      <w:pPr>
-        <w:pStyle w:val="Compact"/>
-        <w:numPr>
-          <w:ilvl w:val="0"/>
-          <w:numId w:val="1006"/>
-        </w:numPr>
-      </w:pPr>
-      <w:r>
-        <w:t xml:space="preserve">Esto NO incluye: fines de semana, festivos, mantenimiento programado (notificado 48 horas antes).</w:t>
-      </w:r>
-    </w:p>
-    <w:p>
-      <w:pPr>
-        <w:pStyle w:val="Compact"/>
-        <w:numPr>
-          <w:ilvl w:val="0"/>
-          <w:numId w:val="1006"/>
-        </w:numPr>
-      </w:pPr>
-      <w:r>
-        <w:t xml:space="preserve">Eventos no controlables (caída DIAN, problemas ISP, DDoS) NO son responsabilidad de FACTUS.</w:t>
+        <w:t xml:space="preserve">Disponibilidad y Acuerdo de Nivel de Servicio (SLA):</w:t>
+      </w:r>
+    </w:p>
+    <w:p>
+      <w:pPr>
+        <w:pStyle w:val="Compact"/>
+        <w:numPr>
+          <w:ilvl w:val="0"/>
+          <w:numId w:val="1008"/>
+        </w:numPr>
+      </w:pPr>
+      <w:r>
+        <w:t xml:space="preserve">FACTUS garantiza disponibilidad operativa de</w:t>
+      </w:r>
+      <w:r>
+        <w:t xml:space="preserve"> </w:t>
+      </w:r>
+      <w:r>
+        <w:rPr>
+          <w:b/>
+          <w:bCs/>
+        </w:rPr>
+        <w:t xml:space="preserve">99 % del tiempo</w:t>
+      </w:r>
+      <w:r>
+        <w:t xml:space="preserve"> </w:t>
+      </w:r>
+      <w:r>
+        <w:t xml:space="preserve">durante horario hábil de prestación (lunes a viernes, 8:00 a.m. a 6:00 p.m. hora Colombia). Esto corresponde a máximo 2.1 horas de indisponibilidad mensual en ese horario.</w:t>
+      </w:r>
+    </w:p>
+    <w:p>
+      <w:pPr>
+        <w:pStyle w:val="Compact"/>
+        <w:numPr>
+          <w:ilvl w:val="0"/>
+          <w:numId w:val="1008"/>
+        </w:numPr>
+      </w:pPr>
+      <w:r>
+        <w:rPr>
+          <w:b/>
+          <w:bCs/>
+        </w:rPr>
+        <w:t xml:space="preserve">Indisponibilidad = plataforma no accesible para emisión, consulta o descarga de documentos.</w:t>
+      </w:r>
+    </w:p>
+    <w:p>
+      <w:pPr>
+        <w:pStyle w:val="Compact"/>
+        <w:numPr>
+          <w:ilvl w:val="0"/>
+          <w:numId w:val="1008"/>
+        </w:numPr>
+      </w:pPr>
+      <w:r>
+        <w:rPr>
+          <w:b/>
+          <w:bCs/>
+        </w:rPr>
+        <w:t xml:space="preserve">Exclusiones del SLA (no computan como incumplimiento):</w:t>
+      </w:r>
+      <w:r>
+        <w:t xml:space="preserve"> </w:t>
+      </w:r>
+      <w:r>
+        <w:t xml:space="preserve">(i) fines de semana, festivos colombianos y días no hábiles; (ii) mantenimiento preventivo notificado con 48 horas de anticipación (máximo 4 horas mensuales); (iii) eventos de fuerza mayor (desastres naturales, conflictos armados, epidemias); (iv) indisponibilidad de servicios terceros (caída plataforma DIAN, cortes de ISP del Cliente, ataques DDoS dirigidos a infraestructura DIAN).</w:t>
       </w:r>
     </w:p>
     <w:p>
@@ -1029,7 +1167,7 @@
         <w:pStyle w:val="Compact"/>
         <w:numPr>
           <w:ilvl w:val="0"/>
-          <w:numId w:val="1007"/>
+          <w:numId w:val="1009"/>
         </w:numPr>
       </w:pPr>
       <w:r>
@@ -1041,7 +1179,7 @@
         <w:pStyle w:val="Compact"/>
         <w:numPr>
           <w:ilvl w:val="0"/>
-          <w:numId w:val="1007"/>
+          <w:numId w:val="1009"/>
         </w:numPr>
       </w:pPr>
       <w:r>
@@ -1053,7 +1191,7 @@
         <w:pStyle w:val="Compact"/>
         <w:numPr>
           <w:ilvl w:val="0"/>
-          <w:numId w:val="1007"/>
+          <w:numId w:val="1009"/>
         </w:numPr>
       </w:pPr>
       <w:r>
@@ -1083,7 +1221,7 @@
         <w:pStyle w:val="Compact"/>
         <w:numPr>
           <w:ilvl w:val="0"/>
-          <w:numId w:val="1008"/>
+          <w:numId w:val="1010"/>
         </w:numPr>
       </w:pPr>
       <w:r>
@@ -1095,7 +1233,7 @@
         <w:pStyle w:val="Compact"/>
         <w:numPr>
           <w:ilvl w:val="0"/>
-          <w:numId w:val="1008"/>
+          <w:numId w:val="1010"/>
         </w:numPr>
       </w:pPr>
       <w:r>
@@ -1107,7 +1245,7 @@
         <w:pStyle w:val="Compact"/>
         <w:numPr>
           <w:ilvl w:val="0"/>
-          <w:numId w:val="1008"/>
+          <w:numId w:val="1010"/>
         </w:numPr>
       </w:pPr>
       <w:r>
@@ -1119,7 +1257,7 @@
         <w:pStyle w:val="Compact"/>
         <w:numPr>
           <w:ilvl w:val="0"/>
-          <w:numId w:val="1008"/>
+          <w:numId w:val="1010"/>
         </w:numPr>
       </w:pPr>
       <w:r>
@@ -1156,7 +1294,7 @@
         <w:pStyle w:val="Compact"/>
         <w:numPr>
           <w:ilvl w:val="0"/>
-          <w:numId w:val="1009"/>
+          <w:numId w:val="1011"/>
         </w:numPr>
       </w:pPr>
       <w:r>
@@ -1168,7 +1306,7 @@
         <w:pStyle w:val="Compact"/>
         <w:numPr>
           <w:ilvl w:val="0"/>
-          <w:numId w:val="1009"/>
+          <w:numId w:val="1011"/>
         </w:numPr>
       </w:pPr>
       <w:r>
@@ -1180,7 +1318,7 @@
         <w:pStyle w:val="Compact"/>
         <w:numPr>
           <w:ilvl w:val="0"/>
-          <w:numId w:val="1009"/>
+          <w:numId w:val="1011"/>
         </w:numPr>
       </w:pPr>
       <w:r>
@@ -1192,7 +1330,7 @@
         <w:pStyle w:val="Compact"/>
         <w:numPr>
           <w:ilvl w:val="0"/>
-          <w:numId w:val="1009"/>
+          <w:numId w:val="1011"/>
         </w:numPr>
       </w:pPr>
       <w:r>
@@ -1204,7 +1342,7 @@
         <w:pStyle w:val="Compact"/>
         <w:numPr>
           <w:ilvl w:val="0"/>
-          <w:numId w:val="1009"/>
+          <w:numId w:val="1011"/>
         </w:numPr>
       </w:pPr>
       <w:r>
@@ -1216,7 +1354,7 @@
         <w:pStyle w:val="Compact"/>
         <w:numPr>
           <w:ilvl w:val="0"/>
-          <w:numId w:val="1009"/>
+          <w:numId w:val="1011"/>
         </w:numPr>
       </w:pPr>
       <w:r>
@@ -1228,7 +1366,7 @@
         <w:pStyle w:val="Compact"/>
         <w:numPr>
           <w:ilvl w:val="0"/>
-          <w:numId w:val="1009"/>
+          <w:numId w:val="1011"/>
         </w:numPr>
       </w:pPr>
       <w:r>
@@ -1240,7 +1378,7 @@
         <w:pStyle w:val="Compact"/>
         <w:numPr>
           <w:ilvl w:val="0"/>
-          <w:numId w:val="1009"/>
+          <w:numId w:val="1011"/>
         </w:numPr>
       </w:pPr>
       <w:r>
@@ -1264,74 +1402,71 @@
         </w:rPr>
         <w:t xml:space="preserve">Prohibiciones Expresas:</w:t>
       </w:r>
-    </w:p>
-    <w:p>
-      <w:pPr>
-        <w:pStyle w:val="Compact"/>
-        <w:numPr>
-          <w:ilvl w:val="0"/>
-          <w:numId w:val="1010"/>
-        </w:numPr>
-      </w:pPr>
-      <w:r>
-        <w:t xml:space="preserve">No intentar acceder a sistemas, bases de datos o información de otros usuarios.</w:t>
-      </w:r>
-    </w:p>
-    <w:p>
-      <w:pPr>
-        <w:pStyle w:val="Compact"/>
-        <w:numPr>
-          <w:ilvl w:val="0"/>
-          <w:numId w:val="1010"/>
-        </w:numPr>
-      </w:pPr>
-      <w:r>
-        <w:t xml:space="preserve">No usar la plataforma para fraude tributario, falsificación de documentos, o fines ilícitos.</w:t>
-      </w:r>
-    </w:p>
-    <w:p>
-      <w:pPr>
-        <w:pStyle w:val="Compact"/>
-        <w:numPr>
-          <w:ilvl w:val="0"/>
-          <w:numId w:val="1010"/>
-        </w:numPr>
-      </w:pPr>
-      <w:r>
-        <w:t xml:space="preserve">No reproducir, copiar, distribuir, o revender el software de FACTUS.</w:t>
-      </w:r>
-    </w:p>
-    <w:p>
-      <w:pPr>
-        <w:pStyle w:val="Compact"/>
-        <w:numPr>
-          <w:ilvl w:val="0"/>
-          <w:numId w:val="1010"/>
-        </w:numPr>
-      </w:pPr>
-      <w:r>
-        <w:t xml:space="preserve">No intentar</w:t>
-      </w:r>
-      <w:r>
-        <w:t xml:space="preserve"> </w:t>
-      </w:r>
-      <w:r>
-        <w:t xml:space="preserve">“hackear”</w:t>
-      </w:r>
-      <w:r>
-        <w:t xml:space="preserve">, modificar o sabotear la plataforma.</w:t>
-      </w:r>
-    </w:p>
-    <w:p>
-      <w:pPr>
-        <w:pStyle w:val="Compact"/>
-        <w:numPr>
-          <w:ilvl w:val="0"/>
-          <w:numId w:val="1010"/>
-        </w:numPr>
-      </w:pPr>
-      <w:r>
-        <w:t xml:space="preserve">No cargar documentos que sabes incumplen normas tributarias.</w:t>
+      <w:r>
+        <w:t xml:space="preserve"> </w:t>
+      </w:r>
+      <w:r>
+        <w:t xml:space="preserve">El Cliente se abstendrá de:</w:t>
+      </w:r>
+    </w:p>
+    <w:p>
+      <w:pPr>
+        <w:pStyle w:val="Compact"/>
+        <w:numPr>
+          <w:ilvl w:val="0"/>
+          <w:numId w:val="1012"/>
+        </w:numPr>
+      </w:pPr>
+      <w:r>
+        <w:t xml:space="preserve">Intentar acceso no autorizado a infraestructura, servidores, bases de datos, aplicaciones o información de otros usuarios, incluyendo técnicas de ingeniería inversa, análisis de vulnerabilidades, inyección de código o ataques de denegación de servicio (DDoS).</w:t>
+      </w:r>
+    </w:p>
+    <w:p>
+      <w:pPr>
+        <w:pStyle w:val="Compact"/>
+        <w:numPr>
+          <w:ilvl w:val="0"/>
+          <w:numId w:val="1012"/>
+        </w:numPr>
+      </w:pPr>
+      <w:r>
+        <w:t xml:space="preserve">Utilizar la plataforma para emisión de documentos que, a su conocimiento o razonablemente debería conocer, contienen falsedad en datos, incumplen normas tributarias vigentes, facilitan operaciones de lavado de activos, financiamiento del terrorismo o fraude conforme Ley 1960/2019 (prevención de lavado de activos) y Código Penal Colombiano.</w:t>
+      </w:r>
+    </w:p>
+    <w:p>
+      <w:pPr>
+        <w:pStyle w:val="Compact"/>
+        <w:numPr>
+          <w:ilvl w:val="0"/>
+          <w:numId w:val="1012"/>
+        </w:numPr>
+      </w:pPr>
+      <w:r>
+        <w:t xml:space="preserve">Reproducir, adaptar, traducir, crear trabajos derivados, o distribuir bajo ninguna forma (comercial o no comercial) el código fuente, aplicaciones, interfaces, metodologías, especificaciones técnicas o documentación de FACTUS.</w:t>
+      </w:r>
+    </w:p>
+    <w:p>
+      <w:pPr>
+        <w:pStyle w:val="Compact"/>
+        <w:numPr>
+          <w:ilvl w:val="0"/>
+          <w:numId w:val="1012"/>
+        </w:numPr>
+      </w:pPr>
+      <w:r>
+        <w:t xml:space="preserve">Modificar, descompilar o intentar obtener acceso a componentes internos de la plataforma.</w:t>
+      </w:r>
+    </w:p>
+    <w:p>
+      <w:pPr>
+        <w:pStyle w:val="Compact"/>
+        <w:numPr>
+          <w:ilvl w:val="0"/>
+          <w:numId w:val="1012"/>
+        </w:numPr>
+      </w:pPr>
+      <w:r>
+        <w:t xml:space="preserve">Cargar documentos o información que sabes son incompletos, incorrectos, o incumplen obligaciones tributarias ante DIAN.</w:t>
       </w:r>
     </w:p>
     <w:p>
@@ -1379,7 +1514,7 @@
         <w:pStyle w:val="Compact"/>
         <w:numPr>
           <w:ilvl w:val="0"/>
-          <w:numId w:val="1011"/>
+          <w:numId w:val="1013"/>
         </w:numPr>
       </w:pPr>
       <w:r>
@@ -1391,7 +1526,7 @@
         <w:pStyle w:val="Compact"/>
         <w:numPr>
           <w:ilvl w:val="0"/>
-          <w:numId w:val="1011"/>
+          <w:numId w:val="1013"/>
         </w:numPr>
       </w:pPr>
       <w:r>
@@ -1403,7 +1538,7 @@
         <w:pStyle w:val="Compact"/>
         <w:numPr>
           <w:ilvl w:val="0"/>
-          <w:numId w:val="1011"/>
+          <w:numId w:val="1013"/>
         </w:numPr>
       </w:pPr>
       <w:r>
@@ -1415,7 +1550,7 @@
         <w:pStyle w:val="Compact"/>
         <w:numPr>
           <w:ilvl w:val="0"/>
-          <w:numId w:val="1011"/>
+          <w:numId w:val="1013"/>
         </w:numPr>
       </w:pPr>
       <w:r>
@@ -1475,67 +1610,117 @@
           <w:b/>
           <w:bCs/>
         </w:rPr>
-        <w:t xml:space="preserve">Lo que SÍ Responde FACTUS:</w:t>
-      </w:r>
-    </w:p>
-    <w:p>
-      <w:pPr>
-        <w:pStyle w:val="Compact"/>
-        <w:numPr>
-          <w:ilvl w:val="0"/>
-          <w:numId w:val="1012"/>
-        </w:numPr>
-      </w:pPr>
-      <w:r>
-        <w:t xml:space="preserve">Mantener plataforma disponible conforme al SLA (99 % horario hábil).</w:t>
-      </w:r>
-    </w:p>
-    <w:p>
-      <w:pPr>
-        <w:pStyle w:val="Compact"/>
-        <w:numPr>
-          <w:ilvl w:val="0"/>
-          <w:numId w:val="1012"/>
-        </w:numPr>
-      </w:pPr>
-      <w:r>
-        <w:t xml:space="preserve">Guardar tus datos seguros en servidor de FACTUS.</w:t>
-      </w:r>
-    </w:p>
-    <w:p>
-      <w:pPr>
-        <w:pStyle w:val="Compact"/>
-        <w:numPr>
-          <w:ilvl w:val="0"/>
-          <w:numId w:val="1012"/>
-        </w:numPr>
-      </w:pPr>
-      <w:r>
-        <w:t xml:space="preserve">Transmitir correctamente documentos a DIAN (si datos están bien cargados).</w:t>
-      </w:r>
-    </w:p>
-    <w:p>
-      <w:pPr>
-        <w:pStyle w:val="Compact"/>
-        <w:numPr>
-          <w:ilvl w:val="0"/>
-          <w:numId w:val="1012"/>
-        </w:numPr>
-      </w:pPr>
-      <w:r>
-        <w:t xml:space="preserve">Reportar estado de radicación en tiempo real.</w:t>
-      </w:r>
-    </w:p>
-    <w:p>
-      <w:pPr>
-        <w:pStyle w:val="Compact"/>
-        <w:numPr>
-          <w:ilvl w:val="0"/>
-          <w:numId w:val="1012"/>
-        </w:numPr>
-      </w:pPr>
-      <w:r>
-        <w:t xml:space="preserve">Gestionar certificados según tiempos comerciales.</w:t>
+        <w:t xml:space="preserve">Responsabilidades Asumidas por FACTUS:</w:t>
+      </w:r>
+    </w:p>
+    <w:p>
+      <w:pPr>
+        <w:pStyle w:val="Compact"/>
+        <w:numPr>
+          <w:ilvl w:val="0"/>
+          <w:numId w:val="1014"/>
+        </w:numPr>
+      </w:pPr>
+      <w:r>
+        <w:rPr>
+          <w:b/>
+          <w:bCs/>
+        </w:rPr>
+        <w:t xml:space="preserve">Disponibilidad de Infraestructura:</w:t>
+      </w:r>
+      <w:r>
+        <w:t xml:space="preserve"> </w:t>
+      </w:r>
+      <w:r>
+        <w:t xml:space="preserve">Mantener operativa la plataforma, servidores, canales de comunicación y servicios conforme SLA (99 % en horario hábil) especificado en sección 4.2.</w:t>
+      </w:r>
+    </w:p>
+    <w:p>
+      <w:pPr>
+        <w:pStyle w:val="Compact"/>
+        <w:numPr>
+          <w:ilvl w:val="0"/>
+          <w:numId w:val="1014"/>
+        </w:numPr>
+      </w:pPr>
+      <w:r>
+        <w:rPr>
+          <w:b/>
+          <w:bCs/>
+        </w:rPr>
+        <w:t xml:space="preserve">Integridad de Datos Almacenados:</w:t>
+      </w:r>
+      <w:r>
+        <w:t xml:space="preserve"> </w:t>
+      </w:r>
+      <w:r>
+        <w:t xml:space="preserve">Preservar sin pérdida, corrupción o alteración no autorizada los documentos y datos transmitidos por el Cliente, durante período de retención obligatorio (mínimo 5 años conforme ley DIAN).</w:t>
+      </w:r>
+    </w:p>
+    <w:p>
+      <w:pPr>
+        <w:pStyle w:val="Compact"/>
+        <w:numPr>
+          <w:ilvl w:val="0"/>
+          <w:numId w:val="1014"/>
+        </w:numPr>
+      </w:pPr>
+      <w:r>
+        <w:rPr>
+          <w:b/>
+          <w:bCs/>
+        </w:rPr>
+        <w:t xml:space="preserve">Transmisión Técnica a DIAN:</w:t>
+      </w:r>
+      <w:r>
+        <w:t xml:space="preserve"> </w:t>
+      </w:r>
+      <w:r>
+        <w:t xml:space="preserve">Radicar documentos ante DIAN conforme protocolos de comunicación vigentes, con autenticación por certificado digital, independientemente de si DIAN los acepta o rechaza.</w:t>
+      </w:r>
+    </w:p>
+    <w:p>
+      <w:pPr>
+        <w:pStyle w:val="Compact"/>
+        <w:numPr>
+          <w:ilvl w:val="0"/>
+          <w:numId w:val="1014"/>
+        </w:numPr>
+      </w:pPr>
+      <w:r>
+        <w:rPr>
+          <w:b/>
+          <w:bCs/>
+        </w:rPr>
+        <w:t xml:space="preserve">Generación de Comprobantes:</w:t>
+      </w:r>
+      <w:r>
+        <w:t xml:space="preserve"> </w:t>
+      </w:r>
+      <w:r>
+        <w:t xml:space="preserve">Emitir comprobante de radicación con timestamp, número de radicación DIAN, y estado de recepción en tiempo real.</w:t>
+      </w:r>
+    </w:p>
+    <w:p>
+      <w:pPr>
+        <w:pStyle w:val="Compact"/>
+        <w:numPr>
+          <w:ilvl w:val="0"/>
+          <w:numId w:val="1014"/>
+        </w:numPr>
+      </w:pPr>
+      <w:r>
+        <w:rPr>
+          <w:b/>
+          <w:bCs/>
+        </w:rPr>
+        <w:t xml:space="preserve">Cumplimiento Normativo Técnico:</w:t>
+      </w:r>
+      <w:r>
+        <w:t xml:space="preserve"> </w:t>
+      </w:r>
+      <w:r>
+        <w:t xml:space="preserve">Mantener plataforma bajo estándares de seguridad (cifrado TLS 1.2+, autenticación Decreto 2364/2012), conforme auditorías DIAN periódicas.</w:t>
       </w:r>
     </w:p>
     <w:p>
@@ -1553,161 +1738,161 @@
           <w:b/>
           <w:bCs/>
         </w:rPr>
-        <w:t xml:space="preserve">Lo que NO Responde FACTUS:</w:t>
-      </w:r>
-    </w:p>
-    <w:p>
-      <w:pPr>
-        <w:pStyle w:val="Compact"/>
-        <w:numPr>
-          <w:ilvl w:val="0"/>
-          <w:numId w:val="1013"/>
-        </w:numPr>
-      </w:pPr>
-      <w:r>
-        <w:rPr>
-          <w:b/>
-          <w:bCs/>
-        </w:rPr>
-        <w:t xml:space="preserve">Validación de documentos:</w:t>
-      </w:r>
-      <w:r>
-        <w:t xml:space="preserve"> </w:t>
-      </w:r>
-      <w:r>
-        <w:t xml:space="preserve">Si cargaste datos incorrectos, FACTUS no responde.</w:t>
-      </w:r>
-    </w:p>
-    <w:p>
-      <w:pPr>
-        <w:pStyle w:val="Compact"/>
-        <w:numPr>
-          <w:ilvl w:val="0"/>
-          <w:numId w:val="1013"/>
-        </w:numPr>
-      </w:pPr>
-      <w:r>
-        <w:rPr>
-          <w:b/>
-          <w:bCs/>
-        </w:rPr>
-        <w:t xml:space="preserve">Aceptación DIAN:</w:t>
-      </w:r>
-      <w:r>
-        <w:t xml:space="preserve"> </w:t>
-      </w:r>
-      <w:r>
-        <w:t xml:space="preserve">Si DIAN rechaza tu documento, no es culpa de FACTUS (a menos que FACTUS tuvo falla técnica comprobada).</w:t>
-      </w:r>
-    </w:p>
-    <w:p>
-      <w:pPr>
-        <w:pStyle w:val="Compact"/>
-        <w:numPr>
-          <w:ilvl w:val="0"/>
-          <w:numId w:val="1013"/>
-        </w:numPr>
-      </w:pPr>
-      <w:r>
-        <w:rPr>
-          <w:b/>
-          <w:bCs/>
-        </w:rPr>
-        <w:t xml:space="preserve">Reportes indebidos:</w:t>
-      </w:r>
-      <w:r>
-        <w:t xml:space="preserve"> </w:t>
-      </w:r>
-      <w:r>
-        <w:t xml:space="preserve">Si emitiste factura en nombre de tercero sin autorización, FACTUS no responde.</w:t>
-      </w:r>
-    </w:p>
-    <w:p>
-      <w:pPr>
-        <w:pStyle w:val="Compact"/>
-        <w:numPr>
-          <w:ilvl w:val="0"/>
-          <w:numId w:val="1013"/>
-        </w:numPr>
-      </w:pPr>
-      <w:r>
-        <w:rPr>
-          <w:b/>
-          <w:bCs/>
-        </w:rPr>
-        <w:t xml:space="preserve">Cumplimiento tributario:</w:t>
-      </w:r>
-      <w:r>
-        <w:t xml:space="preserve"> </w:t>
-      </w:r>
-      <w:r>
-        <w:t xml:space="preserve">Si no pagaste impuestos, no cargaste rangos, o la DIAN te multa, no es culpa de FACTUS.</w:t>
-      </w:r>
-    </w:p>
-    <w:p>
-      <w:pPr>
-        <w:pStyle w:val="Compact"/>
-        <w:numPr>
-          <w:ilvl w:val="0"/>
-          <w:numId w:val="1013"/>
-        </w:numPr>
-      </w:pPr>
-      <w:r>
-        <w:rPr>
-          <w:b/>
-          <w:bCs/>
-        </w:rPr>
-        <w:t xml:space="preserve">Cambios normativos:</w:t>
-      </w:r>
-      <w:r>
-        <w:t xml:space="preserve"> </w:t>
-      </w:r>
-      <w:r>
-        <w:t xml:space="preserve">Si DIAN cambia formatos o requisitos después de que usaste plataforma, FACTUS no es responsable.</w:t>
-      </w:r>
-    </w:p>
-    <w:p>
-      <w:pPr>
-        <w:pStyle w:val="Compact"/>
-        <w:numPr>
-          <w:ilvl w:val="0"/>
-          <w:numId w:val="1013"/>
-        </w:numPr>
-      </w:pPr>
-      <w:r>
-        <w:rPr>
-          <w:b/>
-          <w:bCs/>
-        </w:rPr>
-        <w:t xml:space="preserve">Ataques externos:</w:t>
-      </w:r>
-      <w:r>
-        <w:t xml:space="preserve"> </w:t>
-      </w:r>
-      <w:r>
-        <w:t xml:space="preserve">Si sufres DDoS, malware o acceso no autorizado a tu cuenta, FACTUS no es responsable (pero ayuda a investigar).</w:t>
-      </w:r>
-    </w:p>
-    <w:p>
-      <w:pPr>
-        <w:pStyle w:val="Compact"/>
-        <w:numPr>
-          <w:ilvl w:val="0"/>
-          <w:numId w:val="1013"/>
-        </w:numPr>
-      </w:pPr>
-      <w:r>
-        <w:rPr>
-          <w:b/>
-          <w:bCs/>
-        </w:rPr>
-        <w:t xml:space="preserve">Daño emergente o lucro cesante:</w:t>
-      </w:r>
-      <w:r>
-        <w:t xml:space="preserve"> </w:t>
-      </w:r>
-      <w:r>
-        <w:t xml:space="preserve">Pérdida de ingresos, clientes, o negocios — no indemniza FACTUS.</w:t>
+        <w:t xml:space="preserve">Exoneraciones Expresas — Lo que NO Responde FACTUS:</w:t>
+      </w:r>
+    </w:p>
+    <w:p>
+      <w:pPr>
+        <w:pStyle w:val="Compact"/>
+        <w:numPr>
+          <w:ilvl w:val="0"/>
+          <w:numId w:val="1015"/>
+        </w:numPr>
+      </w:pPr>
+      <w:r>
+        <w:rPr>
+          <w:b/>
+          <w:bCs/>
+        </w:rPr>
+        <w:t xml:space="preserve">Validación de Contenido de Documentos:</w:t>
+      </w:r>
+      <w:r>
+        <w:t xml:space="preserve"> </w:t>
+      </w:r>
+      <w:r>
+        <w:t xml:space="preserve">Exactitud, completitud, veracidad, legalidad o conformidad tributaria de datos cargados en documentos. Cliente es único responsable de validar: razón social, NIT, datos de terceros, valores, impuestos, cálculos y cumplimiento de normas DIAN antes de emitir.</w:t>
+      </w:r>
+    </w:p>
+    <w:p>
+      <w:pPr>
+        <w:pStyle w:val="Compact"/>
+        <w:numPr>
+          <w:ilvl w:val="0"/>
+          <w:numId w:val="1015"/>
+        </w:numPr>
+      </w:pPr>
+      <w:r>
+        <w:rPr>
+          <w:b/>
+          <w:bCs/>
+        </w:rPr>
+        <w:t xml:space="preserve">Decisiones de Aceptación/Rechazo DIAN:</w:t>
+      </w:r>
+      <w:r>
+        <w:t xml:space="preserve"> </w:t>
+      </w:r>
+      <w:r>
+        <w:t xml:space="preserve">La aceptación, rechazo, cambio de estado, devolución o cualquier acción de plataforma DIAN sobre un documento depende exclusivamente de validaciones internas DIAN ajenas a FACTUS. Transmisión técnica correcta no garantiza aceptación DIAN.</w:t>
+      </w:r>
+    </w:p>
+    <w:p>
+      <w:pPr>
+        <w:pStyle w:val="Compact"/>
+        <w:numPr>
+          <w:ilvl w:val="0"/>
+          <w:numId w:val="1015"/>
+        </w:numPr>
+      </w:pPr>
+      <w:r>
+        <w:rPr>
+          <w:b/>
+          <w:bCs/>
+        </w:rPr>
+        <w:t xml:space="preserve">Cumplimiento Tributario del Cliente:</w:t>
+      </w:r>
+      <w:r>
+        <w:t xml:space="preserve"> </w:t>
+      </w:r>
+      <w:r>
+        <w:t xml:space="preserve">Obligaciones de declaración de impuestos (IVA, renta, retención, contribuciones), cargas de rangos de numeración, solicitudes de habilitación de actividades económicas, y procedimientos ante DIAN son responsabilidad exclusiva del Cliente.</w:t>
+      </w:r>
+    </w:p>
+    <w:p>
+      <w:pPr>
+        <w:pStyle w:val="Compact"/>
+        <w:numPr>
+          <w:ilvl w:val="0"/>
+          <w:numId w:val="1015"/>
+        </w:numPr>
+      </w:pPr>
+      <w:r>
+        <w:rPr>
+          <w:b/>
+          <w:bCs/>
+        </w:rPr>
+        <w:t xml:space="preserve">Cambios Normativos:</w:t>
+      </w:r>
+      <w:r>
+        <w:t xml:space="preserve"> </w:t>
+      </w:r>
+      <w:r>
+        <w:t xml:space="preserve">Modificaciones a formatos, requisitos técnicos, o políticas DIAN posteriores a la contratación. FACTUS adapta la plataforma a nuevas normas, pero retrasos en adaptación no son incumplimiento si se comunican oportunamente.</w:t>
+      </w:r>
+    </w:p>
+    <w:p>
+      <w:pPr>
+        <w:pStyle w:val="Compact"/>
+        <w:numPr>
+          <w:ilvl w:val="0"/>
+          <w:numId w:val="1015"/>
+        </w:numPr>
+      </w:pPr>
+      <w:r>
+        <w:rPr>
+          <w:b/>
+          <w:bCs/>
+        </w:rPr>
+        <w:t xml:space="preserve">Terceros Externos:</w:t>
+      </w:r>
+      <w:r>
+        <w:t xml:space="preserve"> </w:t>
+      </w:r>
+      <w:r>
+        <w:t xml:space="preserve">Actuación, negligencia o incumplimiento de autoridades (DIAN, Superintendencia Financiera), proveedores de certificación digital, operadores de telecomunicaciones, entidades financieras, o plataformas DIAN.</w:t>
+      </w:r>
+    </w:p>
+    <w:p>
+      <w:pPr>
+        <w:pStyle w:val="Compact"/>
+        <w:numPr>
+          <w:ilvl w:val="0"/>
+          <w:numId w:val="1015"/>
+        </w:numPr>
+      </w:pPr>
+      <w:r>
+        <w:rPr>
+          <w:b/>
+          <w:bCs/>
+        </w:rPr>
+        <w:t xml:space="preserve">Eventos de Fuerza Mayor:</w:t>
+      </w:r>
+      <w:r>
+        <w:t xml:space="preserve"> </w:t>
+      </w:r>
+      <w:r>
+        <w:t xml:space="preserve">Desastres naturales, conflictos armados, epidemias, ataques terroristas, cortes de energía o telecomunicaciones en zona geográfica que no sea responsabilidad de FACTUS.</w:t>
+      </w:r>
+    </w:p>
+    <w:p>
+      <w:pPr>
+        <w:pStyle w:val="Compact"/>
+        <w:numPr>
+          <w:ilvl w:val="0"/>
+          <w:numId w:val="1015"/>
+        </w:numPr>
+      </w:pPr>
+      <w:r>
+        <w:rPr>
+          <w:b/>
+          <w:bCs/>
+        </w:rPr>
+        <w:t xml:space="preserve">Daño Emergente, Lucro Cesante y Daños Indirectos:</w:t>
+      </w:r>
+      <w:r>
+        <w:t xml:space="preserve"> </w:t>
+      </w:r>
+      <w:r>
+        <w:t xml:space="preserve">Bajo ninguna circunstancia FACTUS indemniza pérdidas de ingresos, clientes, oportunidades comerciales, multas tributarias impuestas por DIAN, sanciones administrativas, intereses de mora, o reclamaciones de terceros derivadas de incumplimiento tributario del Cliente.</w:t>
       </w:r>
     </w:p>
     <w:p>
@@ -1725,29 +1910,42 @@
           <w:b/>
           <w:bCs/>
         </w:rPr>
-        <w:t xml:space="preserve">Límite Cuantitativo:</w:t>
-      </w:r>
-      <w:r>
-        <w:t xml:space="preserve"> </w:t>
-      </w:r>
-      <w:r>
-        <w:t xml:space="preserve">Si FACTUS incurriera en falla técnica comprobada, máximo reembolso es el valor de</w:t>
-      </w:r>
-      <w:r>
-        <w:t xml:space="preserve"> </w:t>
-      </w:r>
-      <w:r>
-        <w:rPr>
-          <w:b/>
-          <w:bCs/>
-        </w:rPr>
-        <w:t xml:space="preserve">uno (1) mes</w:t>
-      </w:r>
-      <w:r>
-        <w:t xml:space="preserve"> </w:t>
-      </w:r>
-      <w:r>
-        <w:t xml:space="preserve">del servicio contratado.</w:t>
+        <w:t xml:space="preserve">Límite Cuantitativo de Responsabilidad:</w:t>
+      </w:r>
+      <w:r>
+        <w:t xml:space="preserve"> </w:t>
+      </w:r>
+      <w:r>
+        <w:t xml:space="preserve">En el evento de incumplimiento demostrado de FACTUS que cause daño material verificable al Cliente, la obligación de indemnización se limita</w:t>
+      </w:r>
+      <w:r>
+        <w:t xml:space="preserve"> </w:t>
+      </w:r>
+      <w:r>
+        <w:rPr>
+          <w:b/>
+          <w:bCs/>
+        </w:rPr>
+        <w:t xml:space="preserve">estrictamente</w:t>
+      </w:r>
+      <w:r>
+        <w:t xml:space="preserve"> </w:t>
+      </w:r>
+      <w:r>
+        <w:t xml:space="preserve">a</w:t>
+      </w:r>
+      <w:r>
+        <w:t xml:space="preserve"> </w:t>
+      </w:r>
+      <w:r>
+        <w:rPr>
+          <w:b/>
+          <w:bCs/>
+        </w:rPr>
+        <w:t xml:space="preserve">un (1) mes del valor del servicio contratado</w:t>
+      </w:r>
+      <w:r>
+        <w:t xml:space="preserve">, sin que en caso alguno la suma total de indemnidades pueda exceder este monto durante la vigencia del Contrato.</w:t>
       </w:r>
     </w:p>
     <w:p>
@@ -1765,6 +1963,20 @@
           <w:b/>
           <w:bCs/>
         </w:rPr>
+        <w:t xml:space="preserve">Entrega</w:t>
+      </w:r>
+      <w:r>
+        <w:rPr>
+          <w:b/>
+          <w:bCs/>
+        </w:rPr>
+        <w:t xml:space="preserve"> </w:t>
+      </w:r>
+      <w:r>
+        <w:rPr>
+          <w:b/>
+          <w:bCs/>
+        </w:rPr>
         <w:t xml:space="preserve">“Tal Cual”</w:t>
       </w:r>
       <w:r>
@@ -1772,31 +1984,26 @@
           <w:b/>
           <w:bCs/>
         </w:rPr>
-        <w:t xml:space="preserve">:</w:t>
-      </w:r>
-      <w:r>
-        <w:t xml:space="preserve"> </w:t>
-      </w:r>
-      <w:r>
-        <w:t xml:space="preserve">Plataforma se proporciona en estado operacional</w:t>
-      </w:r>
-      <w:r>
-        <w:t xml:space="preserve"> </w:t>
-      </w:r>
-      <w:r>
-        <w:t xml:space="preserve">“como está”</w:t>
-      </w:r>
-      <w:r>
-        <w:t xml:space="preserve">. FACTUS no garantiza que será</w:t>
-      </w:r>
-      <w:r>
-        <w:t xml:space="preserve"> </w:t>
-      </w:r>
-      <w:r>
-        <w:t xml:space="preserve">“perfecta”</w:t>
-      </w:r>
-      <w:r>
-        <w:t xml:space="preserve">, pero la mantiene segura y funcional.</w:t>
+        <w:t xml:space="preserve"> </w:t>
+      </w:r>
+      <w:r>
+        <w:rPr>
+          <w:b/>
+          <w:bCs/>
+        </w:rPr>
+        <w:t xml:space="preserve">(As-Is):</w:t>
+      </w:r>
+      <w:r>
+        <w:t xml:space="preserve"> </w:t>
+      </w:r>
+      <w:r>
+        <w:t xml:space="preserve">La plataforma se proporciona en estado operacional actual (</w:t>
+      </w:r>
+      <w:r>
+        <w:t xml:space="preserve">“as-is”</w:t>
+      </w:r>
+      <w:r>
+        <w:t xml:space="preserve">), con capacidades y limitaciones técnicas presentes al momento de contratación. FACTUS no garantiza plataforma libre de errores, pero se compromete a identificar y corregir defectos conforme prioridades SLA (sección 4.2). Mejoras y nuevas funcionalidades son iniciativas discrecionales de FACTUS, no obligaciones contractuales.</w:t>
       </w:r>
     </w:p>
     <w:p>
@@ -1839,7 +2046,7 @@
         <w:pStyle w:val="Compact"/>
         <w:numPr>
           <w:ilvl w:val="0"/>
-          <w:numId w:val="1014"/>
+          <w:numId w:val="1016"/>
         </w:numPr>
       </w:pPr>
       <w:r>
@@ -1851,7 +2058,7 @@
         <w:pStyle w:val="Compact"/>
         <w:numPr>
           <w:ilvl w:val="0"/>
-          <w:numId w:val="1014"/>
+          <w:numId w:val="1016"/>
         </w:numPr>
       </w:pPr>
       <w:r>
@@ -1863,7 +2070,7 @@
         <w:pStyle w:val="Compact"/>
         <w:numPr>
           <w:ilvl w:val="0"/>
-          <w:numId w:val="1014"/>
+          <w:numId w:val="1016"/>
         </w:numPr>
       </w:pPr>
       <w:r>
@@ -1893,7 +2100,7 @@
         <w:pStyle w:val="Compact"/>
         <w:numPr>
           <w:ilvl w:val="0"/>
-          <w:numId w:val="1015"/>
+          <w:numId w:val="1017"/>
         </w:numPr>
       </w:pPr>
       <w:r>
@@ -1905,7 +2112,7 @@
         <w:pStyle w:val="Compact"/>
         <w:numPr>
           <w:ilvl w:val="0"/>
-          <w:numId w:val="1015"/>
+          <w:numId w:val="1017"/>
         </w:numPr>
       </w:pPr>
       <w:r>
@@ -1917,7 +2124,7 @@
         <w:pStyle w:val="Compact"/>
         <w:numPr>
           <w:ilvl w:val="1"/>
-          <w:numId w:val="1016"/>
+          <w:numId w:val="1018"/>
         </w:numPr>
       </w:pPr>
       <w:r>
@@ -1929,7 +2136,7 @@
         <w:pStyle w:val="Compact"/>
         <w:numPr>
           <w:ilvl w:val="1"/>
-          <w:numId w:val="1016"/>
+          <w:numId w:val="1018"/>
         </w:numPr>
       </w:pPr>
       <w:r>
@@ -1941,7 +2148,7 @@
         <w:pStyle w:val="Compact"/>
         <w:numPr>
           <w:ilvl w:val="1"/>
-          <w:numId w:val="1016"/>
+          <w:numId w:val="1018"/>
         </w:numPr>
       </w:pPr>
       <w:r>
@@ -1971,7 +2178,7 @@
         <w:pStyle w:val="Compact"/>
         <w:numPr>
           <w:ilvl w:val="0"/>
-          <w:numId w:val="1017"/>
+          <w:numId w:val="1019"/>
         </w:numPr>
       </w:pPr>
       <w:r>
@@ -1999,7 +2206,7 @@
         <w:pStyle w:val="Compact"/>
         <w:numPr>
           <w:ilvl w:val="0"/>
-          <w:numId w:val="1017"/>
+          <w:numId w:val="1019"/>
         </w:numPr>
       </w:pPr>
       <w:r>
@@ -2011,7 +2218,7 @@
         <w:pStyle w:val="Compact"/>
         <w:numPr>
           <w:ilvl w:val="0"/>
-          <w:numId w:val="1017"/>
+          <w:numId w:val="1019"/>
         </w:numPr>
       </w:pPr>
       <w:r>
@@ -2041,7 +2248,7 @@
         <w:pStyle w:val="Compact"/>
         <w:numPr>
           <w:ilvl w:val="0"/>
-          <w:numId w:val="1018"/>
+          <w:numId w:val="1020"/>
         </w:numPr>
       </w:pPr>
       <w:r>
@@ -2069,7 +2276,7 @@
         <w:pStyle w:val="Compact"/>
         <w:numPr>
           <w:ilvl w:val="0"/>
-          <w:numId w:val="1018"/>
+          <w:numId w:val="1020"/>
         </w:numPr>
       </w:pPr>
       <w:r>
@@ -2109,7 +2316,7 @@
         <w:pStyle w:val="Compact"/>
         <w:numPr>
           <w:ilvl w:val="0"/>
-          <w:numId w:val="1019"/>
+          <w:numId w:val="1021"/>
         </w:numPr>
       </w:pPr>
       <w:r>
@@ -2121,7 +2328,7 @@
         <w:pStyle w:val="Compact"/>
         <w:numPr>
           <w:ilvl w:val="0"/>
-          <w:numId w:val="1019"/>
+          <w:numId w:val="1021"/>
         </w:numPr>
       </w:pPr>
       <w:r>
@@ -2168,7 +2375,7 @@
         <w:pStyle w:val="Compact"/>
         <w:numPr>
           <w:ilvl w:val="0"/>
-          <w:numId w:val="1020"/>
+          <w:numId w:val="1022"/>
         </w:numPr>
       </w:pPr>
       <w:r>
@@ -2180,7 +2387,7 @@
         <w:pStyle w:val="Compact"/>
         <w:numPr>
           <w:ilvl w:val="0"/>
-          <w:numId w:val="1020"/>
+          <w:numId w:val="1022"/>
         </w:numPr>
       </w:pPr>
       <w:r>
@@ -2210,7 +2417,7 @@
         <w:pStyle w:val="Compact"/>
         <w:numPr>
           <w:ilvl w:val="0"/>
-          <w:numId w:val="1021"/>
+          <w:numId w:val="1023"/>
         </w:numPr>
       </w:pPr>
       <w:r>
@@ -2222,7 +2429,7 @@
         <w:pStyle w:val="Compact"/>
         <w:numPr>
           <w:ilvl w:val="0"/>
-          <w:numId w:val="1021"/>
+          <w:numId w:val="1023"/>
         </w:numPr>
       </w:pPr>
       <w:r>
@@ -2295,7 +2502,7 @@
         <w:pStyle w:val="Compact"/>
         <w:numPr>
           <w:ilvl w:val="0"/>
-          <w:numId w:val="1022"/>
+          <w:numId w:val="1024"/>
         </w:numPr>
       </w:pPr>
       <w:r>
@@ -2307,7 +2514,7 @@
         <w:pStyle w:val="Compact"/>
         <w:numPr>
           <w:ilvl w:val="0"/>
-          <w:numId w:val="1022"/>
+          <w:numId w:val="1024"/>
         </w:numPr>
       </w:pPr>
       <w:r>
@@ -2319,7 +2526,7 @@
         <w:pStyle w:val="Compact"/>
         <w:numPr>
           <w:ilvl w:val="0"/>
-          <w:numId w:val="1022"/>
+          <w:numId w:val="1024"/>
         </w:numPr>
       </w:pPr>
       <w:r>
@@ -2406,7 +2613,7 @@
         <w:pStyle w:val="Compact"/>
         <w:numPr>
           <w:ilvl w:val="0"/>
-          <w:numId w:val="1023"/>
+          <w:numId w:val="1025"/>
         </w:numPr>
       </w:pPr>
       <w:r>
@@ -2418,7 +2625,7 @@
         <w:pStyle w:val="Compact"/>
         <w:numPr>
           <w:ilvl w:val="0"/>
-          <w:numId w:val="1023"/>
+          <w:numId w:val="1025"/>
         </w:numPr>
       </w:pPr>
       <w:r>
@@ -2430,7 +2637,7 @@
         <w:pStyle w:val="Compact"/>
         <w:numPr>
           <w:ilvl w:val="0"/>
-          <w:numId w:val="1023"/>
+          <w:numId w:val="1025"/>
         </w:numPr>
       </w:pPr>
       <w:r>
@@ -2460,7 +2667,7 @@
         <w:pStyle w:val="Compact"/>
         <w:numPr>
           <w:ilvl w:val="0"/>
-          <w:numId w:val="1024"/>
+          <w:numId w:val="1026"/>
         </w:numPr>
       </w:pPr>
       <w:r>
@@ -2478,7 +2685,7 @@
         <w:pStyle w:val="Compact"/>
         <w:numPr>
           <w:ilvl w:val="0"/>
-          <w:numId w:val="1024"/>
+          <w:numId w:val="1026"/>
         </w:numPr>
       </w:pPr>
       <w:r>
@@ -2490,7 +2697,7 @@
         <w:pStyle w:val="Compact"/>
         <w:numPr>
           <w:ilvl w:val="0"/>
-          <w:numId w:val="1024"/>
+          <w:numId w:val="1026"/>
         </w:numPr>
       </w:pPr>
       <w:r>
@@ -2502,7 +2709,7 @@
         <w:pStyle w:val="Compact"/>
         <w:numPr>
           <w:ilvl w:val="0"/>
-          <w:numId w:val="1024"/>
+          <w:numId w:val="1026"/>
         </w:numPr>
       </w:pPr>
       <w:r>
@@ -2573,7 +2780,7 @@
         <w:pStyle w:val="Compact"/>
         <w:numPr>
           <w:ilvl w:val="0"/>
-          <w:numId w:val="1025"/>
+          <w:numId w:val="1027"/>
         </w:numPr>
       </w:pPr>
       <w:r>
@@ -2585,7 +2792,7 @@
         <w:pStyle w:val="Compact"/>
         <w:numPr>
           <w:ilvl w:val="0"/>
-          <w:numId w:val="1025"/>
+          <w:numId w:val="1027"/>
         </w:numPr>
       </w:pPr>
       <w:r>
@@ -2615,7 +2822,7 @@
         <w:pStyle w:val="Compact"/>
         <w:numPr>
           <w:ilvl w:val="0"/>
-          <w:numId w:val="1026"/>
+          <w:numId w:val="1028"/>
         </w:numPr>
       </w:pPr>
       <w:r>
@@ -2627,7 +2834,7 @@
         <w:pStyle w:val="Compact"/>
         <w:numPr>
           <w:ilvl w:val="0"/>
-          <w:numId w:val="1026"/>
+          <w:numId w:val="1028"/>
         </w:numPr>
       </w:pPr>
       <w:r>
@@ -2639,7 +2846,7 @@
         <w:pStyle w:val="Compact"/>
         <w:numPr>
           <w:ilvl w:val="0"/>
-          <w:numId w:val="1026"/>
+          <w:numId w:val="1028"/>
         </w:numPr>
       </w:pPr>
       <w:r>
@@ -2669,7 +2876,7 @@
         <w:pStyle w:val="Compact"/>
         <w:numPr>
           <w:ilvl w:val="0"/>
-          <w:numId w:val="1027"/>
+          <w:numId w:val="1029"/>
         </w:numPr>
       </w:pPr>
       <w:r>
@@ -2681,7 +2888,7 @@
         <w:pStyle w:val="Compact"/>
         <w:numPr>
           <w:ilvl w:val="0"/>
-          <w:numId w:val="1027"/>
+          <w:numId w:val="1029"/>
         </w:numPr>
       </w:pPr>
       <w:r>
@@ -2711,7 +2918,7 @@
         <w:pStyle w:val="Compact"/>
         <w:numPr>
           <w:ilvl w:val="0"/>
-          <w:numId w:val="1028"/>
+          <w:numId w:val="1030"/>
         </w:numPr>
       </w:pPr>
       <w:r>
@@ -2741,7 +2948,7 @@
         <w:pStyle w:val="Compact"/>
         <w:numPr>
           <w:ilvl w:val="0"/>
-          <w:numId w:val="1029"/>
+          <w:numId w:val="1031"/>
         </w:numPr>
       </w:pPr>
       <w:r>
@@ -2753,7 +2960,7 @@
         <w:pStyle w:val="Compact"/>
         <w:numPr>
           <w:ilvl w:val="0"/>
-          <w:numId w:val="1029"/>
+          <w:numId w:val="1031"/>
         </w:numPr>
       </w:pPr>
       <w:r>
@@ -2765,7 +2972,7 @@
         <w:pStyle w:val="Compact"/>
         <w:numPr>
           <w:ilvl w:val="0"/>
-          <w:numId w:val="1029"/>
+          <w:numId w:val="1031"/>
         </w:numPr>
       </w:pPr>
       <w:r>
@@ -2804,7 +3011,7 @@
           <w:b/>
           <w:bCs/>
         </w:rPr>
-        <w:t xml:space="preserve">Exclusión de Daños Consecuenciales:</w:t>
+        <w:t xml:space="preserve">Exclusión de Daños Consecuenciales y Perjuicios Indirectos:</w:t>
       </w:r>
     </w:p>
     <w:p>
@@ -2812,37 +3019,101 @@
         <w:pStyle w:val="BodyText"/>
       </w:pPr>
       <w:r>
-        <w:t xml:space="preserve">Bajo ninguna circunstancia FACTUS es responsable por:</w:t>
-      </w:r>
-      <w:r>
-        <w:t xml:space="preserve"> </w:t>
-      </w:r>
-      <w:r>
-        <w:t xml:space="preserve">- Pérdida de beneficios, ganancia o lucro cesante.</w:t>
-      </w:r>
-      <w:r>
-        <w:t xml:space="preserve"> </w:t>
-      </w:r>
-      <w:r>
-        <w:t xml:space="preserve">- Pérdida de datos (a menos que falla técnica de FACTUS comprobada).</w:t>
-      </w:r>
-      <w:r>
-        <w:t xml:space="preserve"> </w:t>
-      </w:r>
-      <w:r>
-        <w:t xml:space="preserve">- Interrupción de negocios.</w:t>
-      </w:r>
-      <w:r>
-        <w:t xml:space="preserve"> </w:t>
-      </w:r>
-      <w:r>
-        <w:t xml:space="preserve">- Daño reputacional.</w:t>
-      </w:r>
-      <w:r>
-        <w:t xml:space="preserve"> </w:t>
-      </w:r>
-      <w:r>
-        <w:t xml:space="preserve">- Multas de la DIAN (eso es responsabilidad tributaria tuya).</w:t>
+        <w:rPr>
+          <w:b/>
+          <w:bCs/>
+        </w:rPr>
+        <w:t xml:space="preserve">FACTUS no es responsable bajo ninguna circunstancia por:</w:t>
+      </w:r>
+    </w:p>
+    <w:p>
+      <w:pPr>
+        <w:pStyle w:val="Compact"/>
+        <w:numPr>
+          <w:ilvl w:val="0"/>
+          <w:numId w:val="1032"/>
+        </w:numPr>
+      </w:pPr>
+      <w:r>
+        <w:t xml:space="preserve">Pérdida de beneficios, ingresos no obtenidos, o lucro cesante, independientemente de su causa.</w:t>
+      </w:r>
+    </w:p>
+    <w:p>
+      <w:pPr>
+        <w:pStyle w:val="Compact"/>
+        <w:numPr>
+          <w:ilvl w:val="0"/>
+          <w:numId w:val="1032"/>
+        </w:numPr>
+      </w:pPr>
+      <w:r>
+        <w:t xml:space="preserve">Pérdida, corrupción o inaccessibilidad de datos (excepto si incumplimiento comprobado del SLA de FACTUS persiste por período superior a 20 días hábiles y Cliente notificó por escrito).</w:t>
+      </w:r>
+    </w:p>
+    <w:p>
+      <w:pPr>
+        <w:pStyle w:val="Compact"/>
+        <w:numPr>
+          <w:ilvl w:val="0"/>
+          <w:numId w:val="1032"/>
+        </w:numPr>
+      </w:pPr>
+      <w:r>
+        <w:t xml:space="preserve">Interrupciones, suspensión o terminación de operaciones comerciales del Cliente.</w:t>
+      </w:r>
+    </w:p>
+    <w:p>
+      <w:pPr>
+        <w:pStyle w:val="Compact"/>
+        <w:numPr>
+          <w:ilvl w:val="0"/>
+          <w:numId w:val="1032"/>
+        </w:numPr>
+      </w:pPr>
+      <w:r>
+        <w:t xml:space="preserve">Daño reputacional o lesión de imagen comercial.</w:t>
+      </w:r>
+    </w:p>
+    <w:p>
+      <w:pPr>
+        <w:pStyle w:val="Compact"/>
+        <w:numPr>
+          <w:ilvl w:val="0"/>
+          <w:numId w:val="1032"/>
+        </w:numPr>
+      </w:pPr>
+      <w:r>
+        <w:t xml:space="preserve">Multas, sanciones, intereses de mora o costos de gestión de cobro impuestos por autoridades tributarias (DIAN) a causa de incumplimiento del Cliente.</w:t>
+      </w:r>
+    </w:p>
+    <w:p>
+      <w:pPr>
+        <w:pStyle w:val="Compact"/>
+        <w:numPr>
+          <w:ilvl w:val="0"/>
+          <w:numId w:val="1032"/>
+        </w:numPr>
+      </w:pPr>
+      <w:r>
+        <w:t xml:space="preserve">Reclamos, demandas o acciones de terceros (clientes, proveedores, competidores del Cliente) basadas en contenido de documentos emitidos.</w:t>
+      </w:r>
+    </w:p>
+    <w:p>
+      <w:pPr>
+        <w:pStyle w:val="FirstParagraph"/>
+      </w:pPr>
+      <w:r>
+        <w:t xml:space="preserve">11.2</w:t>
+      </w:r>
+      <w:r>
+        <w:t xml:space="preserve"> </w:t>
+      </w:r>
+      <w:r>
+        <w:rPr>
+          <w:b/>
+          <w:bCs/>
+        </w:rPr>
+        <w:t xml:space="preserve">Responsabilidad Exclusiva del Cliente por Contenido e Información:</w:t>
       </w:r>
     </w:p>
     <w:p>
@@ -2850,17 +3121,80 @@
         <w:pStyle w:val="BodyText"/>
       </w:pPr>
       <w:r>
-        <w:t xml:space="preserve">11.2</w:t>
-      </w:r>
-      <w:r>
-        <w:t xml:space="preserve"> </w:t>
-      </w:r>
-      <w:r>
-        <w:rPr>
-          <w:b/>
-          <w:bCs/>
-        </w:rPr>
-        <w:t xml:space="preserve">Responsabilidad por Información Tuya:</w:t>
+        <w:rPr>
+          <w:b/>
+          <w:bCs/>
+        </w:rPr>
+        <w:t xml:space="preserve">El Cliente asume responsabilidad total por:</w:t>
+      </w:r>
+    </w:p>
+    <w:p>
+      <w:pPr>
+        <w:pStyle w:val="Compact"/>
+        <w:numPr>
+          <w:ilvl w:val="0"/>
+          <w:numId w:val="1033"/>
+        </w:numPr>
+      </w:pPr>
+      <w:r>
+        <w:t xml:space="preserve">Exactitud, completitud y veracidad de información contenida en documentos emitidos (razón social, NIT, datos de terceros, valores, impuestos).</w:t>
+      </w:r>
+    </w:p>
+    <w:p>
+      <w:pPr>
+        <w:pStyle w:val="Compact"/>
+        <w:numPr>
+          <w:ilvl w:val="0"/>
+          <w:numId w:val="1033"/>
+        </w:numPr>
+      </w:pPr>
+      <w:r>
+        <w:t xml:space="preserve">Ilegalidad, falsedad, fraude, o incumplimiento tributario de documentos emitidos.</w:t>
+      </w:r>
+    </w:p>
+    <w:p>
+      <w:pPr>
+        <w:pStyle w:val="Compact"/>
+        <w:numPr>
+          <w:ilvl w:val="0"/>
+          <w:numId w:val="1033"/>
+        </w:numPr>
+      </w:pPr>
+      <w:r>
+        <w:t xml:space="preserve">Cumplimiento de todas las obligaciones tributarias ante DIAN: declaraciones, pagos, cargas de rangos, solicitudes de habilitación.</w:t>
+      </w:r>
+    </w:p>
+    <w:p>
+      <w:pPr>
+        <w:pStyle w:val="Compact"/>
+        <w:numPr>
+          <w:ilvl w:val="0"/>
+          <w:numId w:val="1033"/>
+        </w:numPr>
+      </w:pPr>
+      <w:r>
+        <w:t xml:space="preserve">Autorización previa y consentimiento informado para incluir datos de terceros en documentos.</w:t>
+      </w:r>
+    </w:p>
+    <w:p>
+      <w:pPr>
+        <w:pStyle w:val="FirstParagraph"/>
+      </w:pPr>
+      <w:r>
+        <w:t xml:space="preserve">Si la DIAN rechaza, devuelve, o modifica estado de documentos por causas atribuibles al Cliente (error en datos, falta de rangos, incumplimiento tributario),</w:t>
+      </w:r>
+      <w:r>
+        <w:t xml:space="preserve"> </w:t>
+      </w:r>
+      <w:r>
+        <w:rPr>
+          <w:b/>
+          <w:bCs/>
+        </w:rPr>
+        <w:t xml:space="preserve">FACTUS no es responsable</w:t>
+      </w:r>
+      <w:r>
+        <w:t xml:space="preserve">. La responsabilidad por validación y corrección recae exclusivamente en el Cliente.</w:t>
       </w:r>
     </w:p>
     <w:p>
@@ -2868,25 +3202,17 @@
         <w:pStyle w:val="BodyText"/>
       </w:pPr>
       <w:r>
-        <w:t xml:space="preserve">FACTUS no es responsable por:</w:t>
-      </w:r>
-      <w:r>
-        <w:t xml:space="preserve"> </w:t>
-      </w:r>
-      <w:r>
-        <w:t xml:space="preserve">- Exactitud de información que cargaste en documentos.</w:t>
-      </w:r>
-      <w:r>
-        <w:t xml:space="preserve"> </w:t>
-      </w:r>
-      <w:r>
-        <w:t xml:space="preserve">- Ilegalidad de documentos que emitiste.</w:t>
-      </w:r>
-      <w:r>
-        <w:t xml:space="preserve"> </w:t>
-      </w:r>
-      <w:r>
-        <w:t xml:space="preserve">- Falta de cumplimiento tributario tuyo.</w:t>
+        <w:t xml:space="preserve">11.3</w:t>
+      </w:r>
+      <w:r>
+        <w:t xml:space="preserve"> </w:t>
+      </w:r>
+      <w:r>
+        <w:rPr>
+          <w:b/>
+          <w:bCs/>
+        </w:rPr>
+        <w:t xml:space="preserve">Responsabilidad por Terceros — Resellers e Intermediarios:</w:t>
       </w:r>
     </w:p>
     <w:p>
@@ -2894,7 +3220,51 @@
         <w:pStyle w:val="BodyText"/>
       </w:pPr>
       <w:r>
-        <w:t xml:space="preserve">Si la DIAN rechaza documentos por error tuyo, no es culpa de FACTUS.</w:t>
+        <w:t xml:space="preserve">Si Cliente contrató acceso a través de una empresa reseller o intermediaria:</w:t>
+      </w:r>
+    </w:p>
+    <w:p>
+      <w:pPr>
+        <w:pStyle w:val="Compact"/>
+        <w:numPr>
+          <w:ilvl w:val="0"/>
+          <w:numId w:val="1034"/>
+        </w:numPr>
+      </w:pPr>
+      <w:r>
+        <w:t xml:space="preserve">FACTUS no es responsable por actuaciones, negligencia, incumplimiento comercial o técnico de reseller.</w:t>
+      </w:r>
+    </w:p>
+    <w:p>
+      <w:pPr>
+        <w:pStyle w:val="Compact"/>
+        <w:numPr>
+          <w:ilvl w:val="0"/>
+          <w:numId w:val="1034"/>
+        </w:numPr>
+      </w:pPr>
+      <w:r>
+        <w:t xml:space="preserve">Reclamaciones sobre soporte, términos comerciales, precios o calidad de atención deben dirigirse al reseller.</w:t>
+      </w:r>
+    </w:p>
+    <w:p>
+      <w:pPr>
+        <w:pStyle w:val="Compact"/>
+        <w:numPr>
+          <w:ilvl w:val="0"/>
+          <w:numId w:val="1034"/>
+        </w:numPr>
+      </w:pPr>
+      <w:r>
+        <w:t xml:space="preserve">FACTUS solo responde por fallas técnicas comprobadas de su plataforma; el reseller responde por su relación comercial con el Cliente.</w:t>
+      </w:r>
+    </w:p>
+    <w:p>
+      <w:pPr>
+        <w:pStyle w:val="FirstParagraph"/>
+      </w:pPr>
+      <w:r>
+        <w:t xml:space="preserve">Reclamos de Cliente contra terceros (clientes, proveedores, competidores) por contenido de documentos son responsabilidad exclusiva del Cliente; FACTUS no interviene ni es responsable.</w:t>
       </w:r>
     </w:p>
     <w:p>
@@ -2902,17 +3272,17 @@
         <w:pStyle w:val="BodyText"/>
       </w:pPr>
       <w:r>
-        <w:t xml:space="preserve">11.3</w:t>
-      </w:r>
-      <w:r>
-        <w:t xml:space="preserve"> </w:t>
-      </w:r>
-      <w:r>
-        <w:rPr>
-          <w:b/>
-          <w:bCs/>
-        </w:rPr>
-        <w:t xml:space="preserve">Responsabilidad por Terceros:</w:t>
+        <w:t xml:space="preserve">11.4</w:t>
+      </w:r>
+      <w:r>
+        <w:t xml:space="preserve"> </w:t>
+      </w:r>
+      <w:r>
+        <w:rPr>
+          <w:b/>
+          <w:bCs/>
+        </w:rPr>
+        <w:t xml:space="preserve">Fuerza Mayor:</w:t>
       </w:r>
     </w:p>
     <w:p>
@@ -2920,67 +3290,79 @@
         <w:pStyle w:val="BodyText"/>
       </w:pPr>
       <w:r>
-        <w:t xml:space="preserve">FACTUS no es responsable por:</w:t>
-      </w:r>
-      <w:r>
-        <w:t xml:space="preserve"> </w:t>
-      </w:r>
-      <w:r>
-        <w:t xml:space="preserve">- Acciones de tus clientes/proveedores (si los incluiste sin autorización en documentos).</w:t>
-      </w:r>
-      <w:r>
-        <w:t xml:space="preserve"> </w:t>
-      </w:r>
-      <w:r>
-        <w:t xml:space="preserve">- Reclamaciones de terceros contra ti por documentos que emitiste.</w:t>
-      </w:r>
-      <w:r>
-        <w:t xml:space="preserve"> </w:t>
-      </w:r>
-      <w:r>
-        <w:t xml:space="preserve">- Acciones de reseller (si contrataste a través de reseller, reclama al reseller; es intermediario).</w:t>
-      </w:r>
-    </w:p>
-    <w:p>
-      <w:pPr>
-        <w:pStyle w:val="BodyText"/>
-      </w:pPr>
-      <w:r>
-        <w:t xml:space="preserve">11.4</w:t>
-      </w:r>
-      <w:r>
-        <w:t xml:space="preserve"> </w:t>
-      </w:r>
-      <w:r>
-        <w:rPr>
-          <w:b/>
-          <w:bCs/>
-        </w:rPr>
-        <w:t xml:space="preserve">Fuerza Mayor:</w:t>
-      </w:r>
-    </w:p>
-    <w:p>
-      <w:pPr>
-        <w:pStyle w:val="Compact"/>
-        <w:numPr>
-          <w:ilvl w:val="0"/>
-          <w:numId w:val="1030"/>
-        </w:numPr>
-      </w:pPr>
-      <w:r>
-        <w:t xml:space="preserve">Ataques DDoS, caídas de DIAN, cortes de internet, desastres naturales: FACTUS no responde.</w:t>
-      </w:r>
-    </w:p>
-    <w:p>
-      <w:pPr>
-        <w:pStyle w:val="Compact"/>
-        <w:numPr>
-          <w:ilvl w:val="0"/>
-          <w:numId w:val="1030"/>
-        </w:numPr>
-      </w:pPr>
-      <w:r>
-        <w:t xml:space="preserve">Mantenimiento de emergencia: Se notifica lo antes posible, no es incumplimiento SLA.</w:t>
+        <w:rPr>
+          <w:b/>
+          <w:bCs/>
+        </w:rPr>
+        <w:t xml:space="preserve">Eventos de fuerza mayor exoneran a FACTUS de responsabilidad:</w:t>
+      </w:r>
+    </w:p>
+    <w:p>
+      <w:pPr>
+        <w:pStyle w:val="Compact"/>
+        <w:numPr>
+          <w:ilvl w:val="0"/>
+          <w:numId w:val="1035"/>
+        </w:numPr>
+      </w:pPr>
+      <w:r>
+        <w:t xml:space="preserve">Ataques de denegación de servicio (DDoS) dirigidos a infraestructura DIAN o proveedores terceros.</w:t>
+      </w:r>
+    </w:p>
+    <w:p>
+      <w:pPr>
+        <w:pStyle w:val="Compact"/>
+        <w:numPr>
+          <w:ilvl w:val="0"/>
+          <w:numId w:val="1035"/>
+        </w:numPr>
+      </w:pPr>
+      <w:r>
+        <w:t xml:space="preserve">Caída, indisponibilidad o cambios en plataforma DIAN fuera del control de FACTUS.</w:t>
+      </w:r>
+    </w:p>
+    <w:p>
+      <w:pPr>
+        <w:pStyle w:val="Compact"/>
+        <w:numPr>
+          <w:ilvl w:val="0"/>
+          <w:numId w:val="1035"/>
+        </w:numPr>
+      </w:pPr>
+      <w:r>
+        <w:t xml:space="preserve">Cortes de electricidad, telecomunicaciones o internet en zonas donde se ubican servidores de FACTUS.</w:t>
+      </w:r>
+    </w:p>
+    <w:p>
+      <w:pPr>
+        <w:pStyle w:val="Compact"/>
+        <w:numPr>
+          <w:ilvl w:val="0"/>
+          <w:numId w:val="1035"/>
+        </w:numPr>
+      </w:pPr>
+      <w:r>
+        <w:t xml:space="preserve">Desastres naturales (terremotos, inundaciones, huracanes), conflictos armados, epidemias, o actos de terrorismo.</w:t>
+      </w:r>
+    </w:p>
+    <w:p>
+      <w:pPr>
+        <w:pStyle w:val="Compact"/>
+        <w:numPr>
+          <w:ilvl w:val="0"/>
+          <w:numId w:val="1035"/>
+        </w:numPr>
+      </w:pPr>
+      <w:r>
+        <w:t xml:space="preserve">Cambios normativos drásticos o prohibiciones legales de operación emitidas por autoridades competentes.</w:t>
+      </w:r>
+    </w:p>
+    <w:p>
+      <w:pPr>
+        <w:pStyle w:val="FirstParagraph"/>
+      </w:pPr>
+      <w:r>
+        <w:t xml:space="preserve">FACTUS notificará lo antes posible cualquier evento de fuerza mayor y trabajará en restauración; la notificación tardía no implica culpa, pero se comunicará con la brevedad viable.</w:t>
       </w:r>
     </w:p>
     <w:p>
@@ -3049,7 +3431,7 @@
         <w:pStyle w:val="Compact"/>
         <w:numPr>
           <w:ilvl w:val="0"/>
-          <w:numId w:val="1031"/>
+          <w:numId w:val="1036"/>
         </w:numPr>
       </w:pPr>
       <w:r>
@@ -3061,7 +3443,7 @@
         <w:pStyle w:val="Compact"/>
         <w:numPr>
           <w:ilvl w:val="0"/>
-          <w:numId w:val="1031"/>
+          <w:numId w:val="1036"/>
         </w:numPr>
       </w:pPr>
       <w:r>
@@ -3128,18 +3510,196 @@
         </w:rPr>
         <w:t xml:space="preserve">Ley Aplicable:</w:t>
       </w:r>
-      <w:r>
-        <w:t xml:space="preserve"> </w:t>
-      </w:r>
-      <w:r>
-        <w:t xml:space="preserve">Estos TyC se rigen por leyes de la República de Colombia.</w:t>
-      </w:r>
     </w:p>
     <w:p>
       <w:pPr>
         <w:pStyle w:val="BodyText"/>
       </w:pPr>
       <w:r>
+        <w:t xml:space="preserve">Estos TyC se rigen, interpretan y ejecutan conforme a las leyes sustantivas y procedimentales de la República de Colombia, en especial:</w:t>
+      </w:r>
+    </w:p>
+    <w:p>
+      <w:pPr>
+        <w:pStyle w:val="Compact"/>
+        <w:numPr>
+          <w:ilvl w:val="0"/>
+          <w:numId w:val="1037"/>
+        </w:numPr>
+      </w:pPr>
+      <w:r>
+        <w:rPr>
+          <w:b/>
+          <w:bCs/>
+        </w:rPr>
+        <w:t xml:space="preserve">Código Civil Colombiano</w:t>
+      </w:r>
+      <w:r>
+        <w:t xml:space="preserve"> </w:t>
+      </w:r>
+      <w:r>
+        <w:t xml:space="preserve">(obligaciones, contratos, responsabilidad civil).</w:t>
+      </w:r>
+    </w:p>
+    <w:p>
+      <w:pPr>
+        <w:pStyle w:val="Compact"/>
+        <w:numPr>
+          <w:ilvl w:val="0"/>
+          <w:numId w:val="1037"/>
+        </w:numPr>
+      </w:pPr>
+      <w:r>
+        <w:rPr>
+          <w:b/>
+          <w:bCs/>
+        </w:rPr>
+        <w:t xml:space="preserve">Código de Procedimiento Civil</w:t>
+      </w:r>
+      <w:r>
+        <w:t xml:space="preserve"> </w:t>
+      </w:r>
+      <w:r>
+        <w:t xml:space="preserve">(acciones, recursos procesales, términos).</w:t>
+      </w:r>
+    </w:p>
+    <w:p>
+      <w:pPr>
+        <w:pStyle w:val="Compact"/>
+        <w:numPr>
+          <w:ilvl w:val="0"/>
+          <w:numId w:val="1037"/>
+        </w:numPr>
+      </w:pPr>
+      <w:r>
+        <w:rPr>
+          <w:b/>
+          <w:bCs/>
+        </w:rPr>
+        <w:t xml:space="preserve">Estatuto Tributario y Resoluciones DIAN</w:t>
+      </w:r>
+      <w:r>
+        <w:t xml:space="preserve"> </w:t>
+      </w:r>
+      <w:r>
+        <w:t xml:space="preserve">(obligaciones tributarias, procedimientos ante autoridad fiscal).</w:t>
+      </w:r>
+    </w:p>
+    <w:p>
+      <w:pPr>
+        <w:pStyle w:val="Compact"/>
+        <w:numPr>
+          <w:ilvl w:val="0"/>
+          <w:numId w:val="1037"/>
+        </w:numPr>
+      </w:pPr>
+      <w:r>
+        <w:rPr>
+          <w:b/>
+          <w:bCs/>
+        </w:rPr>
+        <w:t xml:space="preserve">Ley 1480/2011</w:t>
+      </w:r>
+      <w:r>
+        <w:t xml:space="preserve"> </w:t>
+      </w:r>
+      <w:r>
+        <w:t xml:space="preserve">(Estatuto del Consumidor, derechos del consumidor, garantías limitadas, retracto).</w:t>
+      </w:r>
+    </w:p>
+    <w:p>
+      <w:pPr>
+        <w:pStyle w:val="Compact"/>
+        <w:numPr>
+          <w:ilvl w:val="0"/>
+          <w:numId w:val="1037"/>
+        </w:numPr>
+      </w:pPr>
+      <w:r>
+        <w:rPr>
+          <w:b/>
+          <w:bCs/>
+        </w:rPr>
+        <w:t xml:space="preserve">Ley 2439/2024</w:t>
+      </w:r>
+      <w:r>
+        <w:t xml:space="preserve"> </w:t>
+      </w:r>
+      <w:r>
+        <w:t xml:space="preserve">(reforma de comercio electrónico, derechos en compra de servicios digitales).</w:t>
+      </w:r>
+    </w:p>
+    <w:p>
+      <w:pPr>
+        <w:pStyle w:val="Compact"/>
+        <w:numPr>
+          <w:ilvl w:val="0"/>
+          <w:numId w:val="1037"/>
+        </w:numPr>
+      </w:pPr>
+      <w:r>
+        <w:rPr>
+          <w:b/>
+          <w:bCs/>
+        </w:rPr>
+        <w:t xml:space="preserve">Ley 1581/2012 y Decreto 1377/2013</w:t>
+      </w:r>
+      <w:r>
+        <w:t xml:space="preserve"> </w:t>
+      </w:r>
+      <w:r>
+        <w:t xml:space="preserve">(protección de datos personales).</w:t>
+      </w:r>
+    </w:p>
+    <w:p>
+      <w:pPr>
+        <w:pStyle w:val="Compact"/>
+        <w:numPr>
+          <w:ilvl w:val="0"/>
+          <w:numId w:val="1037"/>
+        </w:numPr>
+      </w:pPr>
+      <w:r>
+        <w:rPr>
+          <w:b/>
+          <w:bCs/>
+        </w:rPr>
+        <w:t xml:space="preserve">Ley 1960/2019</w:t>
+      </w:r>
+      <w:r>
+        <w:t xml:space="preserve"> </w:t>
+      </w:r>
+      <w:r>
+        <w:t xml:space="preserve">(prevención de lavado de activos).</w:t>
+      </w:r>
+    </w:p>
+    <w:p>
+      <w:pPr>
+        <w:pStyle w:val="Compact"/>
+        <w:numPr>
+          <w:ilvl w:val="0"/>
+          <w:numId w:val="1037"/>
+        </w:numPr>
+      </w:pPr>
+      <w:r>
+        <w:rPr>
+          <w:b/>
+          <w:bCs/>
+        </w:rPr>
+        <w:t xml:space="preserve">Ley 527/1999 y Decreto 2364/2012</w:t>
+      </w:r>
+      <w:r>
+        <w:t xml:space="preserve"> </w:t>
+      </w:r>
+      <w:r>
+        <w:t xml:space="preserve">(firma electrónica, validez legal de transacciones electrónicas).</w:t>
+      </w:r>
+    </w:p>
+    <w:p>
+      <w:pPr>
+        <w:pStyle w:val="FirstParagraph"/>
+      </w:pPr>
+      <w:r>
         <w:t xml:space="preserve">13.2</w:t>
       </w:r>
       <w:r>
@@ -3150,18 +3710,75 @@
           <w:b/>
           <w:bCs/>
         </w:rPr>
-        <w:t xml:space="preserve">Intento Amistoso:</w:t>
-      </w:r>
-      <w:r>
-        <w:t xml:space="preserve"> </w:t>
-      </w:r>
-      <w:r>
-        <w:t xml:space="preserve">Cualquier controversia se resuelve primero entre Cliente y FACTUS mediante diálogo.</w:t>
-      </w:r>
-    </w:p>
-    <w:p>
-      <w:pPr>
-        <w:pStyle w:val="BodyText"/>
+        <w:t xml:space="preserve">Procedimiento Escalonado de Resolución:</w:t>
+      </w:r>
+    </w:p>
+    <w:p>
+      <w:pPr>
+        <w:numPr>
+          <w:ilvl w:val="0"/>
+          <w:numId w:val="1038"/>
+        </w:numPr>
+      </w:pPr>
+      <w:r>
+        <w:rPr>
+          <w:b/>
+          <w:bCs/>
+        </w:rPr>
+        <w:t xml:space="preserve">(a) Gestión Directa:</w:t>
+      </w:r>
+      <w:r>
+        <w:t xml:space="preserve"> </w:t>
+      </w:r>
+      <w:r>
+        <w:t xml:space="preserve">Cualquier controversia, reclamo o disputa será comunicada por escrito a FACTUS en máximo 10 días calendario desde el evento que la origina. Las partes dialogarán directamente para resolución expedita durante 10 días calendario subsecuentes.</w:t>
+      </w:r>
+    </w:p>
+    <w:p>
+      <w:pPr>
+        <w:numPr>
+          <w:ilvl w:val="0"/>
+          <w:numId w:val="1038"/>
+        </w:numPr>
+      </w:pPr>
+      <w:r>
+        <w:rPr>
+          <w:b/>
+          <w:bCs/>
+        </w:rPr>
+        <w:t xml:space="preserve">(b) Mediación Conciliatoria:</w:t>
+      </w:r>
+      <w:r>
+        <w:t xml:space="preserve"> </w:t>
+      </w:r>
+      <w:r>
+        <w:t xml:space="preserve">Si diálogo no produce acuerdo, Cliente podrá activar proceso de mediación ante Centro de Conciliación de la Cámara de Comercio competente según domicilio del Cliente. Las partes designan mediador dentro de 5 días hábiles e intentan acuerdo en máximo 20 días hábiles.</w:t>
+      </w:r>
+    </w:p>
+    <w:p>
+      <w:pPr>
+        <w:numPr>
+          <w:ilvl w:val="0"/>
+          <w:numId w:val="1038"/>
+        </w:numPr>
+      </w:pPr>
+      <w:r>
+        <w:rPr>
+          <w:b/>
+          <w:bCs/>
+        </w:rPr>
+        <w:t xml:space="preserve">(c) Jurisdicción Ordinaria:</w:t>
+      </w:r>
+      <w:r>
+        <w:t xml:space="preserve"> </w:t>
+      </w:r>
+      <w:r>
+        <w:t xml:space="preserve">Si gestión directa y mediación no producen resultado, Cliente puede ejercer acciones ante juzgados civiles del circuito de su domicilio. Se excluye expresamente arbitraje. Cualquiera de las partes puede ejercer acciones de cobro, nulidad, responsabilidad civil o reparación conforme procesos ordinarios civiles.</w:t>
+      </w:r>
+    </w:p>
+    <w:p>
+      <w:pPr>
+        <w:pStyle w:val="FirstParagraph"/>
       </w:pPr>
       <w:r>
         <w:t xml:space="preserve">13.3</w:t>
@@ -3174,37 +3791,25 @@
           <w:b/>
           <w:bCs/>
         </w:rPr>
-        <w:t xml:space="preserve">Mediación:</w:t>
-      </w:r>
-      <w:r>
-        <w:t xml:space="preserve"> </w:t>
-      </w:r>
-      <w:r>
-        <w:t xml:space="preserve">Si diálogo falla, mediación ante Centro de Conciliación de Cámara de Comercio (ciudad del Cliente).</w:t>
-      </w:r>
-    </w:p>
-    <w:p>
-      <w:pPr>
-        <w:pStyle w:val="BodyText"/>
-      </w:pPr>
-      <w:r>
-        <w:t xml:space="preserve">13.4</w:t>
-      </w:r>
-      <w:r>
-        <w:t xml:space="preserve"> </w:t>
-      </w:r>
-      <w:r>
-        <w:rPr>
-          <w:b/>
-          <w:bCs/>
-        </w:rPr>
-        <w:t xml:space="preserve">Arbitraje/Jurisdicción:</w:t>
-      </w:r>
-      <w:r>
-        <w:t xml:space="preserve"> </w:t>
-      </w:r>
-      <w:r>
-        <w:t xml:space="preserve">Si mediación falla, controversia se resuelve en juzgados civiles de jurisdicción del domicilio del Cliente.</w:t>
+        <w:t xml:space="preserve">Cálculo de Términos:</w:t>
+      </w:r>
+      <w:r>
+        <w:t xml:space="preserve"> </w:t>
+      </w:r>
+      <w:r>
+        <w:t xml:space="preserve">Todos los plazos mencionados en estos TyC se cuentan en días calendario, excepto cuando se especifique expresamente</w:t>
+      </w:r>
+      <w:r>
+        <w:t xml:space="preserve"> </w:t>
+      </w:r>
+      <w:r>
+        <w:t xml:space="preserve">“días hábiles”</w:t>
+      </w:r>
+      <w:r>
+        <w:t xml:space="preserve"> </w:t>
+      </w:r>
+      <w:r>
+        <w:t xml:space="preserve">(excluyendo sábados, domingos y festivos colombianos). Si vencimiento cae en festivo o día no hábil, se traslada al siguiente día hábil.</w:t>
       </w:r>
     </w:p>
     <w:p>
@@ -3215,13 +3820,13 @@
       </w:r>
     </w:p>
     <w:bookmarkEnd w:id="927"/>
-    <w:bookmarkStart w:id="928" w:name="seguridad-y-responsabilidad-del-cliente"/>
+    <w:bookmarkStart w:id="928" w:name="X0f83b8b54a6d7668479ce34ae52c0e8aea4d27a"/>
     <w:p>
       <w:pPr>
         <w:pStyle w:val="Heading1"/>
       </w:pPr>
       <w:r>
-        <w:t xml:space="preserve">14. Seguridad y Responsabilidad del Cliente</w:t>
+        <w:t xml:space="preserve">14. Seguridad de Cuenta y Responsabilidad del Cliente</w:t>
       </w:r>
     </w:p>
     <w:p>
@@ -3239,55 +3844,125 @@
           <w:b/>
           <w:bCs/>
         </w:rPr>
-        <w:t xml:space="preserve">Uso Responsable:</w:t>
-      </w:r>
-    </w:p>
-    <w:p>
-      <w:pPr>
-        <w:pStyle w:val="Compact"/>
-        <w:numPr>
-          <w:ilvl w:val="0"/>
-          <w:numId w:val="1032"/>
-        </w:numPr>
-      </w:pPr>
-      <w:r>
-        <w:t xml:space="preserve">Cambiar contraseña regularmente.</w:t>
-      </w:r>
-    </w:p>
-    <w:p>
-      <w:pPr>
-        <w:pStyle w:val="Compact"/>
-        <w:numPr>
-          <w:ilvl w:val="0"/>
-          <w:numId w:val="1032"/>
-        </w:numPr>
-      </w:pPr>
-      <w:r>
-        <w:t xml:space="preserve">No compartir credenciales.</w:t>
-      </w:r>
-    </w:p>
-    <w:p>
-      <w:pPr>
-        <w:pStyle w:val="Compact"/>
-        <w:numPr>
-          <w:ilvl w:val="0"/>
-          <w:numId w:val="1032"/>
-        </w:numPr>
-      </w:pPr>
-      <w:r>
-        <w:t xml:space="preserve">Reportar acceso sospechoso inmediatamente.</w:t>
-      </w:r>
-    </w:p>
-    <w:p>
-      <w:pPr>
-        <w:pStyle w:val="Compact"/>
-        <w:numPr>
-          <w:ilvl w:val="0"/>
-          <w:numId w:val="1032"/>
-        </w:numPr>
-      </w:pPr>
-      <w:r>
-        <w:t xml:space="preserve">No usar conexiones públicas sin VPN para acceder.</w:t>
+        <w:t xml:space="preserve">Obligaciones de Seguridad del Cliente:</w:t>
+      </w:r>
+    </w:p>
+    <w:p>
+      <w:pPr>
+        <w:pStyle w:val="BodyText"/>
+      </w:pPr>
+      <w:r>
+        <w:t xml:space="preserve">El Cliente se obliga a:</w:t>
+      </w:r>
+    </w:p>
+    <w:p>
+      <w:pPr>
+        <w:pStyle w:val="Compact"/>
+        <w:numPr>
+          <w:ilvl w:val="0"/>
+          <w:numId w:val="1039"/>
+        </w:numPr>
+      </w:pPr>
+      <w:r>
+        <w:rPr>
+          <w:b/>
+          <w:bCs/>
+        </w:rPr>
+        <w:t xml:space="preserve">Contraseña Segura:</w:t>
+      </w:r>
+      <w:r>
+        <w:t xml:space="preserve"> </w:t>
+      </w:r>
+      <w:r>
+        <w:t xml:space="preserve">Establecer contraseña que cumpla requisitos de complejidad (mínimo 8 caracteres, combinación de mayúsculas, minúsculas, números, caracteres especiales) y cambiarla periódicamente (mínimo cada 90 días).</w:t>
+      </w:r>
+    </w:p>
+    <w:p>
+      <w:pPr>
+        <w:pStyle w:val="Compact"/>
+        <w:numPr>
+          <w:ilvl w:val="0"/>
+          <w:numId w:val="1039"/>
+        </w:numPr>
+      </w:pPr>
+      <w:r>
+        <w:rPr>
+          <w:b/>
+          <w:bCs/>
+        </w:rPr>
+        <w:t xml:space="preserve">Confidencialidad de Credenciales:</w:t>
+      </w:r>
+      <w:r>
+        <w:t xml:space="preserve"> </w:t>
+      </w:r>
+      <w:r>
+        <w:t xml:space="preserve">No compartir, revelar, o permitir acceso a terceros de usuario, contraseña, códigos de autenticación de dos factores, o cualquier mecanismo de acceso a la cuenta.</w:t>
+      </w:r>
+    </w:p>
+    <w:p>
+      <w:pPr>
+        <w:pStyle w:val="Compact"/>
+        <w:numPr>
+          <w:ilvl w:val="0"/>
+          <w:numId w:val="1039"/>
+        </w:numPr>
+      </w:pPr>
+      <w:r>
+        <w:rPr>
+          <w:b/>
+          <w:bCs/>
+        </w:rPr>
+        <w:t xml:space="preserve">Reporte Inmediato de Acceso Sospechoso:</w:t>
+      </w:r>
+      <w:r>
+        <w:t xml:space="preserve"> </w:t>
+      </w:r>
+      <w:r>
+        <w:t xml:space="preserve">Notificar a FACTUS dentro de 24 horas si detecta acceso no autorizado, cambios no solicitados en configuración, o actividad inusual en su cuenta.</w:t>
+      </w:r>
+    </w:p>
+    <w:p>
+      <w:pPr>
+        <w:pStyle w:val="Compact"/>
+        <w:numPr>
+          <w:ilvl w:val="0"/>
+          <w:numId w:val="1039"/>
+        </w:numPr>
+      </w:pPr>
+      <w:r>
+        <w:rPr>
+          <w:b/>
+          <w:bCs/>
+        </w:rPr>
+        <w:t xml:space="preserve">Conexiones Seguras:</w:t>
+      </w:r>
+      <w:r>
+        <w:t xml:space="preserve"> </w:t>
+      </w:r>
+      <w:r>
+        <w:t xml:space="preserve">No acceder a la plataforma desde redes públicas o no seguras sin uso de VPN (Red Privada Virtual) que cifre transmisión de datos.</w:t>
+      </w:r>
+    </w:p>
+    <w:p>
+      <w:pPr>
+        <w:pStyle w:val="Compact"/>
+        <w:numPr>
+          <w:ilvl w:val="0"/>
+          <w:numId w:val="1039"/>
+        </w:numPr>
+      </w:pPr>
+      <w:r>
+        <w:rPr>
+          <w:b/>
+          <w:bCs/>
+        </w:rPr>
+        <w:t xml:space="preserve">Protección de Dispositivos:</w:t>
+      </w:r>
+      <w:r>
+        <w:t xml:space="preserve"> </w:t>
+      </w:r>
+      <w:r>
+        <w:t xml:space="preserve">Mantener dispositivos de acceso (computador, teléfono, tablet) protegidos con antivirus, firewall, y software de seguridad actualizado.</w:t>
       </w:r>
     </w:p>
     <w:p>
@@ -3305,7 +3980,7 @@
           <w:b/>
           <w:bCs/>
         </w:rPr>
-        <w:t xml:space="preserve">Responsabilidad por Cuenta:</w:t>
+        <w:t xml:space="preserve">Responsabilidad por Actividad en Cuenta:</w:t>
       </w:r>
     </w:p>
     <w:p>
@@ -3313,19 +3988,59 @@
         <w:pStyle w:val="BodyText"/>
       </w:pPr>
       <w:r>
-        <w:t xml:space="preserve">Todo lo que ocurra en tu cuenta es responsabilidad tuya, incluso si</w:t>
-      </w:r>
-      <w:r>
-        <w:t xml:space="preserve"> </w:t>
-      </w:r>
-      <w:r>
-        <w:t xml:space="preserve">“alguien más”</w:t>
-      </w:r>
-      <w:r>
-        <w:t xml:space="preserve"> </w:t>
-      </w:r>
-      <w:r>
-        <w:t xml:space="preserve">lo hizo.</w:t>
+        <w:rPr>
+          <w:b/>
+          <w:bCs/>
+        </w:rPr>
+        <w:t xml:space="preserve">El Cliente es responsable de toda actividad en su cuenta</w:t>
+      </w:r>
+      <w:r>
+        <w:t xml:space="preserve">, incluyendo emisiones, consultas, descargas y cambios, independientemente de quién físicamente ejecutó la acción. Esto incluye:</w:t>
+      </w:r>
+    </w:p>
+    <w:p>
+      <w:pPr>
+        <w:pStyle w:val="Compact"/>
+        <w:numPr>
+          <w:ilvl w:val="0"/>
+          <w:numId w:val="1040"/>
+        </w:numPr>
+      </w:pPr>
+      <w:r>
+        <w:t xml:space="preserve">Actividades realizadas por empleados, contratistas, terceros autorizados, o personas que accedieron a credenciales del Cliente.</w:t>
+      </w:r>
+    </w:p>
+    <w:p>
+      <w:pPr>
+        <w:pStyle w:val="Compact"/>
+        <w:numPr>
+          <w:ilvl w:val="0"/>
+          <w:numId w:val="1040"/>
+        </w:numPr>
+      </w:pPr>
+      <w:r>
+        <w:t xml:space="preserve">Cambios no autorizados realizados por atacantes si Cliente no implementó medidas de seguridad razonables (contraseña débil, credenciales compartidas, falta de reporte de acceso sospechoso).</w:t>
+      </w:r>
+    </w:p>
+    <w:p>
+      <w:pPr>
+        <w:pStyle w:val="FirstParagraph"/>
+      </w:pPr>
+      <w:r>
+        <w:t xml:space="preserve">FACTUS no es responsable por actividades no autorizadas; la responsabilidad por seguridad de credenciales es</w:t>
+      </w:r>
+      <w:r>
+        <w:t xml:space="preserve"> </w:t>
+      </w:r>
+      <w:r>
+        <w:rPr>
+          <w:b/>
+          <w:bCs/>
+        </w:rPr>
+        <w:t xml:space="preserve">exclusivamente del Cliente</w:t>
+      </w:r>
+      <w:r>
+        <w:t xml:space="preserve">.</w:t>
       </w:r>
     </w:p>
     <w:p>
@@ -3343,7 +4058,7 @@
           <w:b/>
           <w:bCs/>
         </w:rPr>
-        <w:t xml:space="preserve">Cumplimiento Tributario:</w:t>
+        <w:t xml:space="preserve">Cumplimiento Tributario y Obligaciones del Cliente:</w:t>
       </w:r>
     </w:p>
     <w:p>
@@ -3351,39 +4066,102 @@
         <w:pStyle w:val="BodyText"/>
       </w:pPr>
       <w:r>
-        <w:t xml:space="preserve">Eres responsable de:</w:t>
-      </w:r>
-      <w:r>
-        <w:t xml:space="preserve"> </w:t>
-      </w:r>
-      <w:r>
-        <w:t xml:space="preserve">- Pago de impuestos (IVA, renta, retención).</w:t>
-      </w:r>
-      <w:r>
-        <w:t xml:space="preserve"> </w:t>
-      </w:r>
-      <w:r>
-        <w:t xml:space="preserve">- Cargas de rangos ante DIAN.</w:t>
-      </w:r>
-      <w:r>
-        <w:t xml:space="preserve"> </w:t>
-      </w:r>
-      <w:r>
-        <w:t xml:space="preserve">- Solicitudes de habilitación.</w:t>
-      </w:r>
-      <w:r>
-        <w:t xml:space="preserve"> </w:t>
-      </w:r>
-      <w:r>
-        <w:t xml:space="preserve">- Cumplimiento de normas DIAN.</w:t>
-      </w:r>
-    </w:p>
-    <w:p>
-      <w:pPr>
-        <w:pStyle w:val="BodyText"/>
-      </w:pPr>
-      <w:r>
-        <w:t xml:space="preserve">FACTUS no es asesor tributario. Si tienes dudas, consulta contador.</w:t>
+        <w:rPr>
+          <w:b/>
+          <w:bCs/>
+        </w:rPr>
+        <w:t xml:space="preserve">El Cliente asume responsabilidad total de:</w:t>
+      </w:r>
+    </w:p>
+    <w:p>
+      <w:pPr>
+        <w:pStyle w:val="Compact"/>
+        <w:numPr>
+          <w:ilvl w:val="0"/>
+          <w:numId w:val="1041"/>
+        </w:numPr>
+      </w:pPr>
+      <w:r>
+        <w:t xml:space="preserve">Cumplimiento de todas las obligaciones tributarias ante DIAN: declaración de impuestos, pago de IVA, impuesto sobre la renta, retenciones, contribuciones y aportes parafiscales.</w:t>
+      </w:r>
+    </w:p>
+    <w:p>
+      <w:pPr>
+        <w:pStyle w:val="Compact"/>
+        <w:numPr>
+          <w:ilvl w:val="0"/>
+          <w:numId w:val="1041"/>
+        </w:numPr>
+      </w:pPr>
+      <w:r>
+        <w:t xml:space="preserve">Cargas de rangos de numeración ante DIAN conforme Resoluciones vigentes.</w:t>
+      </w:r>
+    </w:p>
+    <w:p>
+      <w:pPr>
+        <w:pStyle w:val="Compact"/>
+        <w:numPr>
+          <w:ilvl w:val="0"/>
+          <w:numId w:val="1041"/>
+        </w:numPr>
+      </w:pPr>
+      <w:r>
+        <w:t xml:space="preserve">Solicitudes de habilitación de actividades económicas.</w:t>
+      </w:r>
+    </w:p>
+    <w:p>
+      <w:pPr>
+        <w:pStyle w:val="Compact"/>
+        <w:numPr>
+          <w:ilvl w:val="0"/>
+          <w:numId w:val="1041"/>
+        </w:numPr>
+      </w:pPr>
+      <w:r>
+        <w:t xml:space="preserve">Cumplimiento de normas técnicas DIAN para formato de documentos, campos obligatorios, y procedimientos de radicación.</w:t>
+      </w:r>
+    </w:p>
+    <w:p>
+      <w:pPr>
+        <w:pStyle w:val="Compact"/>
+        <w:numPr>
+          <w:ilvl w:val="0"/>
+          <w:numId w:val="1041"/>
+        </w:numPr>
+      </w:pPr>
+      <w:r>
+        <w:t xml:space="preserve">Cálculos correctos de valores, impuestos y retenciones en documentos emitidos.</w:t>
+      </w:r>
+    </w:p>
+    <w:p>
+      <w:pPr>
+        <w:pStyle w:val="FirstParagraph"/>
+      </w:pPr>
+      <w:r>
+        <w:rPr>
+          <w:b/>
+          <w:bCs/>
+        </w:rPr>
+        <w:t xml:space="preserve">FACTUS no actúa como asesor tributario, contador, auditor ni abogado.</w:t>
+      </w:r>
+      <w:r>
+        <w:t xml:space="preserve"> </w:t>
+      </w:r>
+      <w:r>
+        <w:t xml:space="preserve">Si Cliente tiene dudas sobre obligaciones tributarias, debe consultar con contador público, revisor fiscal o asesor fiscal autorizado. La plataforma es un</w:t>
+      </w:r>
+      <w:r>
+        <w:t xml:space="preserve"> </w:t>
+      </w:r>
+      <w:r>
+        <w:rPr>
+          <w:b/>
+          <w:bCs/>
+        </w:rPr>
+        <w:t xml:space="preserve">canal tecnológico únicamente</w:t>
+      </w:r>
+      <w:r>
+        <w:t xml:space="preserve">; interpretación de normas tributarias es responsabilidad del Cliente.</w:t>
       </w:r>
     </w:p>
     <w:p>
@@ -3426,7 +4204,7 @@
         <w:pStyle w:val="Compact"/>
         <w:numPr>
           <w:ilvl w:val="0"/>
-          <w:numId w:val="1033"/>
+          <w:numId w:val="1042"/>
         </w:numPr>
       </w:pPr>
       <w:r>
@@ -3438,7 +4216,7 @@
         <w:pStyle w:val="Compact"/>
         <w:numPr>
           <w:ilvl w:val="0"/>
-          <w:numId w:val="1033"/>
+          <w:numId w:val="1042"/>
         </w:numPr>
       </w:pPr>
       <w:r>
@@ -3450,7 +4228,7 @@
         <w:pStyle w:val="Compact"/>
         <w:numPr>
           <w:ilvl w:val="0"/>
-          <w:numId w:val="1033"/>
+          <w:numId w:val="1042"/>
         </w:numPr>
       </w:pPr>
       <w:r>
@@ -3462,7 +4240,7 @@
         <w:pStyle w:val="Compact"/>
         <w:numPr>
           <w:ilvl w:val="0"/>
-          <w:numId w:val="1033"/>
+          <w:numId w:val="1042"/>
         </w:numPr>
       </w:pPr>
       <w:r>
@@ -3492,7 +4270,7 @@
         <w:pStyle w:val="Compact"/>
         <w:numPr>
           <w:ilvl w:val="0"/>
-          <w:numId w:val="1034"/>
+          <w:numId w:val="1043"/>
         </w:numPr>
       </w:pPr>
       <w:r>
@@ -3504,7 +4282,7 @@
         <w:pStyle w:val="Compact"/>
         <w:numPr>
           <w:ilvl w:val="0"/>
-          <w:numId w:val="1034"/>
+          <w:numId w:val="1043"/>
         </w:numPr>
       </w:pPr>
       <w:r>
@@ -3516,7 +4294,7 @@
         <w:pStyle w:val="Compact"/>
         <w:numPr>
           <w:ilvl w:val="0"/>
-          <w:numId w:val="1034"/>
+          <w:numId w:val="1043"/>
         </w:numPr>
       </w:pPr>
       <w:r>
@@ -3725,7 +4503,7 @@
       </w:r>
     </w:p>
     <w:bookmarkEnd w:id="930"/>
-    <w:bookmarkStart w:id="931" w:name="X147a9c7018ce51efa68ebf9e74e087ca3399ab1"/>
+    <w:bookmarkStart w:id="935" w:name="X147a9c7018ce51efa68ebf9e74e087ca3399ab1"/>
     <w:p>
       <w:pPr>
         <w:pStyle w:val="Heading1"/>
@@ -3739,79 +4517,165 @@
         <w:pStyle w:val="FirstParagraph"/>
       </w:pPr>
       <w:r>
-        <w:t xml:space="preserve">Cliente acepta estos TyC mediante firma electrónica (Ley 527 de 1999, Decreto 2364 de 2012):</w:t>
-      </w:r>
-    </w:p>
-    <w:p>
-      <w:pPr>
-        <w:pStyle w:val="Compact"/>
-        <w:numPr>
-          <w:ilvl w:val="0"/>
-          <w:numId w:val="1035"/>
-        </w:numPr>
-      </w:pPr>
-      <w:r>
-        <w:t xml:space="preserve">Cliente ingresa credenciales en plataforma.</w:t>
-      </w:r>
-    </w:p>
-    <w:p>
-      <w:pPr>
-        <w:pStyle w:val="Compact"/>
-        <w:numPr>
-          <w:ilvl w:val="0"/>
-          <w:numId w:val="1035"/>
-        </w:numPr>
-      </w:pPr>
-      <w:r>
-        <w:t xml:space="preserve">Sistema presenta checkbox:</w:t>
-      </w:r>
-      <w:r>
-        <w:t xml:space="preserve"> </w:t>
-      </w:r>
-      <w:r>
-        <w:t xml:space="preserve">“Acepto Términos y Condiciones de Factus.”</w:t>
-      </w:r>
-    </w:p>
-    <w:p>
-      <w:pPr>
-        <w:pStyle w:val="Compact"/>
-        <w:numPr>
-          <w:ilvl w:val="0"/>
-          <w:numId w:val="1035"/>
-        </w:numPr>
-      </w:pPr>
-      <w:r>
-        <w:t xml:space="preserve">Cliente marca checkbox.</w:t>
-      </w:r>
-    </w:p>
-    <w:p>
-      <w:pPr>
-        <w:pStyle w:val="Compact"/>
-        <w:numPr>
-          <w:ilvl w:val="0"/>
-          <w:numId w:val="1035"/>
-        </w:numPr>
-      </w:pPr>
-      <w:r>
-        <w:t xml:space="preserve">Cliente hace clic en</w:t>
-      </w:r>
-      <w:r>
-        <w:t xml:space="preserve"> </w:t>
-      </w:r>
-      <w:r>
-        <w:t xml:space="preserve">“Aceptar.”</w:t>
-      </w:r>
-    </w:p>
-    <w:p>
-      <w:pPr>
-        <w:pStyle w:val="Compact"/>
-        <w:numPr>
-          <w:ilvl w:val="0"/>
-          <w:numId w:val="1035"/>
-        </w:numPr>
-      </w:pPr>
-      <w:r>
-        <w:t xml:space="preserve">Sistema registra:</w:t>
+        <w:t xml:space="preserve">El Cliente acepta estos Términos y Condiciones mediante firma electrónica conforme</w:t>
+      </w:r>
+      <w:r>
+        <w:t xml:space="preserve"> </w:t>
+      </w:r>
+      <w:r>
+        <w:rPr>
+          <w:b/>
+          <w:bCs/>
+        </w:rPr>
+        <w:t xml:space="preserve">Ley 527 de 1999</w:t>
+      </w:r>
+      <w:r>
+        <w:t xml:space="preserve"> </w:t>
+      </w:r>
+      <w:r>
+        <w:t xml:space="preserve">(marco legal para mensajes de datos) y</w:t>
+      </w:r>
+      <w:r>
+        <w:t xml:space="preserve"> </w:t>
+      </w:r>
+      <w:r>
+        <w:rPr>
+          <w:b/>
+          <w:bCs/>
+        </w:rPr>
+        <w:t xml:space="preserve">Decreto 2364 de 2012</w:t>
+      </w:r>
+      <w:r>
+        <w:t xml:space="preserve"> </w:t>
+      </w:r>
+      <w:r>
+        <w:t xml:space="preserve">(firma electrónica digital).</w:t>
+      </w:r>
+    </w:p>
+    <w:bookmarkStart w:id="931" w:name="procedimiento-técnico-de-aceptación"/>
+    <w:p>
+      <w:pPr>
+        <w:pStyle w:val="Heading2"/>
+      </w:pPr>
+      <w:r>
+        <w:t xml:space="preserve">Procedimiento Técnico de Aceptación</w:t>
+      </w:r>
+    </w:p>
+    <w:p>
+      <w:pPr>
+        <w:numPr>
+          <w:ilvl w:val="0"/>
+          <w:numId w:val="1044"/>
+        </w:numPr>
+      </w:pPr>
+      <w:r>
+        <w:rPr>
+          <w:b/>
+          <w:bCs/>
+        </w:rPr>
+        <w:t xml:space="preserve">Autenticación Inicial:</w:t>
+      </w:r>
+      <w:r>
+        <w:t xml:space="preserve"> </w:t>
+      </w:r>
+      <w:r>
+        <w:t xml:space="preserve">Cliente ingresa credenciales (usuario y contraseña) en plataforma FACTUS.</w:t>
+      </w:r>
+    </w:p>
+    <w:p>
+      <w:pPr>
+        <w:numPr>
+          <w:ilvl w:val="0"/>
+          <w:numId w:val="1044"/>
+        </w:numPr>
+      </w:pPr>
+      <w:r>
+        <w:rPr>
+          <w:b/>
+          <w:bCs/>
+        </w:rPr>
+        <w:t xml:space="preserve">Presentación de TyC:</w:t>
+      </w:r>
+      <w:r>
+        <w:t xml:space="preserve"> </w:t>
+      </w:r>
+      <w:r>
+        <w:t xml:space="preserve">Sistema presenta íntegramente estos Términos y Condiciones en formato legible, con campo checkbox marcado:</w:t>
+      </w:r>
+      <w:r>
+        <w:t xml:space="preserve"> </w:t>
+      </w:r>
+      <w:r>
+        <w:t xml:space="preserve">“✓ Acepto Términos y Condiciones de Factus S.A.S., confirmando que he leído y entiendo mis obligaciones, limitaciones de responsabilidad de FACTUS, y mi responsabilidad por contenido de documentos emitidos.”</w:t>
+      </w:r>
+    </w:p>
+    <w:p>
+      <w:pPr>
+        <w:numPr>
+          <w:ilvl w:val="0"/>
+          <w:numId w:val="1044"/>
+        </w:numPr>
+      </w:pPr>
+      <w:r>
+        <w:rPr>
+          <w:b/>
+          <w:bCs/>
+        </w:rPr>
+        <w:t xml:space="preserve">Acción de Aceptación:</w:t>
+      </w:r>
+      <w:r>
+        <w:t xml:space="preserve"> </w:t>
+      </w:r>
+      <w:r>
+        <w:t xml:space="preserve">Cliente marca checkbox de aceptación explícita.</w:t>
+      </w:r>
+    </w:p>
+    <w:p>
+      <w:pPr>
+        <w:numPr>
+          <w:ilvl w:val="0"/>
+          <w:numId w:val="1044"/>
+        </w:numPr>
+      </w:pPr>
+      <w:r>
+        <w:rPr>
+          <w:b/>
+          <w:bCs/>
+        </w:rPr>
+        <w:t xml:space="preserve">Confirmación Final:</w:t>
+      </w:r>
+      <w:r>
+        <w:t xml:space="preserve"> </w:t>
+      </w:r>
+      <w:r>
+        <w:t xml:space="preserve">Cliente ejecuta clic en botón</w:t>
+      </w:r>
+      <w:r>
+        <w:t xml:space="preserve"> </w:t>
+      </w:r>
+      <w:r>
+        <w:t xml:space="preserve">“Aceptar y Acceder a Plataforma.”</w:t>
+      </w:r>
+    </w:p>
+    <w:p>
+      <w:pPr>
+        <w:numPr>
+          <w:ilvl w:val="0"/>
+          <w:numId w:val="1044"/>
+        </w:numPr>
+      </w:pPr>
+      <w:r>
+        <w:rPr>
+          <w:b/>
+          <w:bCs/>
+        </w:rPr>
+        <w:t xml:space="preserve">Registro de Aceptación — Elementos Probatorios:</w:t>
+      </w:r>
+      <w:r>
+        <w:t xml:space="preserve"> </w:t>
+      </w:r>
+      <w:r>
+        <w:t xml:space="preserve">Sistema registra automáticamente:</w:t>
       </w:r>
     </w:p>
     <w:p>
@@ -3819,11 +4683,21 @@
         <w:pStyle w:val="Compact"/>
         <w:numPr>
           <w:ilvl w:val="1"/>
-          <w:numId w:val="1036"/>
-        </w:numPr>
-      </w:pPr>
-      <w:r>
-        <w:t xml:space="preserve">Fecha y hora de aceptación.</w:t>
+          <w:numId w:val="1045"/>
+        </w:numPr>
+      </w:pPr>
+      <w:r>
+        <w:rPr>
+          <w:b/>
+          <w:bCs/>
+        </w:rPr>
+        <w:t xml:space="preserve">Fecha y Hora Exacta:</w:t>
+      </w:r>
+      <w:r>
+        <w:t xml:space="preserve"> </w:t>
+      </w:r>
+      <w:r>
+        <w:t xml:space="preserve">Timestamp de UTC (Hora Universal Coordinada) de la aceptación.</w:t>
       </w:r>
     </w:p>
     <w:p>
@@ -3831,11 +4705,21 @@
         <w:pStyle w:val="Compact"/>
         <w:numPr>
           <w:ilvl w:val="1"/>
-          <w:numId w:val="1036"/>
-        </w:numPr>
-      </w:pPr>
-      <w:r>
-        <w:t xml:space="preserve">IP del Cliente.</w:t>
+          <w:numId w:val="1045"/>
+        </w:numPr>
+      </w:pPr>
+      <w:r>
+        <w:rPr>
+          <w:b/>
+          <w:bCs/>
+        </w:rPr>
+        <w:t xml:space="preserve">Identificación Cliente:</w:t>
+      </w:r>
+      <w:r>
+        <w:t xml:space="preserve"> </w:t>
+      </w:r>
+      <w:r>
+        <w:t xml:space="preserve">Usuario y NIT (o número de identificación) asociado a cuenta.</w:t>
       </w:r>
     </w:p>
     <w:p>
@@ -3843,11 +4727,21 @@
         <w:pStyle w:val="Compact"/>
         <w:numPr>
           <w:ilvl w:val="1"/>
-          <w:numId w:val="1036"/>
-        </w:numPr>
-      </w:pPr>
-      <w:r>
-        <w:t xml:space="preserve">Hash de documento.</w:t>
+          <w:numId w:val="1045"/>
+        </w:numPr>
+      </w:pPr>
+      <w:r>
+        <w:rPr>
+          <w:b/>
+          <w:bCs/>
+        </w:rPr>
+        <w:t xml:space="preserve">Dirección IP:</w:t>
+      </w:r>
+      <w:r>
+        <w:t xml:space="preserve"> </w:t>
+      </w:r>
+      <w:r>
+        <w:t xml:space="preserve">Dirección de internet desde la cual se envió la aceptación.</w:t>
       </w:r>
     </w:p>
     <w:p>
@@ -3855,23 +4749,122 @@
         <w:pStyle w:val="Compact"/>
         <w:numPr>
           <w:ilvl w:val="1"/>
-          <w:numId w:val="1036"/>
-        </w:numPr>
-      </w:pPr>
-      <w:r>
-        <w:t xml:space="preserve">Confirmación de aceptación.</w:t>
-      </w:r>
-    </w:p>
-    <w:p>
-      <w:pPr>
-        <w:pStyle w:val="Compact"/>
-        <w:numPr>
-          <w:ilvl w:val="0"/>
-          <w:numId w:val="1035"/>
-        </w:numPr>
-      </w:pPr>
-      <w:r>
-        <w:t xml:space="preserve">Cliente recibe confirmación por email con link a documento aceptado.</w:t>
+          <w:numId w:val="1045"/>
+        </w:numPr>
+      </w:pPr>
+      <w:r>
+        <w:rPr>
+          <w:b/>
+          <w:bCs/>
+        </w:rPr>
+        <w:t xml:space="preserve">Hash Criptográfico:</w:t>
+      </w:r>
+      <w:r>
+        <w:t xml:space="preserve"> </w:t>
+      </w:r>
+      <w:r>
+        <w:t xml:space="preserve">Resumen criptográfico (SHA-256 o superior) del documento de TyC aceptado, que permite verificar integridad y evitar alteración posterior.</w:t>
+      </w:r>
+    </w:p>
+    <w:p>
+      <w:pPr>
+        <w:pStyle w:val="Compact"/>
+        <w:numPr>
+          <w:ilvl w:val="1"/>
+          <w:numId w:val="1045"/>
+        </w:numPr>
+      </w:pPr>
+      <w:r>
+        <w:rPr>
+          <w:b/>
+          <w:bCs/>
+        </w:rPr>
+        <w:t xml:space="preserve">Descripción de Transacción:</w:t>
+      </w:r>
+      <w:r>
+        <w:t xml:space="preserve"> </w:t>
+      </w:r>
+      <w:r>
+        <w:t xml:space="preserve">Registro en bitácora de auditoría indicando</w:t>
+      </w:r>
+      <w:r>
+        <w:t xml:space="preserve"> </w:t>
+      </w:r>
+      <w:r>
+        <w:t xml:space="preserve">“Aceptación de TyC”</w:t>
+      </w:r>
+      <w:r>
+        <w:t xml:space="preserve"> </w:t>
+      </w:r>
+      <w:r>
+        <w:t xml:space="preserve">con todos los datos anteriores.</w:t>
+      </w:r>
+    </w:p>
+    <w:p>
+      <w:pPr>
+        <w:numPr>
+          <w:ilvl w:val="0"/>
+          <w:numId w:val="1044"/>
+        </w:numPr>
+      </w:pPr>
+      <w:r>
+        <w:rPr>
+          <w:b/>
+          <w:bCs/>
+        </w:rPr>
+        <w:t xml:space="preserve">Confirmación por Correo Electrónico:</w:t>
+      </w:r>
+      <w:r>
+        <w:t xml:space="preserve"> </w:t>
+      </w:r>
+      <w:r>
+        <w:t xml:space="preserve">FACTUS envía al Cliente dentro de 24 horas:</w:t>
+      </w:r>
+    </w:p>
+    <w:p>
+      <w:pPr>
+        <w:pStyle w:val="Compact"/>
+        <w:numPr>
+          <w:ilvl w:val="1"/>
+          <w:numId w:val="1046"/>
+        </w:numPr>
+      </w:pPr>
+      <w:r>
+        <w:t xml:space="preserve">Copia completa del documento de TyC aceptado (en formato PDF descargable).</w:t>
+      </w:r>
+    </w:p>
+    <w:p>
+      <w:pPr>
+        <w:pStyle w:val="Compact"/>
+        <w:numPr>
+          <w:ilvl w:val="1"/>
+          <w:numId w:val="1046"/>
+        </w:numPr>
+      </w:pPr>
+      <w:r>
+        <w:t xml:space="preserve">Enlace hacia registro de aceptación en plataforma (accesible por 5 años).</w:t>
+      </w:r>
+    </w:p>
+    <w:p>
+      <w:pPr>
+        <w:pStyle w:val="Compact"/>
+        <w:numPr>
+          <w:ilvl w:val="1"/>
+          <w:numId w:val="1046"/>
+        </w:numPr>
+      </w:pPr>
+      <w:r>
+        <w:t xml:space="preserve">Fecha, hora, IP y hash criptográfico de la aceptación.</w:t>
+      </w:r>
+    </w:p>
+    <w:bookmarkEnd w:id="931"/>
+    <w:bookmarkStart w:id="932" w:name="efecto-legal-de-la-firma-electrónica"/>
+    <w:p>
+      <w:pPr>
+        <w:pStyle w:val="Heading2"/>
+      </w:pPr>
+      <w:r>
+        <w:t xml:space="preserve">Efecto Legal de la Firma Electrónica</w:t>
       </w:r>
     </w:p>
     <w:p>
@@ -3879,7 +4872,189 @@
         <w:pStyle w:val="FirstParagraph"/>
       </w:pPr>
       <w:r>
-        <w:t xml:space="preserve">Esta firma electrónica tiene efecto legal equivalente a firma manuscrita conforme leyes vigentes.</w:t>
+        <w:t xml:space="preserve">Esta firma electrónica tiene</w:t>
+      </w:r>
+      <w:r>
+        <w:t xml:space="preserve"> </w:t>
+      </w:r>
+      <w:r>
+        <w:rPr>
+          <w:b/>
+          <w:bCs/>
+        </w:rPr>
+        <w:t xml:space="preserve">efecto legal equivalente a firma manuscrita</w:t>
+      </w:r>
+      <w:r>
+        <w:t xml:space="preserve"> </w:t>
+      </w:r>
+      <w:r>
+        <w:t xml:space="preserve">conforme leyes vigentes en Colombia:</w:t>
+      </w:r>
+    </w:p>
+    <w:p>
+      <w:pPr>
+        <w:pStyle w:val="Compact"/>
+        <w:numPr>
+          <w:ilvl w:val="0"/>
+          <w:numId w:val="1047"/>
+        </w:numPr>
+      </w:pPr>
+      <w:r>
+        <w:t xml:space="preserve">Constituye prueba de que Cliente conocía, entendía y aceptaba voluntariamente estos Términos y Condiciones.</w:t>
+      </w:r>
+    </w:p>
+    <w:p>
+      <w:pPr>
+        <w:pStyle w:val="Compact"/>
+        <w:numPr>
+          <w:ilvl w:val="0"/>
+          <w:numId w:val="1047"/>
+        </w:numPr>
+      </w:pPr>
+      <w:r>
+        <w:t xml:space="preserve">Es oponible a cualquier reclamación posterior del Cliente que alegue desconocimiento o falta de consentimiento.</w:t>
+      </w:r>
+    </w:p>
+    <w:p>
+      <w:pPr>
+        <w:pStyle w:val="Compact"/>
+        <w:numPr>
+          <w:ilvl w:val="0"/>
+          <w:numId w:val="1047"/>
+        </w:numPr>
+      </w:pPr>
+      <w:r>
+        <w:t xml:space="preserve">Registros técnicos (fecha, hora, IP, hash) son admitidos como prueba en procedimientos judiciales o administrativos, conforme Ley 527/1999 y jurisprudencia colombiana.</w:t>
+      </w:r>
+    </w:p>
+    <w:p>
+      <w:pPr>
+        <w:pStyle w:val="Compact"/>
+        <w:numPr>
+          <w:ilvl w:val="0"/>
+          <w:numId w:val="1047"/>
+        </w:numPr>
+      </w:pPr>
+      <w:r>
+        <w:t xml:space="preserve">Cliente es único responsable por aceptación realizada desde su cuenta; no hay anulabilidad por posterior desconocimiento si no reportó acceso no autorizado dentro de 24 horas (conforme sección 14.1).</w:t>
+      </w:r>
+    </w:p>
+    <w:bookmarkEnd w:id="932"/>
+    <w:bookmarkStart w:id="933" w:name="no-repudio"/>
+    <w:p>
+      <w:pPr>
+        <w:pStyle w:val="Heading2"/>
+      </w:pPr>
+      <w:r>
+        <w:t xml:space="preserve">No Repudio</w:t>
+      </w:r>
+    </w:p>
+    <w:p>
+      <w:pPr>
+        <w:pStyle w:val="FirstParagraph"/>
+      </w:pPr>
+      <w:r>
+        <w:t xml:space="preserve">El Cliente</w:t>
+      </w:r>
+      <w:r>
+        <w:t xml:space="preserve"> </w:t>
+      </w:r>
+      <w:r>
+        <w:rPr>
+          <w:b/>
+          <w:bCs/>
+        </w:rPr>
+        <w:t xml:space="preserve">no puede posteriormente negar</w:t>
+      </w:r>
+      <w:r>
+        <w:t xml:space="preserve"> </w:t>
+      </w:r>
+      <w:r>
+        <w:t xml:space="preserve">la aceptación alegando:</w:t>
+      </w:r>
+      <w:r>
+        <w:t xml:space="preserve"> </w:t>
+      </w:r>
+      <w:r>
+        <w:t xml:space="preserve">-</w:t>
+      </w:r>
+      <w:r>
+        <w:t xml:space="preserve"> </w:t>
+      </w:r>
+      <w:r>
+        <w:t xml:space="preserve">“No leí los TyC.”</w:t>
+      </w:r>
+      <w:r>
+        <w:t xml:space="preserve"> </w:t>
+      </w:r>
+      <w:r>
+        <w:t xml:space="preserve">(Responsabilidad del Cliente de leer antes de aceptar)</w:t>
+      </w:r>
+      <w:r>
+        <w:t xml:space="preserve"> </w:t>
+      </w:r>
+      <w:r>
+        <w:t xml:space="preserve">-</w:t>
+      </w:r>
+      <w:r>
+        <w:t xml:space="preserve"> </w:t>
+      </w:r>
+      <w:r>
+        <w:t xml:space="preserve">“Fue otra persona.”</w:t>
+      </w:r>
+      <w:r>
+        <w:t xml:space="preserve"> </w:t>
+      </w:r>
+      <w:r>
+        <w:t xml:space="preserve">(Responsabilidad del Cliente de proteger credenciales, conforme sección 14.1)</w:t>
+      </w:r>
+      <w:r>
+        <w:t xml:space="preserve"> </w:t>
+      </w:r>
+      <w:r>
+        <w:t xml:space="preserve">-</w:t>
+      </w:r>
+      <w:r>
+        <w:t xml:space="preserve"> </w:t>
+      </w:r>
+      <w:r>
+        <w:t xml:space="preserve">“El sistema estaba mal.”</w:t>
+      </w:r>
+      <w:r>
+        <w:t xml:space="preserve"> </w:t>
+      </w:r>
+      <w:r>
+        <w:t xml:space="preserve">(FACTUS proporciona ambiente seguro y auditado; Cliente debe reportar fallas técnicas inmediatamente)</w:t>
+      </w:r>
+    </w:p>
+    <w:bookmarkEnd w:id="933"/>
+    <w:bookmarkStart w:id="934" w:name="copia-y-acceso-permanente"/>
+    <w:p>
+      <w:pPr>
+        <w:pStyle w:val="Heading2"/>
+      </w:pPr>
+      <w:r>
+        <w:t xml:space="preserve">Copia y Acceso Permanente</w:t>
+      </w:r>
+    </w:p>
+    <w:p>
+      <w:pPr>
+        <w:pStyle w:val="FirstParagraph"/>
+      </w:pPr>
+      <w:r>
+        <w:t xml:space="preserve">El Cliente puede descargar, imprimir o guardar copia de:</w:t>
+      </w:r>
+      <w:r>
+        <w:t xml:space="preserve"> </w:t>
+      </w:r>
+      <w:r>
+        <w:t xml:space="preserve">- Estos Términos y Condiciones aceptados (disponible permanentemente en su cuenta).</w:t>
+      </w:r>
+      <w:r>
+        <w:t xml:space="preserve"> </w:t>
+      </w:r>
+      <w:r>
+        <w:t xml:space="preserve">- Confirmación de aceptación con detalles técnicos de la transacción (disponible por 5 años en plataforma).</w:t>
       </w:r>
     </w:p>
     <w:p>
@@ -3901,7 +5076,8 @@
         <w:t xml:space="preserve">Fin de Términos y Condiciones</w:t>
       </w:r>
     </w:p>
-    <w:bookmarkEnd w:id="931"/>
+    <w:bookmarkEnd w:id="934"/>
+    <w:bookmarkEnd w:id="935"/>
     <w:sectPr>
       <w:headerReference r:id="rId901" w:type="default"/>
       <w:footerReference r:id="rId902" w:type="default"/>
@@ -4386,6 +5562,12 @@
     <w:abstractNumId w:val="991"/>
   </w:num>
   <w:num w:numId="1024">
+    <w:abstractNumId w:val="991"/>
+  </w:num>
+  <w:num w:numId="1025">
+    <w:abstractNumId w:val="991"/>
+  </w:num>
+  <w:num w:numId="1026">
     <w:abstractNumId w:val="99411"/>
     <w:lvlOverride w:ilvl="0">
       <w:startOverride w:val="1"/>
@@ -4415,12 +5597,6 @@
       <w:startOverride w:val="1"/>
     </w:lvlOverride>
   </w:num>
-  <w:num w:numId="1025">
-    <w:abstractNumId w:val="991"/>
-  </w:num>
-  <w:num w:numId="1026">
-    <w:abstractNumId w:val="991"/>
-  </w:num>
   <w:num w:numId="1027">
     <w:abstractNumId w:val="991"/>
   </w:num>
@@ -4446,6 +5622,33 @@
     <w:abstractNumId w:val="991"/>
   </w:num>
   <w:num w:numId="1035">
+    <w:abstractNumId w:val="991"/>
+  </w:num>
+  <w:num w:numId="1036">
+    <w:abstractNumId w:val="991"/>
+  </w:num>
+  <w:num w:numId="1037">
+    <w:abstractNumId w:val="991"/>
+  </w:num>
+  <w:num w:numId="1038">
+    <w:abstractNumId w:val="991"/>
+  </w:num>
+  <w:num w:numId="1039">
+    <w:abstractNumId w:val="991"/>
+  </w:num>
+  <w:num w:numId="1040">
+    <w:abstractNumId w:val="991"/>
+  </w:num>
+  <w:num w:numId="1041">
+    <w:abstractNumId w:val="991"/>
+  </w:num>
+  <w:num w:numId="1042">
+    <w:abstractNumId w:val="991"/>
+  </w:num>
+  <w:num w:numId="1043">
+    <w:abstractNumId w:val="991"/>
+  </w:num>
+  <w:num w:numId="1044">
     <w:abstractNumId w:val="99411"/>
     <w:lvlOverride w:ilvl="0">
       <w:startOverride w:val="1"/>
@@ -4475,7 +5678,13 @@
       <w:startOverride w:val="1"/>
     </w:lvlOverride>
   </w:num>
-  <w:num w:numId="1036">
+  <w:num w:numId="1045">
+    <w:abstractNumId w:val="991"/>
+  </w:num>
+  <w:num w:numId="1046">
+    <w:abstractNumId w:val="991"/>
+  </w:num>
+  <w:num w:numId="1047">
     <w:abstractNumId w:val="991"/>
   </w:num>
 </w:numbering>

</xml_diff>

<commit_message>
Factus: TYC — mejoras técnico-legales y precisión normativa
✅ Resumen Ejecutivo: Redefinido como contrato de adhesión, cláusulas delimitadoras (qué NO es FACTUS), responsabilidad integral Cliente

✅ Sección 3: Lenguaje técnico-legal riguroso (consentimiento informado, capacidad jurídica, requisitos habilitantes, diligencia debida, exclusión por incapacidad)

✅ Sección 5.3: Validación de datos reescrita como certificación integral con garantía expresa del Cliente (datos identificatorios, terceros, económicos, procedimentales)

✅ Eliminadas líneas innecesarias: "(o URL del reseller)", "[número vigente]"

Redacción: Lenguaje jurídico técnico conforme prácticas de derecho comercial y administrativo colombiano. Precisión de normas y referencias (Código Civil, Estatuto Tributario, Ley 1960/2019, etc.)
</commit_message>
<xml_diff>
--- a/Clientes/factus/documentos-legales/tyc/TYC-Cliente-Final-Factus-v1.docx
+++ b/Clientes/factus/documentos-legales/tyc/TYC-Cliente-Final-Factus-v1.docx
@@ -100,7 +100,13 @@
         <w:pStyle w:val="FirstParagraph"/>
       </w:pPr>
       <w:r>
-        <w:t xml:space="preserve">Estos Términos y Condiciones regulan el acceso y uso de la plataforma de facturación electrónica de</w:t>
+        <w:t xml:space="preserve">Estos Términos y Condiciones (</w:t>
+      </w:r>
+      <w:r>
+        <w:t xml:space="preserve">“TyC”</w:t>
+      </w:r>
+      <w:r>
+        <w:t xml:space="preserve">) constituyen un contrato de adhesión que rige la prestación de servicios tecnológicos de facturación electrónica por parte de</w:t>
       </w:r>
       <w:r>
         <w:t xml:space="preserve"> </w:t>
@@ -113,10 +119,7 @@
         <w:t xml:space="preserve">FACTUS S.A.S.</w:t>
       </w:r>
       <w:r>
-        <w:t xml:space="preserve"> </w:t>
-      </w:r>
-      <w:r>
-        <w:t xml:space="preserve">(en adelante,</w:t>
+        <w:t xml:space="preserve">, sociedad anónima simplificada identificada con NIT 901.724.254-1 (en adelante,</w:t>
       </w:r>
       <w:r>
         <w:t xml:space="preserve"> </w:t>
@@ -129,6 +132,19 @@
         <w:t xml:space="preserve">“FACTUS”</w:t>
       </w:r>
       <w:r>
+        <w:t xml:space="preserve">,</w:t>
+      </w:r>
+      <w:r>
+        <w:t xml:space="preserve"> </w:t>
+      </w:r>
+      <w:r>
+        <w:rPr>
+          <w:b/>
+          <w:bCs/>
+        </w:rPr>
+        <w:t xml:space="preserve">“Prestador”</w:t>
+      </w:r>
+      <w:r>
         <w:t xml:space="preserve"> </w:t>
       </w:r>
       <w:r>
@@ -142,16 +158,12 @@
           <w:b/>
           <w:bCs/>
         </w:rPr>
-        <w:t xml:space="preserve">“la Plataforma”</w:t>
-      </w:r>
-      <w:r>
-        <w:t xml:space="preserve">) por parte de empresas y personas naturales que deseen emitir documentos electrónicos (Facturas, Notas Débito, Notas Crédito, Documentos Soporte, Nómina Electrónica) ante la Dirección de Impuestos y Aduanas Nacionales (</w:t>
-      </w:r>
-      <w:r>
-        <w:rPr>
-          <w:b/>
-          <w:bCs/>
-        </w:rPr>
+        <w:t xml:space="preserve">“Plataforma”</w:t>
+      </w:r>
+      <w:r>
+        <w:t xml:space="preserve">), hacia personas naturales o jurídicas con capacidad legal que deseen utilizar la infraestructura, aplicaciones y servicios de FACTUS para emitir, radicar y consultar estados de documentos electrónicos tributarios (Facturas Electrónicas, Notas Débito, Notas Crédito, Documentos Soporte Electrónicos, Nómina Electrónica) ante la Dirección de Impuestos y Aduanas Nacionales (</w:t>
+      </w:r>
+      <w:r>
         <w:t xml:space="preserve">“DIAN”</w:t>
       </w:r>
       <w:r>
@@ -167,31 +179,7 @@
           <w:b/>
           <w:bCs/>
         </w:rPr>
-        <w:t xml:space="preserve">Punto crítico:</w:t>
-      </w:r>
-      <w:r>
-        <w:t xml:space="preserve"> </w:t>
-      </w:r>
-      <w:r>
-        <w:t xml:space="preserve">FACTUS es un canal tecnológico. FACTUS no es contador, no es abogado, no determina si tus documentos cumplen normas tributarias. Tú (Cliente) eres responsable de:</w:t>
-      </w:r>
-      <w:r>
-        <w:t xml:space="preserve"> </w:t>
-      </w:r>
-      <w:r>
-        <w:t xml:space="preserve">- Validar que los datos en tus documentos son correctos y legales.</w:t>
-      </w:r>
-      <w:r>
-        <w:t xml:space="preserve"> </w:t>
-      </w:r>
-      <w:r>
-        <w:t xml:space="preserve">- Cumplir normas tributarias de la DIAN.</w:t>
-      </w:r>
-      <w:r>
-        <w:t xml:space="preserve"> </w:t>
-      </w:r>
-      <w:r>
-        <w:t xml:space="preserve">- Cargue de rangos, solicitud de habilitaciones y trámites ante DIAN (si aplica).</w:t>
+        <w:t xml:space="preserve">Alcance Funcional de FACTUS — Cláusula Delimitadora:</w:t>
       </w:r>
     </w:p>
     <w:p>
@@ -199,7 +187,214 @@
         <w:pStyle w:val="BodyText"/>
       </w:pPr>
       <w:r>
-        <w:t xml:space="preserve">Si incumples normas tributarias, FACTUS no es responsable. La responsabilidad es tuya y puede resultar en multa, auditoría o sanción de la DIAN.</w:t>
+        <w:t xml:space="preserve">FACTUS actúa exclusivamente como</w:t>
+      </w:r>
+      <w:r>
+        <w:t xml:space="preserve"> </w:t>
+      </w:r>
+      <w:r>
+        <w:rPr>
+          <w:b/>
+          <w:bCs/>
+        </w:rPr>
+        <w:t xml:space="preserve">proveedor de infraestructura y servicios tecnológicos</w:t>
+      </w:r>
+      <w:r>
+        <w:t xml:space="preserve">. En su rol, FACTUS:</w:t>
+      </w:r>
+    </w:p>
+    <w:p>
+      <w:pPr>
+        <w:pStyle w:val="Compact"/>
+        <w:numPr>
+          <w:ilvl w:val="0"/>
+          <w:numId w:val="1001"/>
+        </w:numPr>
+      </w:pPr>
+      <w:r>
+        <w:t xml:space="preserve">Proporciona acceso a plataforma para emisión de documentos bajo estándares técnicos y seguridad informática conforme auditorías DIAN.</w:t>
+      </w:r>
+    </w:p>
+    <w:p>
+      <w:pPr>
+        <w:pStyle w:val="Compact"/>
+        <w:numPr>
+          <w:ilvl w:val="0"/>
+          <w:numId w:val="1001"/>
+        </w:numPr>
+      </w:pPr>
+      <w:r>
+        <w:t xml:space="preserve">Radicar documentos ante DIAN conforme protocolos de comunicación vigentes.</w:t>
+      </w:r>
+    </w:p>
+    <w:p>
+      <w:pPr>
+        <w:pStyle w:val="Compact"/>
+        <w:numPr>
+          <w:ilvl w:val="0"/>
+          <w:numId w:val="1001"/>
+        </w:numPr>
+      </w:pPr>
+      <w:r>
+        <w:t xml:space="preserve">Genera comprobantes técnicos de transmisión (timestamp, número de radicación, estado DIAN).</w:t>
+      </w:r>
+    </w:p>
+    <w:p>
+      <w:pPr>
+        <w:pStyle w:val="FirstParagraph"/>
+      </w:pPr>
+      <w:r>
+        <w:t xml:space="preserve">FACTUS</w:t>
+      </w:r>
+      <w:r>
+        <w:t xml:space="preserve"> </w:t>
+      </w:r>
+      <w:r>
+        <w:rPr>
+          <w:b/>
+          <w:bCs/>
+        </w:rPr>
+        <w:t xml:space="preserve">no actúa, no posee la calidad de, y expresamente se excluye de</w:t>
+      </w:r>
+      <w:r>
+        <w:t xml:space="preserve">:</w:t>
+      </w:r>
+    </w:p>
+    <w:p>
+      <w:pPr>
+        <w:pStyle w:val="Compact"/>
+        <w:numPr>
+          <w:ilvl w:val="0"/>
+          <w:numId w:val="1002"/>
+        </w:numPr>
+      </w:pPr>
+      <w:r>
+        <w:t xml:space="preserve">Contador público, asesor tributario, o gestor tributario de contribuyente alguno.</w:t>
+      </w:r>
+    </w:p>
+    <w:p>
+      <w:pPr>
+        <w:pStyle w:val="Compact"/>
+        <w:numPr>
+          <w:ilvl w:val="0"/>
+          <w:numId w:val="1002"/>
+        </w:numPr>
+      </w:pPr>
+      <w:r>
+        <w:t xml:space="preserve">Abogado, asesor legal, o intérprete de disposiciones normativas tributarias.</w:t>
+      </w:r>
+    </w:p>
+    <w:p>
+      <w:pPr>
+        <w:pStyle w:val="Compact"/>
+        <w:numPr>
+          <w:ilvl w:val="0"/>
+          <w:numId w:val="1002"/>
+        </w:numPr>
+      </w:pPr>
+      <w:r>
+        <w:t xml:space="preserve">Validador, auditor, o certificador de exactitud, legalidad, o conformidad tributaria de documentos.</w:t>
+      </w:r>
+    </w:p>
+    <w:p>
+      <w:pPr>
+        <w:pStyle w:val="Compact"/>
+        <w:numPr>
+          <w:ilvl w:val="0"/>
+          <w:numId w:val="1002"/>
+        </w:numPr>
+      </w:pPr>
+      <w:r>
+        <w:t xml:space="preserve">Responsable ante DIAN por datos, cálculos, cumplimiento de obligaciones o actos del Cliente.</w:t>
+      </w:r>
+    </w:p>
+    <w:p>
+      <w:pPr>
+        <w:pStyle w:val="FirstParagraph"/>
+      </w:pPr>
+      <w:r>
+        <w:rPr>
+          <w:b/>
+          <w:bCs/>
+        </w:rPr>
+        <w:t xml:space="preserve">Responsabilidad del Cliente — Cláusula Asignadora:</w:t>
+      </w:r>
+    </w:p>
+    <w:p>
+      <w:pPr>
+        <w:pStyle w:val="BodyText"/>
+      </w:pPr>
+      <w:r>
+        <w:t xml:space="preserve">El Cliente, en su calidad de</w:t>
+      </w:r>
+      <w:r>
+        <w:t xml:space="preserve"> </w:t>
+      </w:r>
+      <w:r>
+        <w:rPr>
+          <w:b/>
+          <w:bCs/>
+        </w:rPr>
+        <w:t xml:space="preserve">contribuyente responsable ante DIAN</w:t>
+      </w:r>
+      <w:r>
+        <w:t xml:space="preserve">, asume la responsabilidad intransferible de:</w:t>
+      </w:r>
+    </w:p>
+    <w:p>
+      <w:pPr>
+        <w:pStyle w:val="Compact"/>
+        <w:numPr>
+          <w:ilvl w:val="0"/>
+          <w:numId w:val="1003"/>
+        </w:numPr>
+      </w:pPr>
+      <w:r>
+        <w:t xml:space="preserve">Validación integral de datos: razón social, NIT, datos de terceros, valores, impuestos, cálculos conforme normas DIAN.</w:t>
+      </w:r>
+    </w:p>
+    <w:p>
+      <w:pPr>
+        <w:pStyle w:val="Compact"/>
+        <w:numPr>
+          <w:ilvl w:val="0"/>
+          <w:numId w:val="1003"/>
+        </w:numPr>
+      </w:pPr>
+      <w:r>
+        <w:t xml:space="preserve">Cumplimiento de obligaciones tributarias: declaraciones ante DIAN, pago de impuestos, cargas de rangos, solicitud de habilitaciones, procedimientos administrativos.</w:t>
+      </w:r>
+    </w:p>
+    <w:p>
+      <w:pPr>
+        <w:pStyle w:val="Compact"/>
+        <w:numPr>
+          <w:ilvl w:val="0"/>
+          <w:numId w:val="1003"/>
+        </w:numPr>
+      </w:pPr>
+      <w:r>
+        <w:t xml:space="preserve">Legalidad de documentos emitidos: exactitud de información, cumplimiento tributario, ausencia de fraude o incumplimiento conforme normas vigentes.</w:t>
+      </w:r>
+    </w:p>
+    <w:p>
+      <w:pPr>
+        <w:pStyle w:val="FirstParagraph"/>
+      </w:pPr>
+      <w:r>
+        <w:rPr>
+          <w:b/>
+          <w:bCs/>
+        </w:rPr>
+        <w:t xml:space="preserve">Consecuencia de Incumplimiento — Cláusula Asunción de Riesgos:</w:t>
+      </w:r>
+    </w:p>
+    <w:p>
+      <w:pPr>
+        <w:pStyle w:val="BodyText"/>
+      </w:pPr>
+      <w:r>
+        <w:t xml:space="preserve">Incumplimiento de obligaciones tributarias por parte del Cliente resulta en responsabilidad tributaria, administrativa y penal del Cliente ante DIAN y autoridades competentes. FACTUS no asume, no es responsable de, y no indemniza por multas, sanciones, intereses de mora, o consecuencias derivadas de incumplimiento tributario del Cliente.</w:t>
       </w:r>
     </w:p>
     <w:p>
@@ -282,7 +477,7 @@
         <w:t xml:space="preserve"> </w:t>
       </w:r>
       <w:r>
-        <w:t xml:space="preserve">www.factus.com.co (o URL del reseller)</w:t>
+        <w:t xml:space="preserve">www.factus.com.co</w:t>
       </w:r>
       <w:r>
         <w:br/>
@@ -308,22 +503,6 @@
           <w:b/>
           <w:bCs/>
         </w:rPr>
-        <w:t xml:space="preserve">Teléfono:</w:t>
-      </w:r>
-      <w:r>
-        <w:t xml:space="preserve"> </w:t>
-      </w:r>
-      <w:r>
-        <w:t xml:space="preserve">[número vigente]</w:t>
-      </w:r>
-      <w:r>
-        <w:br/>
-      </w:r>
-      <w:r>
-        <w:rPr>
-          <w:b/>
-          <w:bCs/>
-        </w:rPr>
         <w:t xml:space="preserve">Horarios de atención:</w:t>
       </w:r>
       <w:r>
@@ -362,7 +541,7 @@
         <w:pStyle w:val="Compact"/>
         <w:numPr>
           <w:ilvl w:val="0"/>
-          <w:numId w:val="1001"/>
+          <w:numId w:val="1004"/>
         </w:numPr>
       </w:pPr>
       <w:r>
@@ -374,7 +553,7 @@
         <w:pStyle w:val="Compact"/>
         <w:numPr>
           <w:ilvl w:val="0"/>
-          <w:numId w:val="1001"/>
+          <w:numId w:val="1004"/>
         </w:numPr>
       </w:pPr>
       <w:r>
@@ -386,7 +565,7 @@
         <w:pStyle w:val="Compact"/>
         <w:numPr>
           <w:ilvl w:val="0"/>
-          <w:numId w:val="1001"/>
+          <w:numId w:val="1004"/>
         </w:numPr>
       </w:pPr>
       <w:r>
@@ -410,7 +589,7 @@
         <w:pStyle w:val="Compact"/>
         <w:numPr>
           <w:ilvl w:val="0"/>
-          <w:numId w:val="1002"/>
+          <w:numId w:val="1005"/>
         </w:numPr>
       </w:pPr>
       <w:r>
@@ -432,7 +611,7 @@
         <w:pStyle w:val="Compact"/>
         <w:numPr>
           <w:ilvl w:val="0"/>
-          <w:numId w:val="1002"/>
+          <w:numId w:val="1005"/>
         </w:numPr>
       </w:pPr>
       <w:r>
@@ -454,7 +633,7 @@
         <w:pStyle w:val="Compact"/>
         <w:numPr>
           <w:ilvl w:val="0"/>
-          <w:numId w:val="1002"/>
+          <w:numId w:val="1005"/>
         </w:numPr>
       </w:pPr>
       <w:r>
@@ -476,7 +655,7 @@
         <w:pStyle w:val="Compact"/>
         <w:numPr>
           <w:ilvl w:val="0"/>
-          <w:numId w:val="1002"/>
+          <w:numId w:val="1005"/>
         </w:numPr>
       </w:pPr>
       <w:r>
@@ -539,7 +718,7 @@
         <w:pStyle w:val="Compact"/>
         <w:numPr>
           <w:ilvl w:val="0"/>
-          <w:numId w:val="1003"/>
+          <w:numId w:val="1006"/>
         </w:numPr>
       </w:pPr>
       <w:r>
@@ -561,7 +740,7 @@
         <w:pStyle w:val="Compact"/>
         <w:numPr>
           <w:ilvl w:val="0"/>
-          <w:numId w:val="1003"/>
+          <w:numId w:val="1006"/>
         </w:numPr>
       </w:pPr>
       <w:r>
@@ -583,7 +762,7 @@
         <w:pStyle w:val="Compact"/>
         <w:numPr>
           <w:ilvl w:val="0"/>
-          <w:numId w:val="1003"/>
+          <w:numId w:val="1006"/>
         </w:numPr>
       </w:pPr>
       <w:r>
@@ -605,7 +784,7 @@
         <w:pStyle w:val="Compact"/>
         <w:numPr>
           <w:ilvl w:val="0"/>
-          <w:numId w:val="1003"/>
+          <w:numId w:val="1006"/>
         </w:numPr>
       </w:pPr>
       <w:r>
@@ -627,7 +806,7 @@
         <w:pStyle w:val="Compact"/>
         <w:numPr>
           <w:ilvl w:val="0"/>
-          <w:numId w:val="1003"/>
+          <w:numId w:val="1006"/>
         </w:numPr>
       </w:pPr>
       <w:r>
@@ -667,7 +846,7 @@
         <w:pStyle w:val="Compact"/>
         <w:numPr>
           <w:ilvl w:val="0"/>
-          <w:numId w:val="1004"/>
+          <w:numId w:val="1007"/>
         </w:numPr>
       </w:pPr>
       <w:r>
@@ -689,7 +868,7 @@
         <w:pStyle w:val="Compact"/>
         <w:numPr>
           <w:ilvl w:val="0"/>
-          <w:numId w:val="1004"/>
+          <w:numId w:val="1007"/>
         </w:numPr>
       </w:pPr>
       <w:r>
@@ -711,7 +890,7 @@
         <w:pStyle w:val="Compact"/>
         <w:numPr>
           <w:ilvl w:val="0"/>
-          <w:numId w:val="1004"/>
+          <w:numId w:val="1007"/>
         </w:numPr>
       </w:pPr>
       <w:r>
@@ -751,7 +930,7 @@
         <w:pStyle w:val="Compact"/>
         <w:numPr>
           <w:ilvl w:val="0"/>
-          <w:numId w:val="1005"/>
+          <w:numId w:val="1008"/>
         </w:numPr>
       </w:pPr>
       <w:r>
@@ -763,7 +942,7 @@
         <w:pStyle w:val="Compact"/>
         <w:numPr>
           <w:ilvl w:val="0"/>
-          <w:numId w:val="1005"/>
+          <w:numId w:val="1008"/>
         </w:numPr>
       </w:pPr>
       <w:r>
@@ -775,7 +954,7 @@
         <w:pStyle w:val="Compact"/>
         <w:numPr>
           <w:ilvl w:val="0"/>
-          <w:numId w:val="1005"/>
+          <w:numId w:val="1008"/>
         </w:numPr>
       </w:pPr>
       <w:r>
@@ -787,7 +966,7 @@
         <w:pStyle w:val="Compact"/>
         <w:numPr>
           <w:ilvl w:val="0"/>
-          <w:numId w:val="1005"/>
+          <w:numId w:val="1008"/>
         </w:numPr>
       </w:pPr>
       <w:r>
@@ -818,13 +997,13 @@
       </w:r>
     </w:p>
     <w:bookmarkEnd w:id="916"/>
-    <w:bookmarkStart w:id="917" w:name="condiciones-de-acceso-y-aceptación"/>
+    <w:bookmarkStart w:id="917" w:name="X4808db67b92cbed09b7d7853fc97b5e4d03dd73"/>
     <w:p>
       <w:pPr>
         <w:pStyle w:val="Heading1"/>
       </w:pPr>
       <w:r>
-        <w:t xml:space="preserve">3. Condiciones de Acceso y Aceptación</w:t>
+        <w:t xml:space="preserve">3. Condiciones de Acceso — Capacidad y Requisitos Habilitantes</w:t>
       </w:r>
     </w:p>
     <w:p>
@@ -842,13 +1021,49 @@
           <w:b/>
           <w:bCs/>
         </w:rPr>
-        <w:t xml:space="preserve">Aceptación de TyC:</w:t>
-      </w:r>
-      <w:r>
-        <w:t xml:space="preserve"> </w:t>
-      </w:r>
-      <w:r>
-        <w:t xml:space="preserve">Al hacer clic en</w:t>
+        <w:t xml:space="preserve">Consentimiento Informado y Aceptación Vinculante:</w:t>
+      </w:r>
+    </w:p>
+    <w:p>
+      <w:pPr>
+        <w:pStyle w:val="BodyText"/>
+      </w:pPr>
+      <w:r>
+        <w:t xml:space="preserve">La aceptación de estos TyC constituye manifestación de voluntad libre, informada y consciente del Cliente de vincularse a los términos, condiciones, obligaciones, limitaciones de responsabilidad, y exclusiones contenidas en este instrumento. La aceptación genera obligaciones exigibles conforme derecho civil colombiano (Código Civil, arts. 1506-1545).</w:t>
+      </w:r>
+    </w:p>
+    <w:p>
+      <w:pPr>
+        <w:pStyle w:val="BodyText"/>
+      </w:pPr>
+      <w:r>
+        <w:rPr>
+          <w:b/>
+          <w:bCs/>
+        </w:rPr>
+        <w:t xml:space="preserve">Modalidades de Aceptación:</w:t>
+      </w:r>
+    </w:p>
+    <w:p>
+      <w:pPr>
+        <w:pStyle w:val="Compact"/>
+        <w:numPr>
+          <w:ilvl w:val="0"/>
+          <w:numId w:val="1009"/>
+        </w:numPr>
+      </w:pPr>
+      <w:r>
+        <w:rPr>
+          <w:b/>
+          <w:bCs/>
+        </w:rPr>
+        <w:t xml:space="preserve">(a) Forma Electrónica:</w:t>
+      </w:r>
+      <w:r>
+        <w:t xml:space="preserve"> </w:t>
+      </w:r>
+      <w:r>
+        <w:t xml:space="preserve">Clic en botón</w:t>
       </w:r>
       <w:r>
         <w:t xml:space="preserve"> </w:t>
@@ -860,7 +1075,47 @@
         <w:t xml:space="preserve"> </w:t>
       </w:r>
       <w:r>
-        <w:t xml:space="preserve">o usar la plataforma, aceptas completamente estos Términos y Condiciones. Si no aceptas, no puedes usar el servicio.</w:t>
+        <w:t xml:space="preserve">tras presentación en pantalla de íntegra de estos TyC, con checkbox de confirmación explícita.</w:t>
+      </w:r>
+    </w:p>
+    <w:p>
+      <w:pPr>
+        <w:pStyle w:val="Compact"/>
+        <w:numPr>
+          <w:ilvl w:val="0"/>
+          <w:numId w:val="1009"/>
+        </w:numPr>
+      </w:pPr>
+      <w:r>
+        <w:rPr>
+          <w:b/>
+          <w:bCs/>
+        </w:rPr>
+        <w:t xml:space="preserve">(b) Uso de Plataforma:</w:t>
+      </w:r>
+      <w:r>
+        <w:t xml:space="preserve"> </w:t>
+      </w:r>
+      <w:r>
+        <w:t xml:space="preserve">Ingreso de credenciales y utilización de servicios postfirma electrónica constituye aceptación tácita.</w:t>
+      </w:r>
+    </w:p>
+    <w:p>
+      <w:pPr>
+        <w:pStyle w:val="FirstParagraph"/>
+      </w:pPr>
+      <w:r>
+        <w:rPr>
+          <w:b/>
+          <w:bCs/>
+        </w:rPr>
+        <w:t xml:space="preserve">Efecto:</w:t>
+      </w:r>
+      <w:r>
+        <w:t xml:space="preserve"> </w:t>
+      </w:r>
+      <w:r>
+        <w:t xml:space="preserve">Aceptación genera contrato vinculante entre FACTUS y Cliente. Negación posterior de aceptación no es procedente si Cliente ejerció acciones en plataforma (emisiones, consultas, descargas).</w:t>
       </w:r>
     </w:p>
     <w:p>
@@ -878,67 +1133,147 @@
           <w:b/>
           <w:bCs/>
         </w:rPr>
-        <w:t xml:space="preserve">Requisitos para Contratar:</w:t>
-      </w:r>
-    </w:p>
-    <w:p>
-      <w:pPr>
-        <w:pStyle w:val="Compact"/>
-        <w:numPr>
-          <w:ilvl w:val="0"/>
-          <w:numId w:val="1006"/>
-        </w:numPr>
-      </w:pPr>
-      <w:r>
-        <w:t xml:space="preserve">Ser empresa o persona natural inscrita en el RUT de la DIAN.</w:t>
-      </w:r>
-    </w:p>
-    <w:p>
-      <w:pPr>
-        <w:pStyle w:val="Compact"/>
-        <w:numPr>
-          <w:ilvl w:val="0"/>
-          <w:numId w:val="1006"/>
-        </w:numPr>
-      </w:pPr>
-      <w:r>
-        <w:t xml:space="preserve">Tener Número de Identificación Tributaria (NIT) vigente.</w:t>
-      </w:r>
-    </w:p>
-    <w:p>
-      <w:pPr>
-        <w:pStyle w:val="Compact"/>
-        <w:numPr>
-          <w:ilvl w:val="0"/>
-          <w:numId w:val="1006"/>
-        </w:numPr>
-      </w:pPr>
-      <w:r>
-        <w:t xml:space="preserve">Tener autorización de rango de numeración ante la DIAN (si aplica).</w:t>
-      </w:r>
-    </w:p>
-    <w:p>
-      <w:pPr>
-        <w:pStyle w:val="Compact"/>
-        <w:numPr>
-          <w:ilvl w:val="0"/>
-          <w:numId w:val="1006"/>
-        </w:numPr>
-      </w:pPr>
-      <w:r>
-        <w:t xml:space="preserve">No estar incluido en listas de lavado de activos, financiación del terrorismo, o PEP (Persona Políticamente Expuesta).</w:t>
-      </w:r>
-    </w:p>
-    <w:p>
-      <w:pPr>
-        <w:pStyle w:val="Compact"/>
-        <w:numPr>
-          <w:ilvl w:val="0"/>
-          <w:numId w:val="1006"/>
-        </w:numPr>
-      </w:pPr>
-      <w:r>
-        <w:t xml:space="preserve">Cumplir con legislación tributaria vigente.</w:t>
+        <w:t xml:space="preserve">Requisitos Habilitantes — Capacidad Jurídica:</w:t>
+      </w:r>
+    </w:p>
+    <w:p>
+      <w:pPr>
+        <w:pStyle w:val="BodyText"/>
+      </w:pPr>
+      <w:r>
+        <w:t xml:space="preserve">Para acceder a servicios de FACTUS, Cliente debe cumplir:</w:t>
+      </w:r>
+    </w:p>
+    <w:p>
+      <w:pPr>
+        <w:pStyle w:val="Compact"/>
+        <w:numPr>
+          <w:ilvl w:val="0"/>
+          <w:numId w:val="1010"/>
+        </w:numPr>
+      </w:pPr>
+      <w:r>
+        <w:rPr>
+          <w:b/>
+          <w:bCs/>
+        </w:rPr>
+        <w:t xml:space="preserve">Capacidad Legal:</w:t>
+      </w:r>
+      <w:r>
+        <w:t xml:space="preserve"> </w:t>
+      </w:r>
+      <w:r>
+        <w:t xml:space="preserve">Ser persona natural mayor de dieciocho (18) años, o persona jurídica constituida conforme leyes colombianas, con capacidad legal plena para contratar.</w:t>
+      </w:r>
+    </w:p>
+    <w:p>
+      <w:pPr>
+        <w:pStyle w:val="Compact"/>
+        <w:numPr>
+          <w:ilvl w:val="0"/>
+          <w:numId w:val="1010"/>
+        </w:numPr>
+      </w:pPr>
+      <w:r>
+        <w:rPr>
+          <w:b/>
+          <w:bCs/>
+        </w:rPr>
+        <w:t xml:space="preserve">Inscripción Tributaria:</w:t>
+      </w:r>
+      <w:r>
+        <w:t xml:space="preserve"> </w:t>
+      </w:r>
+      <w:r>
+        <w:t xml:space="preserve">Estar inscrito en el Registro Único Tributario (RUT) ante DIAN con estado de inscripción vigente (no cancelado, suspendido, o incapacitado).</w:t>
+      </w:r>
+    </w:p>
+    <w:p>
+      <w:pPr>
+        <w:pStyle w:val="Compact"/>
+        <w:numPr>
+          <w:ilvl w:val="0"/>
+          <w:numId w:val="1010"/>
+        </w:numPr>
+      </w:pPr>
+      <w:r>
+        <w:rPr>
+          <w:b/>
+          <w:bCs/>
+        </w:rPr>
+        <w:t xml:space="preserve">NIT Vigente:</w:t>
+      </w:r>
+      <w:r>
+        <w:t xml:space="preserve"> </w:t>
+      </w:r>
+      <w:r>
+        <w:t xml:space="preserve">Poseer Número de Identificación Tributaria (NIT) válido, vigente, y en estado de cumplimiento ante DIAN.</w:t>
+      </w:r>
+    </w:p>
+    <w:p>
+      <w:pPr>
+        <w:pStyle w:val="Compact"/>
+        <w:numPr>
+          <w:ilvl w:val="0"/>
+          <w:numId w:val="1010"/>
+        </w:numPr>
+      </w:pPr>
+      <w:r>
+        <w:rPr>
+          <w:b/>
+          <w:bCs/>
+        </w:rPr>
+        <w:t xml:space="preserve">Rangos de Numeración Autorizados:</w:t>
+      </w:r>
+      <w:r>
+        <w:t xml:space="preserve"> </w:t>
+      </w:r>
+      <w:r>
+        <w:t xml:space="preserve">Contar con autorización de rangos de numeración de documentos ante DIAN conforme Resoluciones vigentes (aplica para emisión de facturación electrónica).</w:t>
+      </w:r>
+    </w:p>
+    <w:p>
+      <w:pPr>
+        <w:pStyle w:val="Compact"/>
+        <w:numPr>
+          <w:ilvl w:val="0"/>
+          <w:numId w:val="1010"/>
+        </w:numPr>
+      </w:pPr>
+      <w:r>
+        <w:rPr>
+          <w:b/>
+          <w:bCs/>
+        </w:rPr>
+        <w:t xml:space="preserve">Ausencia de Restricciones Legales:</w:t>
+      </w:r>
+      <w:r>
+        <w:t xml:space="preserve"> </w:t>
+      </w:r>
+      <w:r>
+        <w:t xml:space="preserve">No estar incurso en causal de incapacidad legal conforme Código Civil (demencia, prodigalidad, sordomudez sin instrucción, ausencia).</w:t>
+      </w:r>
+    </w:p>
+    <w:p>
+      <w:pPr>
+        <w:pStyle w:val="Compact"/>
+        <w:numPr>
+          <w:ilvl w:val="0"/>
+          <w:numId w:val="1010"/>
+        </w:numPr>
+      </w:pPr>
+      <w:r>
+        <w:rPr>
+          <w:b/>
+          <w:bCs/>
+        </w:rPr>
+        <w:t xml:space="preserve">Cumplimiento de Prevención de Lavado de Activos:</w:t>
+      </w:r>
+      <w:r>
+        <w:t xml:space="preserve"> </w:t>
+      </w:r>
+      <w:r>
+        <w:t xml:space="preserve">No estar incluido en listas de Personas Políticamente Expuestas (PEP) conforme Unidad de Información Financiera (UIF); no tener antecedentes de vinculación con operaciones de lavado de activos o financiamiento del terrorismo.</w:t>
       </w:r>
     </w:p>
     <w:p>
@@ -956,13 +1291,7 @@
           <w:b/>
           <w:bCs/>
         </w:rPr>
-        <w:t xml:space="preserve">Verificación Identidad:</w:t>
-      </w:r>
-      <w:r>
-        <w:t xml:space="preserve"> </w:t>
-      </w:r>
-      <w:r>
-        <w:t xml:space="preserve">FACTUS se reserva derecho de solicitar documentos de verificación (RUT, Certificado de Existencia y Representación Legal, cédula de representante, etc.) conforme obligaciones de prevención de lavado de activos (Ley 1960 de 2019).</w:t>
+        <w:t xml:space="preserve">Diligencia Debida y Verificación de Identidad:</w:t>
       </w:r>
     </w:p>
     <w:p>
@@ -970,6 +1299,66 @@
         <w:pStyle w:val="BodyText"/>
       </w:pPr>
       <w:r>
+        <w:t xml:space="preserve">FACTUS, en cumplimiento de obligaciones de debida diligencia (due diligence) conforme</w:t>
+      </w:r>
+      <w:r>
+        <w:t xml:space="preserve"> </w:t>
+      </w:r>
+      <w:r>
+        <w:rPr>
+          <w:b/>
+          <w:bCs/>
+        </w:rPr>
+        <w:t xml:space="preserve">Ley 1960 de 2019</w:t>
+      </w:r>
+      <w:r>
+        <w:t xml:space="preserve"> </w:t>
+      </w:r>
+      <w:r>
+        <w:t xml:space="preserve">(Prevención de Lavado de Activos) y regulaciones de la Superintendencia Financiera, se reserva derecho de:</w:t>
+      </w:r>
+    </w:p>
+    <w:p>
+      <w:pPr>
+        <w:pStyle w:val="Compact"/>
+        <w:numPr>
+          <w:ilvl w:val="0"/>
+          <w:numId w:val="1011"/>
+        </w:numPr>
+      </w:pPr>
+      <w:r>
+        <w:t xml:space="preserve">Solicitar y validar documentos de identificación: Registro Único Tributario (RUT), Certificado de Existencia y Representación Legal (para personas jurídicas), cédula de identidad del representante legal.</w:t>
+      </w:r>
+    </w:p>
+    <w:p>
+      <w:pPr>
+        <w:pStyle w:val="Compact"/>
+        <w:numPr>
+          <w:ilvl w:val="0"/>
+          <w:numId w:val="1011"/>
+        </w:numPr>
+      </w:pPr>
+      <w:r>
+        <w:t xml:space="preserve">Realizar consultas en bases de datos de autoridades competentes (UIF, DIAN, Procuraduría, Fiscalía).</w:t>
+      </w:r>
+    </w:p>
+    <w:p>
+      <w:pPr>
+        <w:pStyle w:val="Compact"/>
+        <w:numPr>
+          <w:ilvl w:val="0"/>
+          <w:numId w:val="1011"/>
+        </w:numPr>
+      </w:pPr>
+      <w:r>
+        <w:t xml:space="preserve">Suspender acceso de forma temporal o definitiva si información proporcionada es falsa, incompleta, o si Cliente resulta incurso en restricción legal.</w:t>
+      </w:r>
+    </w:p>
+    <w:p>
+      <w:pPr>
+        <w:pStyle w:val="FirstParagraph"/>
+      </w:pPr>
+      <w:r>
         <w:t xml:space="preserve">3.4</w:t>
       </w:r>
       <w:r>
@@ -980,13 +1369,79 @@
           <w:b/>
           <w:bCs/>
         </w:rPr>
-        <w:t xml:space="preserve">Menores de Edad:</w:t>
-      </w:r>
-      <w:r>
-        <w:t xml:space="preserve"> </w:t>
-      </w:r>
-      <w:r>
-        <w:t xml:space="preserve">No está permitido a menores de 18 años contratar. Acceso es solo para personas con capacidad legal.</w:t>
+        <w:t xml:space="preserve">Exclusión por Incapacidad — Cláusula de Cesación de Acceso:</w:t>
+      </w:r>
+    </w:p>
+    <w:p>
+      <w:pPr>
+        <w:pStyle w:val="BodyText"/>
+      </w:pPr>
+      <w:r>
+        <w:t xml:space="preserve">FACTUS puede</w:t>
+      </w:r>
+      <w:r>
+        <w:t xml:space="preserve"> </w:t>
+      </w:r>
+      <w:r>
+        <w:rPr>
+          <w:b/>
+          <w:bCs/>
+        </w:rPr>
+        <w:t xml:space="preserve">rechazar, suspender, o terminar acceso</w:t>
+      </w:r>
+      <w:r>
+        <w:t xml:space="preserve"> </w:t>
+      </w:r>
+      <w:r>
+        <w:t xml:space="preserve">sin necesidad de aviso previo a Cliente que:</w:t>
+      </w:r>
+    </w:p>
+    <w:p>
+      <w:pPr>
+        <w:pStyle w:val="Compact"/>
+        <w:numPr>
+          <w:ilvl w:val="0"/>
+          <w:numId w:val="1012"/>
+        </w:numPr>
+      </w:pPr>
+      <w:r>
+        <w:t xml:space="preserve">Sea menor de edad o incapaz conforme ley.</w:t>
+      </w:r>
+    </w:p>
+    <w:p>
+      <w:pPr>
+        <w:pStyle w:val="Compact"/>
+        <w:numPr>
+          <w:ilvl w:val="0"/>
+          <w:numId w:val="1012"/>
+        </w:numPr>
+      </w:pPr>
+      <w:r>
+        <w:t xml:space="preserve">Esté incurso en causal de inhabilitación legal (antecedentes penales por fraude tributario, tesorería, terrorismo; insolvencia conforme ley de insolvencia; inhabilitación profesional).</w:t>
+      </w:r>
+    </w:p>
+    <w:p>
+      <w:pPr>
+        <w:pStyle w:val="Compact"/>
+        <w:numPr>
+          <w:ilvl w:val="0"/>
+          <w:numId w:val="1012"/>
+        </w:numPr>
+      </w:pPr>
+      <w:r>
+        <w:t xml:space="preserve">Presente indicios de vinculación con operaciones de lavado de activos, financiamiento del terrorismo, o incumplimiento de normas de prevención (Ley 1960/2019).</w:t>
+      </w:r>
+    </w:p>
+    <w:p>
+      <w:pPr>
+        <w:pStyle w:val="Compact"/>
+        <w:numPr>
+          <w:ilvl w:val="0"/>
+          <w:numId w:val="1012"/>
+        </w:numPr>
+      </w:pPr>
+      <w:r>
+        <w:t xml:space="preserve">Haya proporcionado información falsa en proceso de verificación.</w:t>
       </w:r>
     </w:p>
     <w:p>
@@ -1029,7 +1484,7 @@
         <w:pStyle w:val="Compact"/>
         <w:numPr>
           <w:ilvl w:val="0"/>
-          <w:numId w:val="1007"/>
+          <w:numId w:val="1013"/>
         </w:numPr>
       </w:pPr>
       <w:r>
@@ -1041,7 +1496,7 @@
         <w:pStyle w:val="Compact"/>
         <w:numPr>
           <w:ilvl w:val="0"/>
-          <w:numId w:val="1007"/>
+          <w:numId w:val="1013"/>
         </w:numPr>
       </w:pPr>
       <w:r>
@@ -1053,7 +1508,7 @@
         <w:pStyle w:val="Compact"/>
         <w:numPr>
           <w:ilvl w:val="0"/>
-          <w:numId w:val="1007"/>
+          <w:numId w:val="1013"/>
         </w:numPr>
       </w:pPr>
       <w:r>
@@ -1083,7 +1538,7 @@
         <w:pStyle w:val="Compact"/>
         <w:numPr>
           <w:ilvl w:val="0"/>
-          <w:numId w:val="1008"/>
+          <w:numId w:val="1014"/>
         </w:numPr>
       </w:pPr>
       <w:r>
@@ -1111,7 +1566,7 @@
         <w:pStyle w:val="Compact"/>
         <w:numPr>
           <w:ilvl w:val="0"/>
-          <w:numId w:val="1008"/>
+          <w:numId w:val="1014"/>
         </w:numPr>
       </w:pPr>
       <w:r>
@@ -1127,7 +1582,7 @@
         <w:pStyle w:val="Compact"/>
         <w:numPr>
           <w:ilvl w:val="0"/>
-          <w:numId w:val="1008"/>
+          <w:numId w:val="1014"/>
         </w:numPr>
       </w:pPr>
       <w:r>
@@ -1167,7 +1622,7 @@
         <w:pStyle w:val="Compact"/>
         <w:numPr>
           <w:ilvl w:val="0"/>
-          <w:numId w:val="1009"/>
+          <w:numId w:val="1015"/>
         </w:numPr>
       </w:pPr>
       <w:r>
@@ -1179,7 +1634,7 @@
         <w:pStyle w:val="Compact"/>
         <w:numPr>
           <w:ilvl w:val="0"/>
-          <w:numId w:val="1009"/>
+          <w:numId w:val="1015"/>
         </w:numPr>
       </w:pPr>
       <w:r>
@@ -1191,7 +1646,7 @@
         <w:pStyle w:val="Compact"/>
         <w:numPr>
           <w:ilvl w:val="0"/>
-          <w:numId w:val="1009"/>
+          <w:numId w:val="1015"/>
         </w:numPr>
       </w:pPr>
       <w:r>
@@ -1221,7 +1676,7 @@
         <w:pStyle w:val="Compact"/>
         <w:numPr>
           <w:ilvl w:val="0"/>
-          <w:numId w:val="1010"/>
+          <w:numId w:val="1016"/>
         </w:numPr>
       </w:pPr>
       <w:r>
@@ -1233,7 +1688,7 @@
         <w:pStyle w:val="Compact"/>
         <w:numPr>
           <w:ilvl w:val="0"/>
-          <w:numId w:val="1010"/>
+          <w:numId w:val="1016"/>
         </w:numPr>
       </w:pPr>
       <w:r>
@@ -1245,7 +1700,7 @@
         <w:pStyle w:val="Compact"/>
         <w:numPr>
           <w:ilvl w:val="0"/>
-          <w:numId w:val="1010"/>
+          <w:numId w:val="1016"/>
         </w:numPr>
       </w:pPr>
       <w:r>
@@ -1257,7 +1712,7 @@
         <w:pStyle w:val="Compact"/>
         <w:numPr>
           <w:ilvl w:val="0"/>
-          <w:numId w:val="1010"/>
+          <w:numId w:val="1016"/>
         </w:numPr>
       </w:pPr>
       <w:r>
@@ -1294,7 +1749,7 @@
         <w:pStyle w:val="Compact"/>
         <w:numPr>
           <w:ilvl w:val="0"/>
-          <w:numId w:val="1011"/>
+          <w:numId w:val="1017"/>
         </w:numPr>
       </w:pPr>
       <w:r>
@@ -1306,7 +1761,7 @@
         <w:pStyle w:val="Compact"/>
         <w:numPr>
           <w:ilvl w:val="0"/>
-          <w:numId w:val="1011"/>
+          <w:numId w:val="1017"/>
         </w:numPr>
       </w:pPr>
       <w:r>
@@ -1318,7 +1773,7 @@
         <w:pStyle w:val="Compact"/>
         <w:numPr>
           <w:ilvl w:val="0"/>
-          <w:numId w:val="1011"/>
+          <w:numId w:val="1017"/>
         </w:numPr>
       </w:pPr>
       <w:r>
@@ -1330,7 +1785,7 @@
         <w:pStyle w:val="Compact"/>
         <w:numPr>
           <w:ilvl w:val="0"/>
-          <w:numId w:val="1011"/>
+          <w:numId w:val="1017"/>
         </w:numPr>
       </w:pPr>
       <w:r>
@@ -1342,7 +1797,7 @@
         <w:pStyle w:val="Compact"/>
         <w:numPr>
           <w:ilvl w:val="0"/>
-          <w:numId w:val="1011"/>
+          <w:numId w:val="1017"/>
         </w:numPr>
       </w:pPr>
       <w:r>
@@ -1354,7 +1809,7 @@
         <w:pStyle w:val="Compact"/>
         <w:numPr>
           <w:ilvl w:val="0"/>
-          <w:numId w:val="1011"/>
+          <w:numId w:val="1017"/>
         </w:numPr>
       </w:pPr>
       <w:r>
@@ -1366,7 +1821,7 @@
         <w:pStyle w:val="Compact"/>
         <w:numPr>
           <w:ilvl w:val="0"/>
-          <w:numId w:val="1011"/>
+          <w:numId w:val="1017"/>
         </w:numPr>
       </w:pPr>
       <w:r>
@@ -1378,7 +1833,7 @@
         <w:pStyle w:val="Compact"/>
         <w:numPr>
           <w:ilvl w:val="0"/>
-          <w:numId w:val="1011"/>
+          <w:numId w:val="1017"/>
         </w:numPr>
       </w:pPr>
       <w:r>
@@ -1414,7 +1869,7 @@
         <w:pStyle w:val="Compact"/>
         <w:numPr>
           <w:ilvl w:val="0"/>
-          <w:numId w:val="1012"/>
+          <w:numId w:val="1018"/>
         </w:numPr>
       </w:pPr>
       <w:r>
@@ -1426,7 +1881,7 @@
         <w:pStyle w:val="Compact"/>
         <w:numPr>
           <w:ilvl w:val="0"/>
-          <w:numId w:val="1012"/>
+          <w:numId w:val="1018"/>
         </w:numPr>
       </w:pPr>
       <w:r>
@@ -1438,7 +1893,7 @@
         <w:pStyle w:val="Compact"/>
         <w:numPr>
           <w:ilvl w:val="0"/>
-          <w:numId w:val="1012"/>
+          <w:numId w:val="1018"/>
         </w:numPr>
       </w:pPr>
       <w:r>
@@ -1450,7 +1905,7 @@
         <w:pStyle w:val="Compact"/>
         <w:numPr>
           <w:ilvl w:val="0"/>
-          <w:numId w:val="1012"/>
+          <w:numId w:val="1018"/>
         </w:numPr>
       </w:pPr>
       <w:r>
@@ -1462,7 +1917,7 @@
         <w:pStyle w:val="Compact"/>
         <w:numPr>
           <w:ilvl w:val="0"/>
-          <w:numId w:val="1012"/>
+          <w:numId w:val="1018"/>
         </w:numPr>
       </w:pPr>
       <w:r>
@@ -1484,11 +1939,13 @@
           <w:b/>
           <w:bCs/>
         </w:rPr>
-        <w:t xml:space="preserve">Validación Propios Datos:</w:t>
-      </w:r>
-      <w:r>
-        <w:t xml:space="preserve"> </w:t>
-      </w:r>
+        <w:t xml:space="preserve">Validación y Certificación de Datos — Responsabilidad Integral del Cliente:</w:t>
+      </w:r>
+    </w:p>
+    <w:p>
+      <w:pPr>
+        <w:pStyle w:val="BodyText"/>
+      </w:pPr>
       <w:r>
         <w:t xml:space="preserve">El Cliente es</w:t>
       </w:r>
@@ -1500,61 +1957,232 @@
           <w:b/>
           <w:bCs/>
         </w:rPr>
-        <w:t xml:space="preserve">único responsable</w:t>
-      </w:r>
-      <w:r>
-        <w:t xml:space="preserve"> </w:t>
-      </w:r>
-      <w:r>
-        <w:t xml:space="preserve">de validar que:</w:t>
-      </w:r>
-    </w:p>
-    <w:p>
-      <w:pPr>
-        <w:pStyle w:val="Compact"/>
-        <w:numPr>
-          <w:ilvl w:val="0"/>
-          <w:numId w:val="1013"/>
-        </w:numPr>
-      </w:pPr>
-      <w:r>
-        <w:t xml:space="preserve">Razón social y NIT son correctos.</w:t>
-      </w:r>
-    </w:p>
-    <w:p>
-      <w:pPr>
-        <w:pStyle w:val="Compact"/>
-        <w:numPr>
-          <w:ilvl w:val="0"/>
-          <w:numId w:val="1013"/>
-        </w:numPr>
-      </w:pPr>
-      <w:r>
-        <w:t xml:space="preserve">Datos de clientes/proveedores incluidos en documentos son exactos.</w:t>
-      </w:r>
-    </w:p>
-    <w:p>
-      <w:pPr>
-        <w:pStyle w:val="Compact"/>
-        <w:numPr>
-          <w:ilvl w:val="0"/>
-          <w:numId w:val="1013"/>
-        </w:numPr>
-      </w:pPr>
-      <w:r>
-        <w:t xml:space="preserve">Valores, cantidades e impuestos están bien calculados.</w:t>
-      </w:r>
-    </w:p>
-    <w:p>
-      <w:pPr>
-        <w:pStyle w:val="Compact"/>
-        <w:numPr>
-          <w:ilvl w:val="0"/>
-          <w:numId w:val="1013"/>
-        </w:numPr>
-      </w:pPr>
-      <w:r>
-        <w:t xml:space="preserve">No hay duplicación de numeración.</w:t>
+        <w:t xml:space="preserve">único responsable y certificador</w:t>
+      </w:r>
+      <w:r>
+        <w:t xml:space="preserve"> </w:t>
+      </w:r>
+      <w:r>
+        <w:t xml:space="preserve">de exactitud, legalidad y conformidad tributaria de información contenida en documentos antes de radicar ante DIAN. Responsabilidad integral incluye:</w:t>
+      </w:r>
+    </w:p>
+    <w:p>
+      <w:pPr>
+        <w:pStyle w:val="BodyText"/>
+      </w:pPr>
+      <w:r>
+        <w:rPr>
+          <w:b/>
+          <w:bCs/>
+        </w:rPr>
+        <w:t xml:space="preserve">Datos Identificatorios:</w:t>
+      </w:r>
+      <w:r>
+        <w:t xml:space="preserve"> </w:t>
+      </w:r>
+      <w:r>
+        <w:t xml:space="preserve">- Razón social, NIT, dígito de verificación coincidente con registros DIAN.</w:t>
+      </w:r>
+      <w:r>
+        <w:t xml:space="preserve"> </w:t>
+      </w:r>
+      <w:r>
+        <w:t xml:space="preserve">- Dirección fiscal, teléfono, email conforme registro en RUT.</w:t>
+      </w:r>
+      <w:r>
+        <w:t xml:space="preserve"> </w:t>
+      </w:r>
+      <w:r>
+        <w:t xml:space="preserve">- Datos de representante legal: nombre, cédula, cargo, autorización.</w:t>
+      </w:r>
+    </w:p>
+    <w:p>
+      <w:pPr>
+        <w:pStyle w:val="BodyText"/>
+      </w:pPr>
+      <w:r>
+        <w:rPr>
+          <w:b/>
+          <w:bCs/>
+        </w:rPr>
+        <w:t xml:space="preserve">Datos de Terceros:</w:t>
+      </w:r>
+      <w:r>
+        <w:t xml:space="preserve"> </w:t>
+      </w:r>
+      <w:r>
+        <w:t xml:space="preserve">- Información de clientes/compradores, proveedores/vendedores: nombres exactos, NIT/cédula válido, dirección.</w:t>
+      </w:r>
+      <w:r>
+        <w:t xml:space="preserve"> </w:t>
+      </w:r>
+      <w:r>
+        <w:t xml:space="preserve">- Garantía de que terceros incluidos en documentos autorizaron su inclusión, o que datos son de origen público/tributario.</w:t>
+      </w:r>
+      <w:r>
+        <w:t xml:space="preserve"> </w:t>
+      </w:r>
+      <w:r>
+        <w:t xml:space="preserve">- Responsabilidad por reclamaciones de terceros si estos alegan falta de autorización.</w:t>
+      </w:r>
+    </w:p>
+    <w:p>
+      <w:pPr>
+        <w:pStyle w:val="BodyText"/>
+      </w:pPr>
+      <w:r>
+        <w:rPr>
+          <w:b/>
+          <w:bCs/>
+        </w:rPr>
+        <w:t xml:space="preserve">Datos Económicos:</w:t>
+      </w:r>
+      <w:r>
+        <w:t xml:space="preserve"> </w:t>
+      </w:r>
+      <w:r>
+        <w:t xml:space="preserve">- Valores base, impuestos, retenciones calculados conforme normas tributarias (Estatuto Tributario, Resoluciones DIAN, jurisprudencia).</w:t>
+      </w:r>
+      <w:r>
+        <w:t xml:space="preserve"> </w:t>
+      </w:r>
+      <w:r>
+        <w:t xml:space="preserve">- Cálculos de IVA, impuesto a las ventas, retención en la fuente, aportes parafiscales.</w:t>
+      </w:r>
+      <w:r>
+        <w:t xml:space="preserve"> </w:t>
+      </w:r>
+      <w:r>
+        <w:t xml:space="preserve">- Ausencia de errores aritmético o de clasificación que resulten en incumplimiento tributario.</w:t>
+      </w:r>
+    </w:p>
+    <w:p>
+      <w:pPr>
+        <w:pStyle w:val="BodyText"/>
+      </w:pPr>
+      <w:r>
+        <w:rPr>
+          <w:b/>
+          <w:bCs/>
+        </w:rPr>
+        <w:t xml:space="preserve">Cumplimiento de Normas Procedimentales:</w:t>
+      </w:r>
+      <w:r>
+        <w:t xml:space="preserve"> </w:t>
+      </w:r>
+      <w:r>
+        <w:t xml:space="preserve">- Consecutivo/numeración conforme rango autorizado ante DIAN.</w:t>
+      </w:r>
+      <w:r>
+        <w:t xml:space="preserve"> </w:t>
+      </w:r>
+      <w:r>
+        <w:t xml:space="preserve">- Ausencia de duplicación de documentos.</w:t>
+      </w:r>
+      <w:r>
+        <w:t xml:space="preserve"> </w:t>
+      </w:r>
+      <w:r>
+        <w:t xml:space="preserve">- Formato técnico conforme estándares DIAN vigentes.</w:t>
+      </w:r>
+    </w:p>
+    <w:p>
+      <w:pPr>
+        <w:pStyle w:val="BodyText"/>
+      </w:pPr>
+      <w:r>
+        <w:rPr>
+          <w:b/>
+          <w:bCs/>
+        </w:rPr>
+        <w:t xml:space="preserve">Garantía Expresa:</w:t>
+      </w:r>
+      <w:r>
+        <w:t xml:space="preserve"> </w:t>
+      </w:r>
+      <w:r>
+        <w:t xml:space="preserve">Cliente garantiza que información contenida en documentos es exacta, legal, y tributariamente conforme. Cliente acepta responsabilidad integral por consecuencias de información inexacta, ilegal, o tributariamente deficiente.</w:t>
+      </w:r>
+    </w:p>
+    <w:p>
+      <w:pPr>
+        <w:pStyle w:val="BodyText"/>
+      </w:pPr>
+      <w:r>
+        <w:rPr>
+          <w:b/>
+          <w:bCs/>
+        </w:rPr>
+        <w:t xml:space="preserve">Exclusión de Validación por FACTUS:</w:t>
+      </w:r>
+    </w:p>
+    <w:p>
+      <w:pPr>
+        <w:pStyle w:val="BodyText"/>
+      </w:pPr>
+      <w:r>
+        <w:t xml:space="preserve">FACTUS</w:t>
+      </w:r>
+      <w:r>
+        <w:t xml:space="preserve"> </w:t>
+      </w:r>
+      <w:r>
+        <w:rPr>
+          <w:b/>
+          <w:bCs/>
+        </w:rPr>
+        <w:t xml:space="preserve">no realiza, no asume, y no es responsable de</w:t>
+      </w:r>
+      <w:r>
+        <w:t xml:space="preserve">:</w:t>
+      </w:r>
+    </w:p>
+    <w:p>
+      <w:pPr>
+        <w:pStyle w:val="Compact"/>
+        <w:numPr>
+          <w:ilvl w:val="0"/>
+          <w:numId w:val="1019"/>
+        </w:numPr>
+      </w:pPr>
+      <w:r>
+        <w:t xml:space="preserve">Validación previa a radicación de exactitud de datos.</w:t>
+      </w:r>
+    </w:p>
+    <w:p>
+      <w:pPr>
+        <w:pStyle w:val="Compact"/>
+        <w:numPr>
+          <w:ilvl w:val="0"/>
+          <w:numId w:val="1019"/>
+        </w:numPr>
+      </w:pPr>
+      <w:r>
+        <w:t xml:space="preserve">Auditoría de legalidad tributaria.</w:t>
+      </w:r>
+    </w:p>
+    <w:p>
+      <w:pPr>
+        <w:pStyle w:val="Compact"/>
+        <w:numPr>
+          <w:ilvl w:val="0"/>
+          <w:numId w:val="1019"/>
+        </w:numPr>
+      </w:pPr>
+      <w:r>
+        <w:t xml:space="preserve">Verificación de autorización de terceros.</w:t>
+      </w:r>
+    </w:p>
+    <w:p>
+      <w:pPr>
+        <w:pStyle w:val="Compact"/>
+        <w:numPr>
+          <w:ilvl w:val="0"/>
+          <w:numId w:val="1019"/>
+        </w:numPr>
+      </w:pPr>
+      <w:r>
+        <w:t xml:space="preserve">Cálculo o verificación de valores, impuestos, retenciones.</w:t>
       </w:r>
     </w:p>
     <w:p>
@@ -1562,20 +2190,19 @@
         <w:pStyle w:val="FirstParagraph"/>
       </w:pPr>
       <w:r>
-        <w:t xml:space="preserve">FACTUS NO valida nada de esto antes de radicar. Si cargues datos incorrectos y la DIAN rechaza documentos,</w:t>
-      </w:r>
-      <w:r>
-        <w:t xml:space="preserve"> </w:t>
-      </w:r>
-      <w:r>
-        <w:rPr>
-          <w:b/>
-          <w:bCs/>
-        </w:rPr>
-        <w:t xml:space="preserve">es tu responsabilidad</w:t>
-      </w:r>
-      <w:r>
-        <w:t xml:space="preserve">.</w:t>
+        <w:t xml:space="preserve">FACTUS transmite documentos</w:t>
+      </w:r>
+      <w:r>
+        <w:t xml:space="preserve"> </w:t>
+      </w:r>
+      <w:r>
+        <w:t xml:space="preserve">“tal cual”</w:t>
+      </w:r>
+      <w:r>
+        <w:t xml:space="preserve"> </w:t>
+      </w:r>
+      <w:r>
+        <w:t xml:space="preserve">Cliente los cargue. Si DIAN rechaza documento por error de datos, cálculo o incumplimiento tributario, responsabilidad recae exclusivamente en Cliente. No hay derecho a reembolso por rechazos atribuibles a Cliente.</w:t>
       </w:r>
     </w:p>
     <w:p>
@@ -1618,7 +2245,7 @@
         <w:pStyle w:val="Compact"/>
         <w:numPr>
           <w:ilvl w:val="0"/>
-          <w:numId w:val="1014"/>
+          <w:numId w:val="1020"/>
         </w:numPr>
       </w:pPr>
       <w:r>
@@ -1640,7 +2267,7 @@
         <w:pStyle w:val="Compact"/>
         <w:numPr>
           <w:ilvl w:val="0"/>
-          <w:numId w:val="1014"/>
+          <w:numId w:val="1020"/>
         </w:numPr>
       </w:pPr>
       <w:r>
@@ -1662,7 +2289,7 @@
         <w:pStyle w:val="Compact"/>
         <w:numPr>
           <w:ilvl w:val="0"/>
-          <w:numId w:val="1014"/>
+          <w:numId w:val="1020"/>
         </w:numPr>
       </w:pPr>
       <w:r>
@@ -1684,7 +2311,7 @@
         <w:pStyle w:val="Compact"/>
         <w:numPr>
           <w:ilvl w:val="0"/>
-          <w:numId w:val="1014"/>
+          <w:numId w:val="1020"/>
         </w:numPr>
       </w:pPr>
       <w:r>
@@ -1706,7 +2333,7 @@
         <w:pStyle w:val="Compact"/>
         <w:numPr>
           <w:ilvl w:val="0"/>
-          <w:numId w:val="1014"/>
+          <w:numId w:val="1020"/>
         </w:numPr>
       </w:pPr>
       <w:r>
@@ -1746,7 +2373,7 @@
         <w:pStyle w:val="Compact"/>
         <w:numPr>
           <w:ilvl w:val="0"/>
-          <w:numId w:val="1015"/>
+          <w:numId w:val="1021"/>
         </w:numPr>
       </w:pPr>
       <w:r>
@@ -1768,7 +2395,7 @@
         <w:pStyle w:val="Compact"/>
         <w:numPr>
           <w:ilvl w:val="0"/>
-          <w:numId w:val="1015"/>
+          <w:numId w:val="1021"/>
         </w:numPr>
       </w:pPr>
       <w:r>
@@ -1790,7 +2417,7 @@
         <w:pStyle w:val="Compact"/>
         <w:numPr>
           <w:ilvl w:val="0"/>
-          <w:numId w:val="1015"/>
+          <w:numId w:val="1021"/>
         </w:numPr>
       </w:pPr>
       <w:r>
@@ -1812,7 +2439,7 @@
         <w:pStyle w:val="Compact"/>
         <w:numPr>
           <w:ilvl w:val="0"/>
-          <w:numId w:val="1015"/>
+          <w:numId w:val="1021"/>
         </w:numPr>
       </w:pPr>
       <w:r>
@@ -1834,7 +2461,7 @@
         <w:pStyle w:val="Compact"/>
         <w:numPr>
           <w:ilvl w:val="0"/>
-          <w:numId w:val="1015"/>
+          <w:numId w:val="1021"/>
         </w:numPr>
       </w:pPr>
       <w:r>
@@ -1856,7 +2483,7 @@
         <w:pStyle w:val="Compact"/>
         <w:numPr>
           <w:ilvl w:val="0"/>
-          <w:numId w:val="1015"/>
+          <w:numId w:val="1021"/>
         </w:numPr>
       </w:pPr>
       <w:r>
@@ -1878,7 +2505,7 @@
         <w:pStyle w:val="Compact"/>
         <w:numPr>
           <w:ilvl w:val="0"/>
-          <w:numId w:val="1015"/>
+          <w:numId w:val="1021"/>
         </w:numPr>
       </w:pPr>
       <w:r>
@@ -2046,7 +2673,7 @@
         <w:pStyle w:val="Compact"/>
         <w:numPr>
           <w:ilvl w:val="0"/>
-          <w:numId w:val="1016"/>
+          <w:numId w:val="1022"/>
         </w:numPr>
       </w:pPr>
       <w:r>
@@ -2058,7 +2685,7 @@
         <w:pStyle w:val="Compact"/>
         <w:numPr>
           <w:ilvl w:val="0"/>
-          <w:numId w:val="1016"/>
+          <w:numId w:val="1022"/>
         </w:numPr>
       </w:pPr>
       <w:r>
@@ -2070,7 +2697,7 @@
         <w:pStyle w:val="Compact"/>
         <w:numPr>
           <w:ilvl w:val="0"/>
-          <w:numId w:val="1016"/>
+          <w:numId w:val="1022"/>
         </w:numPr>
       </w:pPr>
       <w:r>
@@ -2100,7 +2727,7 @@
         <w:pStyle w:val="Compact"/>
         <w:numPr>
           <w:ilvl w:val="0"/>
-          <w:numId w:val="1017"/>
+          <w:numId w:val="1023"/>
         </w:numPr>
       </w:pPr>
       <w:r>
@@ -2112,7 +2739,7 @@
         <w:pStyle w:val="Compact"/>
         <w:numPr>
           <w:ilvl w:val="0"/>
-          <w:numId w:val="1017"/>
+          <w:numId w:val="1023"/>
         </w:numPr>
       </w:pPr>
       <w:r>
@@ -2124,7 +2751,7 @@
         <w:pStyle w:val="Compact"/>
         <w:numPr>
           <w:ilvl w:val="1"/>
-          <w:numId w:val="1018"/>
+          <w:numId w:val="1024"/>
         </w:numPr>
       </w:pPr>
       <w:r>
@@ -2136,7 +2763,7 @@
         <w:pStyle w:val="Compact"/>
         <w:numPr>
           <w:ilvl w:val="1"/>
-          <w:numId w:val="1018"/>
+          <w:numId w:val="1024"/>
         </w:numPr>
       </w:pPr>
       <w:r>
@@ -2148,7 +2775,7 @@
         <w:pStyle w:val="Compact"/>
         <w:numPr>
           <w:ilvl w:val="1"/>
-          <w:numId w:val="1018"/>
+          <w:numId w:val="1024"/>
         </w:numPr>
       </w:pPr>
       <w:r>
@@ -2178,7 +2805,7 @@
         <w:pStyle w:val="Compact"/>
         <w:numPr>
           <w:ilvl w:val="0"/>
-          <w:numId w:val="1019"/>
+          <w:numId w:val="1025"/>
         </w:numPr>
       </w:pPr>
       <w:r>
@@ -2206,7 +2833,7 @@
         <w:pStyle w:val="Compact"/>
         <w:numPr>
           <w:ilvl w:val="0"/>
-          <w:numId w:val="1019"/>
+          <w:numId w:val="1025"/>
         </w:numPr>
       </w:pPr>
       <w:r>
@@ -2218,7 +2845,7 @@
         <w:pStyle w:val="Compact"/>
         <w:numPr>
           <w:ilvl w:val="0"/>
-          <w:numId w:val="1019"/>
+          <w:numId w:val="1025"/>
         </w:numPr>
       </w:pPr>
       <w:r>
@@ -2248,7 +2875,7 @@
         <w:pStyle w:val="Compact"/>
         <w:numPr>
           <w:ilvl w:val="0"/>
-          <w:numId w:val="1020"/>
+          <w:numId w:val="1026"/>
         </w:numPr>
       </w:pPr>
       <w:r>
@@ -2276,7 +2903,7 @@
         <w:pStyle w:val="Compact"/>
         <w:numPr>
           <w:ilvl w:val="0"/>
-          <w:numId w:val="1020"/>
+          <w:numId w:val="1026"/>
         </w:numPr>
       </w:pPr>
       <w:r>
@@ -2316,7 +2943,7 @@
         <w:pStyle w:val="Compact"/>
         <w:numPr>
           <w:ilvl w:val="0"/>
-          <w:numId w:val="1021"/>
+          <w:numId w:val="1027"/>
         </w:numPr>
       </w:pPr>
       <w:r>
@@ -2328,7 +2955,7 @@
         <w:pStyle w:val="Compact"/>
         <w:numPr>
           <w:ilvl w:val="0"/>
-          <w:numId w:val="1021"/>
+          <w:numId w:val="1027"/>
         </w:numPr>
       </w:pPr>
       <w:r>
@@ -2375,7 +3002,7 @@
         <w:pStyle w:val="Compact"/>
         <w:numPr>
           <w:ilvl w:val="0"/>
-          <w:numId w:val="1022"/>
+          <w:numId w:val="1028"/>
         </w:numPr>
       </w:pPr>
       <w:r>
@@ -2387,7 +3014,7 @@
         <w:pStyle w:val="Compact"/>
         <w:numPr>
           <w:ilvl w:val="0"/>
-          <w:numId w:val="1022"/>
+          <w:numId w:val="1028"/>
         </w:numPr>
       </w:pPr>
       <w:r>
@@ -2417,7 +3044,7 @@
         <w:pStyle w:val="Compact"/>
         <w:numPr>
           <w:ilvl w:val="0"/>
-          <w:numId w:val="1023"/>
+          <w:numId w:val="1029"/>
         </w:numPr>
       </w:pPr>
       <w:r>
@@ -2429,7 +3056,7 @@
         <w:pStyle w:val="Compact"/>
         <w:numPr>
           <w:ilvl w:val="0"/>
-          <w:numId w:val="1023"/>
+          <w:numId w:val="1029"/>
         </w:numPr>
       </w:pPr>
       <w:r>
@@ -2502,7 +3129,7 @@
         <w:pStyle w:val="Compact"/>
         <w:numPr>
           <w:ilvl w:val="0"/>
-          <w:numId w:val="1024"/>
+          <w:numId w:val="1030"/>
         </w:numPr>
       </w:pPr>
       <w:r>
@@ -2514,7 +3141,7 @@
         <w:pStyle w:val="Compact"/>
         <w:numPr>
           <w:ilvl w:val="0"/>
-          <w:numId w:val="1024"/>
+          <w:numId w:val="1030"/>
         </w:numPr>
       </w:pPr>
       <w:r>
@@ -2526,7 +3153,7 @@
         <w:pStyle w:val="Compact"/>
         <w:numPr>
           <w:ilvl w:val="0"/>
-          <w:numId w:val="1024"/>
+          <w:numId w:val="1030"/>
         </w:numPr>
       </w:pPr>
       <w:r>
@@ -2613,7 +3240,7 @@
         <w:pStyle w:val="Compact"/>
         <w:numPr>
           <w:ilvl w:val="0"/>
-          <w:numId w:val="1025"/>
+          <w:numId w:val="1031"/>
         </w:numPr>
       </w:pPr>
       <w:r>
@@ -2625,7 +3252,7 @@
         <w:pStyle w:val="Compact"/>
         <w:numPr>
           <w:ilvl w:val="0"/>
-          <w:numId w:val="1025"/>
+          <w:numId w:val="1031"/>
         </w:numPr>
       </w:pPr>
       <w:r>
@@ -2637,7 +3264,7 @@
         <w:pStyle w:val="Compact"/>
         <w:numPr>
           <w:ilvl w:val="0"/>
-          <w:numId w:val="1025"/>
+          <w:numId w:val="1031"/>
         </w:numPr>
       </w:pPr>
       <w:r>
@@ -2667,7 +3294,7 @@
         <w:pStyle w:val="Compact"/>
         <w:numPr>
           <w:ilvl w:val="0"/>
-          <w:numId w:val="1026"/>
+          <w:numId w:val="1032"/>
         </w:numPr>
       </w:pPr>
       <w:r>
@@ -2685,7 +3312,7 @@
         <w:pStyle w:val="Compact"/>
         <w:numPr>
           <w:ilvl w:val="0"/>
-          <w:numId w:val="1026"/>
+          <w:numId w:val="1032"/>
         </w:numPr>
       </w:pPr>
       <w:r>
@@ -2697,7 +3324,7 @@
         <w:pStyle w:val="Compact"/>
         <w:numPr>
           <w:ilvl w:val="0"/>
-          <w:numId w:val="1026"/>
+          <w:numId w:val="1032"/>
         </w:numPr>
       </w:pPr>
       <w:r>
@@ -2709,7 +3336,7 @@
         <w:pStyle w:val="Compact"/>
         <w:numPr>
           <w:ilvl w:val="0"/>
-          <w:numId w:val="1026"/>
+          <w:numId w:val="1032"/>
         </w:numPr>
       </w:pPr>
       <w:r>
@@ -2780,7 +3407,7 @@
         <w:pStyle w:val="Compact"/>
         <w:numPr>
           <w:ilvl w:val="0"/>
-          <w:numId w:val="1027"/>
+          <w:numId w:val="1033"/>
         </w:numPr>
       </w:pPr>
       <w:r>
@@ -2792,7 +3419,7 @@
         <w:pStyle w:val="Compact"/>
         <w:numPr>
           <w:ilvl w:val="0"/>
-          <w:numId w:val="1027"/>
+          <w:numId w:val="1033"/>
         </w:numPr>
       </w:pPr>
       <w:r>
@@ -2822,7 +3449,7 @@
         <w:pStyle w:val="Compact"/>
         <w:numPr>
           <w:ilvl w:val="0"/>
-          <w:numId w:val="1028"/>
+          <w:numId w:val="1034"/>
         </w:numPr>
       </w:pPr>
       <w:r>
@@ -2834,7 +3461,7 @@
         <w:pStyle w:val="Compact"/>
         <w:numPr>
           <w:ilvl w:val="0"/>
-          <w:numId w:val="1028"/>
+          <w:numId w:val="1034"/>
         </w:numPr>
       </w:pPr>
       <w:r>
@@ -2846,7 +3473,7 @@
         <w:pStyle w:val="Compact"/>
         <w:numPr>
           <w:ilvl w:val="0"/>
-          <w:numId w:val="1028"/>
+          <w:numId w:val="1034"/>
         </w:numPr>
       </w:pPr>
       <w:r>
@@ -2876,7 +3503,7 @@
         <w:pStyle w:val="Compact"/>
         <w:numPr>
           <w:ilvl w:val="0"/>
-          <w:numId w:val="1029"/>
+          <w:numId w:val="1035"/>
         </w:numPr>
       </w:pPr>
       <w:r>
@@ -2888,7 +3515,7 @@
         <w:pStyle w:val="Compact"/>
         <w:numPr>
           <w:ilvl w:val="0"/>
-          <w:numId w:val="1029"/>
+          <w:numId w:val="1035"/>
         </w:numPr>
       </w:pPr>
       <w:r>
@@ -2918,7 +3545,7 @@
         <w:pStyle w:val="Compact"/>
         <w:numPr>
           <w:ilvl w:val="0"/>
-          <w:numId w:val="1030"/>
+          <w:numId w:val="1036"/>
         </w:numPr>
       </w:pPr>
       <w:r>
@@ -2948,7 +3575,7 @@
         <w:pStyle w:val="Compact"/>
         <w:numPr>
           <w:ilvl w:val="0"/>
-          <w:numId w:val="1031"/>
+          <w:numId w:val="1037"/>
         </w:numPr>
       </w:pPr>
       <w:r>
@@ -2960,7 +3587,7 @@
         <w:pStyle w:val="Compact"/>
         <w:numPr>
           <w:ilvl w:val="0"/>
-          <w:numId w:val="1031"/>
+          <w:numId w:val="1037"/>
         </w:numPr>
       </w:pPr>
       <w:r>
@@ -2972,7 +3599,7 @@
         <w:pStyle w:val="Compact"/>
         <w:numPr>
           <w:ilvl w:val="0"/>
-          <w:numId w:val="1031"/>
+          <w:numId w:val="1037"/>
         </w:numPr>
       </w:pPr>
       <w:r>
@@ -3031,7 +3658,7 @@
         <w:pStyle w:val="Compact"/>
         <w:numPr>
           <w:ilvl w:val="0"/>
-          <w:numId w:val="1032"/>
+          <w:numId w:val="1038"/>
         </w:numPr>
       </w:pPr>
       <w:r>
@@ -3043,7 +3670,7 @@
         <w:pStyle w:val="Compact"/>
         <w:numPr>
           <w:ilvl w:val="0"/>
-          <w:numId w:val="1032"/>
+          <w:numId w:val="1038"/>
         </w:numPr>
       </w:pPr>
       <w:r>
@@ -3055,7 +3682,7 @@
         <w:pStyle w:val="Compact"/>
         <w:numPr>
           <w:ilvl w:val="0"/>
-          <w:numId w:val="1032"/>
+          <w:numId w:val="1038"/>
         </w:numPr>
       </w:pPr>
       <w:r>
@@ -3067,7 +3694,7 @@
         <w:pStyle w:val="Compact"/>
         <w:numPr>
           <w:ilvl w:val="0"/>
-          <w:numId w:val="1032"/>
+          <w:numId w:val="1038"/>
         </w:numPr>
       </w:pPr>
       <w:r>
@@ -3079,7 +3706,7 @@
         <w:pStyle w:val="Compact"/>
         <w:numPr>
           <w:ilvl w:val="0"/>
-          <w:numId w:val="1032"/>
+          <w:numId w:val="1038"/>
         </w:numPr>
       </w:pPr>
       <w:r>
@@ -3091,7 +3718,7 @@
         <w:pStyle w:val="Compact"/>
         <w:numPr>
           <w:ilvl w:val="0"/>
-          <w:numId w:val="1032"/>
+          <w:numId w:val="1038"/>
         </w:numPr>
       </w:pPr>
       <w:r>
@@ -3133,7 +3760,7 @@
         <w:pStyle w:val="Compact"/>
         <w:numPr>
           <w:ilvl w:val="0"/>
-          <w:numId w:val="1033"/>
+          <w:numId w:val="1039"/>
         </w:numPr>
       </w:pPr>
       <w:r>
@@ -3145,7 +3772,7 @@
         <w:pStyle w:val="Compact"/>
         <w:numPr>
           <w:ilvl w:val="0"/>
-          <w:numId w:val="1033"/>
+          <w:numId w:val="1039"/>
         </w:numPr>
       </w:pPr>
       <w:r>
@@ -3157,7 +3784,7 @@
         <w:pStyle w:val="Compact"/>
         <w:numPr>
           <w:ilvl w:val="0"/>
-          <w:numId w:val="1033"/>
+          <w:numId w:val="1039"/>
         </w:numPr>
       </w:pPr>
       <w:r>
@@ -3169,7 +3796,7 @@
         <w:pStyle w:val="Compact"/>
         <w:numPr>
           <w:ilvl w:val="0"/>
-          <w:numId w:val="1033"/>
+          <w:numId w:val="1039"/>
         </w:numPr>
       </w:pPr>
       <w:r>
@@ -3228,7 +3855,7 @@
         <w:pStyle w:val="Compact"/>
         <w:numPr>
           <w:ilvl w:val="0"/>
-          <w:numId w:val="1034"/>
+          <w:numId w:val="1040"/>
         </w:numPr>
       </w:pPr>
       <w:r>
@@ -3240,7 +3867,7 @@
         <w:pStyle w:val="Compact"/>
         <w:numPr>
           <w:ilvl w:val="0"/>
-          <w:numId w:val="1034"/>
+          <w:numId w:val="1040"/>
         </w:numPr>
       </w:pPr>
       <w:r>
@@ -3252,7 +3879,7 @@
         <w:pStyle w:val="Compact"/>
         <w:numPr>
           <w:ilvl w:val="0"/>
-          <w:numId w:val="1034"/>
+          <w:numId w:val="1040"/>
         </w:numPr>
       </w:pPr>
       <w:r>
@@ -3302,7 +3929,7 @@
         <w:pStyle w:val="Compact"/>
         <w:numPr>
           <w:ilvl w:val="0"/>
-          <w:numId w:val="1035"/>
+          <w:numId w:val="1041"/>
         </w:numPr>
       </w:pPr>
       <w:r>
@@ -3314,7 +3941,7 @@
         <w:pStyle w:val="Compact"/>
         <w:numPr>
           <w:ilvl w:val="0"/>
-          <w:numId w:val="1035"/>
+          <w:numId w:val="1041"/>
         </w:numPr>
       </w:pPr>
       <w:r>
@@ -3326,7 +3953,7 @@
         <w:pStyle w:val="Compact"/>
         <w:numPr>
           <w:ilvl w:val="0"/>
-          <w:numId w:val="1035"/>
+          <w:numId w:val="1041"/>
         </w:numPr>
       </w:pPr>
       <w:r>
@@ -3338,7 +3965,7 @@
         <w:pStyle w:val="Compact"/>
         <w:numPr>
           <w:ilvl w:val="0"/>
-          <w:numId w:val="1035"/>
+          <w:numId w:val="1041"/>
         </w:numPr>
       </w:pPr>
       <w:r>
@@ -3350,7 +3977,7 @@
         <w:pStyle w:val="Compact"/>
         <w:numPr>
           <w:ilvl w:val="0"/>
-          <w:numId w:val="1035"/>
+          <w:numId w:val="1041"/>
         </w:numPr>
       </w:pPr>
       <w:r>
@@ -3431,7 +4058,7 @@
         <w:pStyle w:val="Compact"/>
         <w:numPr>
           <w:ilvl w:val="0"/>
-          <w:numId w:val="1036"/>
+          <w:numId w:val="1042"/>
         </w:numPr>
       </w:pPr>
       <w:r>
@@ -3443,7 +4070,7 @@
         <w:pStyle w:val="Compact"/>
         <w:numPr>
           <w:ilvl w:val="0"/>
-          <w:numId w:val="1036"/>
+          <w:numId w:val="1042"/>
         </w:numPr>
       </w:pPr>
       <w:r>
@@ -3524,7 +4151,7 @@
         <w:pStyle w:val="Compact"/>
         <w:numPr>
           <w:ilvl w:val="0"/>
-          <w:numId w:val="1037"/>
+          <w:numId w:val="1043"/>
         </w:numPr>
       </w:pPr>
       <w:r>
@@ -3546,7 +4173,7 @@
         <w:pStyle w:val="Compact"/>
         <w:numPr>
           <w:ilvl w:val="0"/>
-          <w:numId w:val="1037"/>
+          <w:numId w:val="1043"/>
         </w:numPr>
       </w:pPr>
       <w:r>
@@ -3568,7 +4195,7 @@
         <w:pStyle w:val="Compact"/>
         <w:numPr>
           <w:ilvl w:val="0"/>
-          <w:numId w:val="1037"/>
+          <w:numId w:val="1043"/>
         </w:numPr>
       </w:pPr>
       <w:r>
@@ -3590,7 +4217,7 @@
         <w:pStyle w:val="Compact"/>
         <w:numPr>
           <w:ilvl w:val="0"/>
-          <w:numId w:val="1037"/>
+          <w:numId w:val="1043"/>
         </w:numPr>
       </w:pPr>
       <w:r>
@@ -3612,7 +4239,7 @@
         <w:pStyle w:val="Compact"/>
         <w:numPr>
           <w:ilvl w:val="0"/>
-          <w:numId w:val="1037"/>
+          <w:numId w:val="1043"/>
         </w:numPr>
       </w:pPr>
       <w:r>
@@ -3634,7 +4261,7 @@
         <w:pStyle w:val="Compact"/>
         <w:numPr>
           <w:ilvl w:val="0"/>
-          <w:numId w:val="1037"/>
+          <w:numId w:val="1043"/>
         </w:numPr>
       </w:pPr>
       <w:r>
@@ -3656,7 +4283,7 @@
         <w:pStyle w:val="Compact"/>
         <w:numPr>
           <w:ilvl w:val="0"/>
-          <w:numId w:val="1037"/>
+          <w:numId w:val="1043"/>
         </w:numPr>
       </w:pPr>
       <w:r>
@@ -3678,7 +4305,7 @@
         <w:pStyle w:val="Compact"/>
         <w:numPr>
           <w:ilvl w:val="0"/>
-          <w:numId w:val="1037"/>
+          <w:numId w:val="1043"/>
         </w:numPr>
       </w:pPr>
       <w:r>
@@ -3717,7 +4344,7 @@
       <w:pPr>
         <w:numPr>
           <w:ilvl w:val="0"/>
-          <w:numId w:val="1038"/>
+          <w:numId w:val="1044"/>
         </w:numPr>
       </w:pPr>
       <w:r>
@@ -3738,7 +4365,7 @@
       <w:pPr>
         <w:numPr>
           <w:ilvl w:val="0"/>
-          <w:numId w:val="1038"/>
+          <w:numId w:val="1044"/>
         </w:numPr>
       </w:pPr>
       <w:r>
@@ -3759,7 +4386,7 @@
       <w:pPr>
         <w:numPr>
           <w:ilvl w:val="0"/>
-          <w:numId w:val="1038"/>
+          <w:numId w:val="1044"/>
         </w:numPr>
       </w:pPr>
       <w:r>
@@ -3860,7 +4487,7 @@
         <w:pStyle w:val="Compact"/>
         <w:numPr>
           <w:ilvl w:val="0"/>
-          <w:numId w:val="1039"/>
+          <w:numId w:val="1045"/>
         </w:numPr>
       </w:pPr>
       <w:r>
@@ -3882,7 +4509,7 @@
         <w:pStyle w:val="Compact"/>
         <w:numPr>
           <w:ilvl w:val="0"/>
-          <w:numId w:val="1039"/>
+          <w:numId w:val="1045"/>
         </w:numPr>
       </w:pPr>
       <w:r>
@@ -3904,7 +4531,7 @@
         <w:pStyle w:val="Compact"/>
         <w:numPr>
           <w:ilvl w:val="0"/>
-          <w:numId w:val="1039"/>
+          <w:numId w:val="1045"/>
         </w:numPr>
       </w:pPr>
       <w:r>
@@ -3926,7 +4553,7 @@
         <w:pStyle w:val="Compact"/>
         <w:numPr>
           <w:ilvl w:val="0"/>
-          <w:numId w:val="1039"/>
+          <w:numId w:val="1045"/>
         </w:numPr>
       </w:pPr>
       <w:r>
@@ -3948,7 +4575,7 @@
         <w:pStyle w:val="Compact"/>
         <w:numPr>
           <w:ilvl w:val="0"/>
-          <w:numId w:val="1039"/>
+          <w:numId w:val="1045"/>
         </w:numPr>
       </w:pPr>
       <w:r>
@@ -4003,7 +4630,7 @@
         <w:pStyle w:val="Compact"/>
         <w:numPr>
           <w:ilvl w:val="0"/>
-          <w:numId w:val="1040"/>
+          <w:numId w:val="1046"/>
         </w:numPr>
       </w:pPr>
       <w:r>
@@ -4015,7 +4642,7 @@
         <w:pStyle w:val="Compact"/>
         <w:numPr>
           <w:ilvl w:val="0"/>
-          <w:numId w:val="1040"/>
+          <w:numId w:val="1046"/>
         </w:numPr>
       </w:pPr>
       <w:r>
@@ -4078,7 +4705,7 @@
         <w:pStyle w:val="Compact"/>
         <w:numPr>
           <w:ilvl w:val="0"/>
-          <w:numId w:val="1041"/>
+          <w:numId w:val="1047"/>
         </w:numPr>
       </w:pPr>
       <w:r>
@@ -4090,7 +4717,7 @@
         <w:pStyle w:val="Compact"/>
         <w:numPr>
           <w:ilvl w:val="0"/>
-          <w:numId w:val="1041"/>
+          <w:numId w:val="1047"/>
         </w:numPr>
       </w:pPr>
       <w:r>
@@ -4102,7 +4729,7 @@
         <w:pStyle w:val="Compact"/>
         <w:numPr>
           <w:ilvl w:val="0"/>
-          <w:numId w:val="1041"/>
+          <w:numId w:val="1047"/>
         </w:numPr>
       </w:pPr>
       <w:r>
@@ -4114,7 +4741,7 @@
         <w:pStyle w:val="Compact"/>
         <w:numPr>
           <w:ilvl w:val="0"/>
-          <w:numId w:val="1041"/>
+          <w:numId w:val="1047"/>
         </w:numPr>
       </w:pPr>
       <w:r>
@@ -4126,7 +4753,7 @@
         <w:pStyle w:val="Compact"/>
         <w:numPr>
           <w:ilvl w:val="0"/>
-          <w:numId w:val="1041"/>
+          <w:numId w:val="1047"/>
         </w:numPr>
       </w:pPr>
       <w:r>
@@ -4204,7 +4831,7 @@
         <w:pStyle w:val="Compact"/>
         <w:numPr>
           <w:ilvl w:val="0"/>
-          <w:numId w:val="1042"/>
+          <w:numId w:val="1048"/>
         </w:numPr>
       </w:pPr>
       <w:r>
@@ -4216,7 +4843,7 @@
         <w:pStyle w:val="Compact"/>
         <w:numPr>
           <w:ilvl w:val="0"/>
-          <w:numId w:val="1042"/>
+          <w:numId w:val="1048"/>
         </w:numPr>
       </w:pPr>
       <w:r>
@@ -4228,7 +4855,7 @@
         <w:pStyle w:val="Compact"/>
         <w:numPr>
           <w:ilvl w:val="0"/>
-          <w:numId w:val="1042"/>
+          <w:numId w:val="1048"/>
         </w:numPr>
       </w:pPr>
       <w:r>
@@ -4240,7 +4867,7 @@
         <w:pStyle w:val="Compact"/>
         <w:numPr>
           <w:ilvl w:val="0"/>
-          <w:numId w:val="1042"/>
+          <w:numId w:val="1048"/>
         </w:numPr>
       </w:pPr>
       <w:r>
@@ -4270,7 +4897,7 @@
         <w:pStyle w:val="Compact"/>
         <w:numPr>
           <w:ilvl w:val="0"/>
-          <w:numId w:val="1043"/>
+          <w:numId w:val="1049"/>
         </w:numPr>
       </w:pPr>
       <w:r>
@@ -4282,7 +4909,7 @@
         <w:pStyle w:val="Compact"/>
         <w:numPr>
           <w:ilvl w:val="0"/>
-          <w:numId w:val="1043"/>
+          <w:numId w:val="1049"/>
         </w:numPr>
       </w:pPr>
       <w:r>
@@ -4294,7 +4921,7 @@
         <w:pStyle w:val="Compact"/>
         <w:numPr>
           <w:ilvl w:val="0"/>
-          <w:numId w:val="1043"/>
+          <w:numId w:val="1049"/>
         </w:numPr>
       </w:pPr>
       <w:r>
@@ -4565,7 +5192,7 @@
       <w:pPr>
         <w:numPr>
           <w:ilvl w:val="0"/>
-          <w:numId w:val="1044"/>
+          <w:numId w:val="1050"/>
         </w:numPr>
       </w:pPr>
       <w:r>
@@ -4586,7 +5213,7 @@
       <w:pPr>
         <w:numPr>
           <w:ilvl w:val="0"/>
-          <w:numId w:val="1044"/>
+          <w:numId w:val="1050"/>
         </w:numPr>
       </w:pPr>
       <w:r>
@@ -4613,7 +5240,7 @@
       <w:pPr>
         <w:numPr>
           <w:ilvl w:val="0"/>
-          <w:numId w:val="1044"/>
+          <w:numId w:val="1050"/>
         </w:numPr>
       </w:pPr>
       <w:r>
@@ -4634,7 +5261,7 @@
       <w:pPr>
         <w:numPr>
           <w:ilvl w:val="0"/>
-          <w:numId w:val="1044"/>
+          <w:numId w:val="1050"/>
         </w:numPr>
       </w:pPr>
       <w:r>
@@ -4661,7 +5288,7 @@
       <w:pPr>
         <w:numPr>
           <w:ilvl w:val="0"/>
-          <w:numId w:val="1044"/>
+          <w:numId w:val="1050"/>
         </w:numPr>
       </w:pPr>
       <w:r>
@@ -4683,7 +5310,7 @@
         <w:pStyle w:val="Compact"/>
         <w:numPr>
           <w:ilvl w:val="1"/>
-          <w:numId w:val="1045"/>
+          <w:numId w:val="1051"/>
         </w:numPr>
       </w:pPr>
       <w:r>
@@ -4705,7 +5332,7 @@
         <w:pStyle w:val="Compact"/>
         <w:numPr>
           <w:ilvl w:val="1"/>
-          <w:numId w:val="1045"/>
+          <w:numId w:val="1051"/>
         </w:numPr>
       </w:pPr>
       <w:r>
@@ -4727,7 +5354,7 @@
         <w:pStyle w:val="Compact"/>
         <w:numPr>
           <w:ilvl w:val="1"/>
-          <w:numId w:val="1045"/>
+          <w:numId w:val="1051"/>
         </w:numPr>
       </w:pPr>
       <w:r>
@@ -4749,7 +5376,7 @@
         <w:pStyle w:val="Compact"/>
         <w:numPr>
           <w:ilvl w:val="1"/>
-          <w:numId w:val="1045"/>
+          <w:numId w:val="1051"/>
         </w:numPr>
       </w:pPr>
       <w:r>
@@ -4771,7 +5398,7 @@
         <w:pStyle w:val="Compact"/>
         <w:numPr>
           <w:ilvl w:val="1"/>
-          <w:numId w:val="1045"/>
+          <w:numId w:val="1051"/>
         </w:numPr>
       </w:pPr>
       <w:r>
@@ -4804,7 +5431,7 @@
       <w:pPr>
         <w:numPr>
           <w:ilvl w:val="0"/>
-          <w:numId w:val="1044"/>
+          <w:numId w:val="1050"/>
         </w:numPr>
       </w:pPr>
       <w:r>
@@ -4826,7 +5453,7 @@
         <w:pStyle w:val="Compact"/>
         <w:numPr>
           <w:ilvl w:val="1"/>
-          <w:numId w:val="1046"/>
+          <w:numId w:val="1052"/>
         </w:numPr>
       </w:pPr>
       <w:r>
@@ -4838,7 +5465,7 @@
         <w:pStyle w:val="Compact"/>
         <w:numPr>
           <w:ilvl w:val="1"/>
-          <w:numId w:val="1046"/>
+          <w:numId w:val="1052"/>
         </w:numPr>
       </w:pPr>
       <w:r>
@@ -4850,7 +5477,7 @@
         <w:pStyle w:val="Compact"/>
         <w:numPr>
           <w:ilvl w:val="1"/>
-          <w:numId w:val="1046"/>
+          <w:numId w:val="1052"/>
         </w:numPr>
       </w:pPr>
       <w:r>
@@ -4896,7 +5523,7 @@
         <w:pStyle w:val="Compact"/>
         <w:numPr>
           <w:ilvl w:val="0"/>
-          <w:numId w:val="1047"/>
+          <w:numId w:val="1053"/>
         </w:numPr>
       </w:pPr>
       <w:r>
@@ -4908,7 +5535,7 @@
         <w:pStyle w:val="Compact"/>
         <w:numPr>
           <w:ilvl w:val="0"/>
-          <w:numId w:val="1047"/>
+          <w:numId w:val="1053"/>
         </w:numPr>
       </w:pPr>
       <w:r>
@@ -4920,7 +5547,7 @@
         <w:pStyle w:val="Compact"/>
         <w:numPr>
           <w:ilvl w:val="0"/>
-          <w:numId w:val="1047"/>
+          <w:numId w:val="1053"/>
         </w:numPr>
       </w:pPr>
       <w:r>
@@ -4932,7 +5559,7 @@
         <w:pStyle w:val="Compact"/>
         <w:numPr>
           <w:ilvl w:val="0"/>
-          <w:numId w:val="1047"/>
+          <w:numId w:val="1053"/>
         </w:numPr>
       </w:pPr>
       <w:r>
@@ -5568,6 +6195,24 @@
     <w:abstractNumId w:val="991"/>
   </w:num>
   <w:num w:numId="1026">
+    <w:abstractNumId w:val="991"/>
+  </w:num>
+  <w:num w:numId="1027">
+    <w:abstractNumId w:val="991"/>
+  </w:num>
+  <w:num w:numId="1028">
+    <w:abstractNumId w:val="991"/>
+  </w:num>
+  <w:num w:numId="1029">
+    <w:abstractNumId w:val="991"/>
+  </w:num>
+  <w:num w:numId="1030">
+    <w:abstractNumId w:val="991"/>
+  </w:num>
+  <w:num w:numId="1031">
+    <w:abstractNumId w:val="991"/>
+  </w:num>
+  <w:num w:numId="1032">
     <w:abstractNumId w:val="99411"/>
     <w:lvlOverride w:ilvl="0">
       <w:startOverride w:val="1"/>
@@ -5596,24 +6241,6 @@
     <w:lvlOverride w:ilvl="8">
       <w:startOverride w:val="1"/>
     </w:lvlOverride>
-  </w:num>
-  <w:num w:numId="1027">
-    <w:abstractNumId w:val="991"/>
-  </w:num>
-  <w:num w:numId="1028">
-    <w:abstractNumId w:val="991"/>
-  </w:num>
-  <w:num w:numId="1029">
-    <w:abstractNumId w:val="991"/>
-  </w:num>
-  <w:num w:numId="1030">
-    <w:abstractNumId w:val="991"/>
-  </w:num>
-  <w:num w:numId="1031">
-    <w:abstractNumId w:val="991"/>
-  </w:num>
-  <w:num w:numId="1032">
-    <w:abstractNumId w:val="991"/>
   </w:num>
   <w:num w:numId="1033">
     <w:abstractNumId w:val="991"/>
@@ -5649,6 +6276,24 @@
     <w:abstractNumId w:val="991"/>
   </w:num>
   <w:num w:numId="1044">
+    <w:abstractNumId w:val="991"/>
+  </w:num>
+  <w:num w:numId="1045">
+    <w:abstractNumId w:val="991"/>
+  </w:num>
+  <w:num w:numId="1046">
+    <w:abstractNumId w:val="991"/>
+  </w:num>
+  <w:num w:numId="1047">
+    <w:abstractNumId w:val="991"/>
+  </w:num>
+  <w:num w:numId="1048">
+    <w:abstractNumId w:val="991"/>
+  </w:num>
+  <w:num w:numId="1049">
+    <w:abstractNumId w:val="991"/>
+  </w:num>
+  <w:num w:numId="1050">
     <w:abstractNumId w:val="99411"/>
     <w:lvlOverride w:ilvl="0">
       <w:startOverride w:val="1"/>
@@ -5678,13 +6323,13 @@
       <w:startOverride w:val="1"/>
     </w:lvlOverride>
   </w:num>
-  <w:num w:numId="1045">
+  <w:num w:numId="1051">
     <w:abstractNumId w:val="991"/>
   </w:num>
-  <w:num w:numId="1046">
+  <w:num w:numId="1052">
     <w:abstractNumId w:val="991"/>
   </w:num>
-  <w:num w:numId="1047">
+  <w:num w:numId="1053">
     <w:abstractNumId w:val="991"/>
   </w:num>
 </w:numbering>

</xml_diff>